<commit_message>
Creating the "content" of the documentation
</commit_message>
<xml_diff>
--- a/Zapiska_Georgi_Chaparov.docx
+++ b/Zapiska_Georgi_Chaparov.docx
@@ -1563,6 +1563,63 @@
           <w:sz w:val="28"/>
           <w:lang w:val="bg-BG" w:eastAsia="en-US" w:bidi="ar-SA"/>
         </w:rPr>
+      </w:r>
+    </w:p>
+    <w:p>
+      <w:pPr>
+        <w:pStyle w:val="Normal"/>
+        <w:numPr>
+          <w:ilvl w:val="0"/>
+          <w:numId w:val="9"/>
+        </w:numPr>
+        <w:spacing w:before="0" w:after="0"/>
+        <w:jc w:val="both"/>
+        <w:rPr>
+          <w:lang w:val="bg-BG" w:eastAsia="en-US" w:bidi="ar-SA"/>
+        </w:rPr>
+      </w:pPr>
+      <w:r>
+        <w:rPr>
+          <w:sz w:val="28"/>
+          <w:lang w:val="bg-BG" w:eastAsia="en-US" w:bidi="ar-SA"/>
+        </w:rPr>
+        <w:t>Тема:</w:t>
+      </w:r>
+      <w:r>
+        <w:rPr>
+          <w:lang w:val="bg-BG" w:eastAsia="en-US" w:bidi="ar-SA"/>
+        </w:rPr>
+        <w:t xml:space="preserve"> </w:t>
+      </w:r>
+    </w:p>
+    <w:p>
+      <w:pPr>
+        <w:pStyle w:val="ListParagraph"/>
+        <w:ind w:hanging="0" w:left="283"/>
+        <w:jc w:val="both"/>
+        <w:rPr>
+          <w:lang w:val="bg-BG" w:eastAsia="en-US" w:bidi="ar-SA"/>
+        </w:rPr>
+      </w:pPr>
+      <w:r>
+        <w:rPr>
+          <w:szCs w:val="24"/>
+          <w:lang w:val="bg-BG" w:eastAsia="en-US" w:bidi="ar-SA"/>
+        </w:rPr>
+        <w:t>„</w:t>
+      </w:r>
+      <w:r>
+        <w:rPr>
+          <w:lang w:val="bg-BG" w:eastAsia="en-US" w:bidi="ar-SA"/>
+        </w:rPr>
+        <w:t>Класификация на фазите на ръчен монтаж чрез мултимодални сигнали от проследяване на движенията на очите и главата</w:t>
+      </w:r>
+      <w:r>
+        <w:rPr>
+          <w:szCs w:val="24"/>
+          <w:lang w:val="bg-BG" w:eastAsia="en-US" w:bidi="ar-SA"/>
+        </w:rPr>
+        <w:t>“</w:t>
       </w:r>
     </w:p>
     <w:p>
@@ -1575,27 +1632,23 @@
         <w:spacing w:before="0" w:after="0"/>
         <w:jc w:val="both"/>
         <w:rPr>
-          <w:lang w:val="bg-BG" w:eastAsia="en-US" w:bidi="ar-SA"/>
-        </w:rPr>
-      </w:pPr>
-      <w:r>
-        <w:rPr>
-          <w:sz w:val="28"/>
-          <w:lang w:val="bg-BG" w:eastAsia="en-US" w:bidi="ar-SA"/>
-        </w:rPr>
-        <w:t>Тема:</w:t>
-      </w:r>
-      <w:r>
-        <w:rPr>
-          <w:lang w:val="bg-BG" w:eastAsia="en-US" w:bidi="ar-SA"/>
-        </w:rPr>
-        <w:t xml:space="preserve"> </w:t>
-      </w:r>
-    </w:p>
-    <w:p>
-      <w:pPr>
-        <w:pStyle w:val="ListParagraph"/>
-        <w:ind w:hanging="0" w:left="283"/>
+          <w:sz w:val="28"/>
+          <w:lang w:val="bg-BG" w:eastAsia="en-US" w:bidi="ar-SA"/>
+        </w:rPr>
+      </w:pPr>
+      <w:r>
+        <w:rPr>
+          <w:sz w:val="28"/>
+          <w:lang w:val="bg-BG" w:eastAsia="en-US" w:bidi="ar-SA"/>
+        </w:rPr>
+        <w:t>Изходни данни:</w:t>
+      </w:r>
+    </w:p>
+    <w:p>
+      <w:pPr>
+        <w:pStyle w:val="Normal"/>
+        <w:spacing w:before="0" w:after="0"/>
+        <w:ind w:hanging="0"/>
         <w:jc w:val="both"/>
         <w:rPr>
           <w:lang w:val="bg-BG" w:eastAsia="en-US" w:bidi="ar-SA"/>
@@ -1603,23 +1656,9 @@
       </w:pPr>
       <w:r>
         <w:rPr>
-          <w:szCs w:val="24"/>
-          <w:lang w:val="bg-BG" w:eastAsia="en-US" w:bidi="ar-SA"/>
-        </w:rPr>
-        <w:t>„</w:t>
-      </w:r>
-      <w:r>
-        <w:rPr>
-          <w:lang w:val="bg-BG" w:eastAsia="en-US" w:bidi="ar-SA"/>
-        </w:rPr>
-        <w:t>Класификация на фазите на ръчен монтаж чрез мултимодални сигнали от проследяване на движенията на очите и главата</w:t>
-      </w:r>
-      <w:r>
-        <w:rPr>
-          <w:szCs w:val="24"/>
-          <w:lang w:val="bg-BG" w:eastAsia="en-US" w:bidi="ar-SA"/>
-        </w:rPr>
-        <w:t>“</w:t>
+          <w:lang w:val="bg-BG" w:eastAsia="en-US" w:bidi="ar-SA"/>
+        </w:rPr>
+        <w:t>Приложение, поддържащо Windows и Debian Linux, език за програмиране - Python</w:t>
       </w:r>
     </w:p>
     <w:p>
@@ -1641,45 +1680,6 @@
           <w:sz w:val="28"/>
           <w:lang w:val="bg-BG" w:eastAsia="en-US" w:bidi="ar-SA"/>
         </w:rPr>
-        <w:t>Изходни данни:</w:t>
-      </w:r>
-    </w:p>
-    <w:p>
-      <w:pPr>
-        <w:pStyle w:val="Normal"/>
-        <w:spacing w:before="0" w:after="0"/>
-        <w:ind w:hanging="0"/>
-        <w:jc w:val="both"/>
-        <w:rPr>
-          <w:lang w:val="bg-BG" w:eastAsia="en-US" w:bidi="ar-SA"/>
-        </w:rPr>
-      </w:pPr>
-      <w:r>
-        <w:rPr>
-          <w:lang w:val="bg-BG" w:eastAsia="en-US" w:bidi="ar-SA"/>
-        </w:rPr>
-        <w:t>Приложение, поддържащо Windows и Debian Linux, език за програмиране - Python</w:t>
-      </w:r>
-    </w:p>
-    <w:p>
-      <w:pPr>
-        <w:pStyle w:val="Normal"/>
-        <w:numPr>
-          <w:ilvl w:val="0"/>
-          <w:numId w:val="12"/>
-        </w:numPr>
-        <w:spacing w:before="0" w:after="0"/>
-        <w:jc w:val="both"/>
-        <w:rPr>
-          <w:sz w:val="28"/>
-          <w:lang w:val="bg-BG" w:eastAsia="en-US" w:bidi="ar-SA"/>
-        </w:rPr>
-      </w:pPr>
-      <w:r>
-        <w:rPr>
-          <w:sz w:val="28"/>
-          <w:lang w:val="bg-BG" w:eastAsia="en-US" w:bidi="ar-SA"/>
-        </w:rPr>
         <w:t>Съдържание на обяснителната записка:</w:t>
       </w:r>
     </w:p>
@@ -1868,7 +1868,7 @@
         <w:pStyle w:val="Normal"/>
         <w:numPr>
           <w:ilvl w:val="0"/>
-          <w:numId w:val="9"/>
+          <w:numId w:val="8"/>
         </w:numPr>
         <w:spacing w:before="0" w:after="0"/>
         <w:jc w:val="both"/>
@@ -2098,50 +2098,511 @@
         <w:t xml:space="preserve">         /                       /                </w:t>
       </w:r>
     </w:p>
-    <w:p>
-      <w:pPr>
-        <w:pStyle w:val="Normal"/>
-        <w:rPr>
-          <w:lang w:val="bg-BG" w:eastAsia="en-US" w:bidi="ar-SA"/>
-        </w:rPr>
-      </w:pPr>
-      <w:r>
-        <w:rPr>
-          <w:lang w:val="bg-BG" w:eastAsia="en-US" w:bidi="ar-SA"/>
-        </w:rPr>
-        <w:t>Съдържание</w:t>
-      </w:r>
-    </w:p>
-    <w:p>
-      <w:pPr>
-        <w:pStyle w:val="Normal"/>
-        <w:rPr>
-          <w:lang w:val="bg-BG" w:eastAsia="en-US" w:bidi="ar-SA"/>
-        </w:rPr>
-      </w:pPr>
-      <w:r>
-        <w:rPr>
-          <w:lang w:val="bg-BG" w:eastAsia="en-US" w:bidi="ar-SA"/>
-        </w:rPr>
-      </w:r>
-    </w:p>
-    <w:p>
-      <w:pPr>
-        <w:pStyle w:val="Normal"/>
-        <w:rPr>
-          <w:lang w:val="bg-BG" w:eastAsia="en-US" w:bidi="ar-SA"/>
-        </w:rPr>
-      </w:pPr>
-      <w:r>
-        <w:rPr>
-          <w:lang w:val="bg-BG" w:eastAsia="en-US" w:bidi="ar-SA"/>
-        </w:rPr>
-      </w:r>
-    </w:p>
-    <w:p>
-      <w:pPr>
-        <w:pStyle w:val="Normal"/>
-        <w:overflowPunct w:val="true"/>
+    <w:sdt>
+      <w:sdtPr>
+        <w:docPartObj>
+          <w:docPartGallery w:val="Table of Contents"/>
+          <w:docPartUnique w:val="true"/>
+        </w:docPartObj>
+      </w:sdtPr>
+      <w:sdtContent>
+        <w:p>
+          <w:pPr>
+            <w:pStyle w:val="TOCHeading"/>
+            <w:rPr/>
+          </w:pPr>
+          <w:r>
+            <w:rPr/>
+            <w:t>Съдържание</w:t>
+          </w:r>
+        </w:p>
+        <w:p>
+          <w:pPr>
+            <w:pStyle w:val="TOC1"/>
+            <w:tabs>
+              <w:tab w:val="clear" w:pos="9354"/>
+              <w:tab w:val="right" w:pos="9353" w:leader="dot"/>
+            </w:tabs>
+            <w:rPr/>
+          </w:pPr>
+          <w:r>
+            <w:fldChar w:fldCharType="begin"/>
+          </w:r>
+          <w:r>
+            <w:rPr>
+              <w:rStyle w:val="IndexLink"/>
+            </w:rPr>
+            <w:instrText xml:space="preserve"> TOC \f \o "1-9" \h</w:instrText>
+          </w:r>
+          <w:r>
+            <w:rPr>
+              <w:rStyle w:val="IndexLink"/>
+            </w:rPr>
+            <w:fldChar w:fldCharType="separate"/>
+          </w:r>
+          <w:hyperlink w:anchor="__RefHeading___Toc279_4158184810" w:tooltip="Анoтaция">
+            <w:r>
+              <w:rPr>
+                <w:rStyle w:val="IndexLink"/>
+              </w:rPr>
+              <w:t>1. Анoтaция</w:t>
+              <w:tab/>
+              <w:t>8</w:t>
+            </w:r>
+          </w:hyperlink>
+        </w:p>
+        <w:p>
+          <w:pPr>
+            <w:pStyle w:val="TOC1"/>
+            <w:tabs>
+              <w:tab w:val="clear" w:pos="9354"/>
+              <w:tab w:val="right" w:pos="9353" w:leader="dot"/>
+            </w:tabs>
+            <w:rPr/>
+          </w:pPr>
+          <w:hyperlink w:anchor="__RefHeading___Toc957_4158184810" w:tooltip="Увод">
+            <w:r>
+              <w:rPr>
+                <w:rStyle w:val="IndexLink"/>
+              </w:rPr>
+              <w:t>2. Увод</w:t>
+              <w:tab/>
+              <w:t>9</w:t>
+            </w:r>
+          </w:hyperlink>
+        </w:p>
+        <w:p>
+          <w:pPr>
+            <w:pStyle w:val="TOC1"/>
+            <w:tabs>
+              <w:tab w:val="clear" w:pos="9354"/>
+              <w:tab w:val="right" w:pos="9353" w:leader="dot"/>
+            </w:tabs>
+            <w:rPr/>
+          </w:pPr>
+          <w:hyperlink w:anchor="__RefHeading___Toc959_4158184810" w:tooltip="Обзор на съществуващи решения">
+            <w:r>
+              <w:rPr>
+                <w:rStyle w:val="IndexLink"/>
+              </w:rPr>
+              <w:t>3. Обзор на съществуващи решения</w:t>
+              <w:tab/>
+              <w:t>10</w:t>
+            </w:r>
+          </w:hyperlink>
+        </w:p>
+        <w:p>
+          <w:pPr>
+            <w:pStyle w:val="TOC1"/>
+            <w:tabs>
+              <w:tab w:val="clear" w:pos="9354"/>
+              <w:tab w:val="right" w:pos="9353" w:leader="dot"/>
+            </w:tabs>
+            <w:rPr/>
+          </w:pPr>
+          <w:hyperlink w:anchor="__RefHeading___Toc961_4158184810" w:tooltip="Поставени цели и задачи">
+            <w:r>
+              <w:rPr>
+                <w:rStyle w:val="IndexLink"/>
+              </w:rPr>
+              <w:t>4. Поставени цели и задачи</w:t>
+              <w:tab/>
+              <w:t>11</w:t>
+            </w:r>
+          </w:hyperlink>
+        </w:p>
+        <w:p>
+          <w:pPr>
+            <w:pStyle w:val="TOC1"/>
+            <w:tabs>
+              <w:tab w:val="clear" w:pos="9354"/>
+              <w:tab w:val="right" w:pos="9353" w:leader="dot"/>
+            </w:tabs>
+            <w:rPr/>
+          </w:pPr>
+          <w:hyperlink w:anchor="__RefHeading___Toc965_4158184810" w:tooltip="Описание на експеримент за събиране на данните">
+            <w:r>
+              <w:rPr>
+                <w:rStyle w:val="IndexLink"/>
+              </w:rPr>
+              <w:t>5. Описание на експеримент за събиране на данните</w:t>
+              <w:tab/>
+              <w:t>12</w:t>
+            </w:r>
+          </w:hyperlink>
+        </w:p>
+        <w:p>
+          <w:pPr>
+            <w:pStyle w:val="TOC1"/>
+            <w:tabs>
+              <w:tab w:val="clear" w:pos="9354"/>
+              <w:tab w:val="right" w:pos="9353" w:leader="dot"/>
+            </w:tabs>
+            <w:rPr/>
+          </w:pPr>
+          <w:hyperlink w:anchor="__RefHeading___Toc969_4158184810" w:tooltip="Софтуер за класифициране на данните">
+            <w:r>
+              <w:rPr>
+                <w:rStyle w:val="IndexLink"/>
+              </w:rPr>
+              <w:t>6. Софтуер за класифициране на данните</w:t>
+              <w:tab/>
+              <w:t>13</w:t>
+            </w:r>
+          </w:hyperlink>
+        </w:p>
+        <w:p>
+          <w:pPr>
+            <w:pStyle w:val="TOC1"/>
+            <w:tabs>
+              <w:tab w:val="clear" w:pos="9354"/>
+              <w:tab w:val="right" w:pos="9353" w:leader="dot"/>
+            </w:tabs>
+            <w:rPr/>
+          </w:pPr>
+          <w:hyperlink w:anchor="__RefHeading___Toc2735_4158184810" w:tooltip="Изисквания, архитектура и организация на данните">
+            <w:r>
+              <w:rPr>
+                <w:rStyle w:val="IndexLink"/>
+              </w:rPr>
+              <w:t>6.1. Изисквания, архитектура и организация на данните</w:t>
+              <w:tab/>
+              <w:t>13</w:t>
+            </w:r>
+          </w:hyperlink>
+        </w:p>
+        <w:p>
+          <w:pPr>
+            <w:pStyle w:val="TOC1"/>
+            <w:tabs>
+              <w:tab w:val="clear" w:pos="9354"/>
+              <w:tab w:val="right" w:pos="9353" w:leader="dot"/>
+            </w:tabs>
+            <w:rPr/>
+          </w:pPr>
+          <w:hyperlink w:anchor="__RefHeading___Toc2737_4158184810" w:tooltip="Избор на език и среда за програмиране">
+            <w:r>
+              <w:rPr>
+                <w:rStyle w:val="IndexLink"/>
+              </w:rPr>
+              <w:t>6.2. Избор на език и среда за програмиране</w:t>
+              <w:tab/>
+              <w:t>13</w:t>
+            </w:r>
+          </w:hyperlink>
+        </w:p>
+        <w:p>
+          <w:pPr>
+            <w:pStyle w:val="TOC1"/>
+            <w:tabs>
+              <w:tab w:val="clear" w:pos="9354"/>
+              <w:tab w:val="right" w:pos="9353" w:leader="dot"/>
+            </w:tabs>
+            <w:rPr/>
+          </w:pPr>
+          <w:hyperlink w:anchor="__RefHeading___Toc2739_4158184810" w:tooltip="Реализация на програмната система">
+            <w:r>
+              <w:rPr>
+                <w:rStyle w:val="IndexLink"/>
+              </w:rPr>
+              <w:t>6.3. Реализация на програмната система</w:t>
+              <w:tab/>
+              <w:t>13</w:t>
+            </w:r>
+          </w:hyperlink>
+        </w:p>
+        <w:p>
+          <w:pPr>
+            <w:pStyle w:val="TOC1"/>
+            <w:tabs>
+              <w:tab w:val="clear" w:pos="9354"/>
+              <w:tab w:val="right" w:pos="9353" w:leader="dot"/>
+            </w:tabs>
+            <w:rPr/>
+          </w:pPr>
+          <w:hyperlink w:anchor="__RefHeading___Toc2741_4158184810" w:tooltip="Описание на програмните модули">
+            <w:r>
+              <w:rPr>
+                <w:rStyle w:val="IndexLink"/>
+              </w:rPr>
+              <w:t>6.3.1. Описание на програмните модули</w:t>
+              <w:tab/>
+              <w:t>13</w:t>
+            </w:r>
+          </w:hyperlink>
+        </w:p>
+        <w:p>
+          <w:pPr>
+            <w:pStyle w:val="TOC1"/>
+            <w:tabs>
+              <w:tab w:val="clear" w:pos="9354"/>
+              <w:tab w:val="right" w:pos="9353" w:leader="dot"/>
+            </w:tabs>
+            <w:rPr/>
+          </w:pPr>
+          <w:hyperlink w:anchor="__RefHeading___Toc2743_4158184810" w:tooltip="Структура и организация на програмния интерфейс">
+            <w:r>
+              <w:rPr>
+                <w:rStyle w:val="IndexLink"/>
+              </w:rPr>
+              <w:t>6.3.2. Структура и организация на програмния интерфейс</w:t>
+              <w:tab/>
+              <w:t>13</w:t>
+            </w:r>
+          </w:hyperlink>
+        </w:p>
+        <w:p>
+          <w:pPr>
+            <w:pStyle w:val="TOC1"/>
+            <w:tabs>
+              <w:tab w:val="clear" w:pos="9354"/>
+              <w:tab w:val="right" w:pos="9353" w:leader="dot"/>
+            </w:tabs>
+            <w:rPr/>
+          </w:pPr>
+          <w:hyperlink w:anchor="__RefHeading___Toc2745_4158184810" w:tooltip="Формат на входните и изходните данни">
+            <w:r>
+              <w:rPr>
+                <w:rStyle w:val="IndexLink"/>
+              </w:rPr>
+              <w:t>6.4. Формат на входните и изходните данни</w:t>
+              <w:tab/>
+              <w:t>13</w:t>
+            </w:r>
+          </w:hyperlink>
+        </w:p>
+        <w:p>
+          <w:pPr>
+            <w:pStyle w:val="TOC1"/>
+            <w:tabs>
+              <w:tab w:val="clear" w:pos="9354"/>
+              <w:tab w:val="right" w:pos="9353" w:leader="dot"/>
+            </w:tabs>
+            <w:rPr/>
+          </w:pPr>
+          <w:hyperlink w:anchor="__RefHeading___Toc10516_4158184810" w:tooltip="Архитектура на системата и отдалечен достъп">
+            <w:r>
+              <w:rPr>
+                <w:rStyle w:val="IndexLink"/>
+              </w:rPr>
+              <w:t>7. Архитектура на системата и отдалечен достъп</w:t>
+              <w:tab/>
+              <w:t>14</w:t>
+            </w:r>
+          </w:hyperlink>
+        </w:p>
+        <w:p>
+          <w:pPr>
+            <w:pStyle w:val="TOC1"/>
+            <w:tabs>
+              <w:tab w:val="clear" w:pos="9354"/>
+              <w:tab w:val="right" w:pos="9353" w:leader="dot"/>
+            </w:tabs>
+            <w:rPr/>
+          </w:pPr>
+          <w:hyperlink w:anchor="__RefHeading___Toc5688_4158184810" w:tooltip="Създаване и обучение на модела">
+            <w:r>
+              <w:rPr>
+                <w:rStyle w:val="IndexLink"/>
+              </w:rPr>
+              <w:t>8. Създаване и обучение на модела</w:t>
+              <w:tab/>
+              <w:t>15</w:t>
+            </w:r>
+          </w:hyperlink>
+        </w:p>
+        <w:p>
+          <w:pPr>
+            <w:pStyle w:val="TOC1"/>
+            <w:tabs>
+              <w:tab w:val="clear" w:pos="9354"/>
+              <w:tab w:val="right" w:pos="9353" w:leader="dot"/>
+            </w:tabs>
+            <w:rPr/>
+          </w:pPr>
+          <w:hyperlink w:anchor="__RefHeading___Toc967_4158184810" w:tooltip="Предварителна обработка на данните">
+            <w:r>
+              <w:rPr>
+                <w:rStyle w:val="IndexLink"/>
+              </w:rPr>
+              <w:t>8.1. Предварителна обработка на данните</w:t>
+              <w:tab/>
+              <w:t>15</w:t>
+            </w:r>
+          </w:hyperlink>
+        </w:p>
+        <w:p>
+          <w:pPr>
+            <w:pStyle w:val="TOC1"/>
+            <w:tabs>
+              <w:tab w:val="clear" w:pos="9354"/>
+              <w:tab w:val="right" w:pos="9353" w:leader="dot"/>
+            </w:tabs>
+            <w:rPr/>
+          </w:pPr>
+          <w:hyperlink w:anchor="__RefHeading___Toc5690_4158184810" w:tooltip="Избор на модел за машинно обучение">
+            <w:r>
+              <w:rPr>
+                <w:rStyle w:val="IndexLink"/>
+              </w:rPr>
+              <w:t>8.2. Избор на модел за машинно обучение</w:t>
+              <w:tab/>
+              <w:t>15</w:t>
+            </w:r>
+          </w:hyperlink>
+        </w:p>
+        <w:p>
+          <w:pPr>
+            <w:pStyle w:val="TOC1"/>
+            <w:tabs>
+              <w:tab w:val="clear" w:pos="9354"/>
+              <w:tab w:val="right" w:pos="9353" w:leader="dot"/>
+            </w:tabs>
+            <w:rPr/>
+          </w:pPr>
+          <w:hyperlink w:anchor="__RefHeading___Toc5692_4158184810" w:tooltip="Методология на обучението">
+            <w:r>
+              <w:rPr>
+                <w:rStyle w:val="IndexLink"/>
+              </w:rPr>
+              <w:t>8.3. Методология на обучението</w:t>
+              <w:tab/>
+              <w:t>15</w:t>
+            </w:r>
+          </w:hyperlink>
+        </w:p>
+        <w:p>
+          <w:pPr>
+            <w:pStyle w:val="TOC1"/>
+            <w:tabs>
+              <w:tab w:val="clear" w:pos="9354"/>
+              <w:tab w:val="right" w:pos="9353" w:leader="dot"/>
+            </w:tabs>
+            <w:rPr/>
+          </w:pPr>
+          <w:hyperlink w:anchor="__RefHeading___Toc10518_4158184810" w:tooltip="Сравнение между CNN и Transformer модел">
+            <w:r>
+              <w:rPr>
+                <w:rStyle w:val="IndexLink"/>
+              </w:rPr>
+              <w:t>9. Сравнение между CNN и Transformer модел</w:t>
+              <w:tab/>
+              <w:t>16</w:t>
+            </w:r>
+          </w:hyperlink>
+        </w:p>
+        <w:p>
+          <w:pPr>
+            <w:pStyle w:val="TOC1"/>
+            <w:tabs>
+              <w:tab w:val="clear" w:pos="9354"/>
+              <w:tab w:val="right" w:pos="9353" w:leader="dot"/>
+            </w:tabs>
+            <w:rPr/>
+          </w:pPr>
+          <w:hyperlink w:anchor="__RefHeading___Toc10520_4158184810" w:tooltip="Резултати при различна продължителност на записите">
+            <w:r>
+              <w:rPr>
+                <w:rStyle w:val="IndexLink"/>
+              </w:rPr>
+              <w:t>10. Резултати при различна продължителност на записите</w:t>
+              <w:tab/>
+              <w:t>17</w:t>
+            </w:r>
+          </w:hyperlink>
+        </w:p>
+        <w:p>
+          <w:pPr>
+            <w:pStyle w:val="TOC1"/>
+            <w:tabs>
+              <w:tab w:val="clear" w:pos="9354"/>
+              <w:tab w:val="right" w:pos="9353" w:leader="dot"/>
+            </w:tabs>
+            <w:rPr/>
+          </w:pPr>
+          <w:hyperlink w:anchor="__RefHeading___Toc5694_4158184810" w:tooltip="Основни резултати">
+            <w:r>
+              <w:rPr>
+                <w:rStyle w:val="IndexLink"/>
+              </w:rPr>
+              <w:t>11. Основни резултати</w:t>
+              <w:tab/>
+              <w:t>18</w:t>
+            </w:r>
+          </w:hyperlink>
+        </w:p>
+        <w:p>
+          <w:pPr>
+            <w:pStyle w:val="TOC1"/>
+            <w:tabs>
+              <w:tab w:val="clear" w:pos="9354"/>
+              <w:tab w:val="right" w:pos="9353" w:leader="dot"/>
+            </w:tabs>
+            <w:rPr/>
+          </w:pPr>
+          <w:hyperlink w:anchor="__RefHeading___Toc5696_4158184810" w:tooltip="Изводи и препоръки">
+            <w:r>
+              <w:rPr>
+                <w:rStyle w:val="IndexLink"/>
+              </w:rPr>
+              <w:t>12. Изводи и препоръки</w:t>
+              <w:tab/>
+              <w:t>19</w:t>
+            </w:r>
+          </w:hyperlink>
+        </w:p>
+        <w:p>
+          <w:pPr>
+            <w:pStyle w:val="TOC1"/>
+            <w:tabs>
+              <w:tab w:val="clear" w:pos="9354"/>
+              <w:tab w:val="right" w:pos="9353" w:leader="dot"/>
+            </w:tabs>
+            <w:rPr/>
+          </w:pPr>
+          <w:hyperlink w:anchor="__RefHeading___Toc2749_4158184810" w:tooltip="Използвана литература">
+            <w:r>
+              <w:rPr>
+                <w:rStyle w:val="IndexLink"/>
+              </w:rPr>
+              <w:t>13. Използвана литература</w:t>
+              <w:tab/>
+              <w:t>20</w:t>
+            </w:r>
+          </w:hyperlink>
+        </w:p>
+        <w:p>
+          <w:pPr>
+            <w:pStyle w:val="TOC1"/>
+            <w:tabs>
+              <w:tab w:val="clear" w:pos="9354"/>
+              <w:tab w:val="right" w:pos="9353" w:leader="dot"/>
+            </w:tabs>
+            <w:rPr/>
+          </w:pPr>
+          <w:hyperlink w:anchor="__RefHeading___Toc971_4158184810" w:tooltip="Приложения">
+            <w:r>
+              <w:rPr>
+                <w:rStyle w:val="IndexLink"/>
+              </w:rPr>
+              <w:t>14. Приложения</w:t>
+              <w:tab/>
+              <w:t>21</w:t>
+            </w:r>
+          </w:hyperlink>
+          <w:r>
+            <w:rPr>
+              <w:rStyle w:val="IndexLink"/>
+            </w:rPr>
+            <w:fldChar w:fldCharType="end"/>
+          </w:r>
+        </w:p>
+      </w:sdtContent>
+    </w:sdt>
+    <w:p>
+      <w:pPr>
+        <w:pStyle w:val="Normal"/>
+        <w:overflowPunct w:val="false"/>
         <w:spacing w:lineRule="auto" w:line="278" w:before="0" w:after="160"/>
         <w:ind w:hanging="0"/>
         <w:rPr>
@@ -2175,7 +2636,7 @@
     <w:p>
       <w:pPr>
         <w:pStyle w:val="Normal"/>
-        <w:overflowPunct w:val="true"/>
+        <w:overflowPunct w:val="false"/>
         <w:spacing w:lineRule="auto" w:line="278" w:before="0" w:after="160"/>
         <w:ind w:hanging="0"/>
         <w:rPr>
@@ -2209,7 +2670,7 @@
     <w:p>
       <w:pPr>
         <w:pStyle w:val="Normal"/>
-        <w:overflowPunct w:val="true"/>
+        <w:overflowPunct w:val="false"/>
         <w:spacing w:lineRule="auto" w:line="278" w:before="0" w:after="160"/>
         <w:ind w:hanging="0"/>
         <w:rPr>
@@ -2243,7 +2704,7 @@
     <w:p>
       <w:pPr>
         <w:pStyle w:val="Normal"/>
-        <w:overflowPunct w:val="true"/>
+        <w:overflowPunct w:val="false"/>
         <w:spacing w:lineRule="auto" w:line="278" w:before="0" w:after="160"/>
         <w:ind w:hanging="0"/>
         <w:rPr>
@@ -2268,7 +2729,7 @@
           <w:ilvl w:val="0"/>
           <w:numId w:val="4"/>
         </w:numPr>
-        <w:overflowPunct w:val="true"/>
+        <w:overflowPunct w:val="false"/>
         <w:spacing w:lineRule="auto" w:line="276" w:before="0" w:after="0"/>
         <w:ind w:hanging="357" w:left="357"/>
         <w:contextualSpacing/>
@@ -2277,7 +2738,9 @@
           <w:lang w:val="bg-BG" w:eastAsia="en-US" w:bidi="ar-SA"/>
         </w:rPr>
       </w:pPr>
-      <w:bookmarkStart w:id="0" w:name="_Toc169282651"/>
+      <w:bookmarkStart w:id="0" w:name="__RefHeading___Toc279_4158184810"/>
+      <w:bookmarkStart w:id="1" w:name="_Toc169282651"/>
+      <w:bookmarkEnd w:id="0"/>
       <w:r>
         <w:rPr>
           <w:b/>
@@ -2288,76 +2751,26 @@
         </w:rPr>
         <w:t>Анoтaция</w:t>
       </w:r>
-      <w:bookmarkEnd w:id="0"/>
-    </w:p>
-    <w:p>
-      <w:pPr>
-        <w:pStyle w:val="Normal"/>
-        <w:rPr>
-          <w:lang w:val="bg-BG" w:eastAsia="en-US" w:bidi="ar-SA"/>
-        </w:rPr>
-      </w:pPr>
-      <w:r>
-        <w:rPr>
-          <w:lang w:val="bg-BG" w:eastAsia="en-US" w:bidi="ar-SA"/>
-        </w:rPr>
-        <w:t xml:space="preserve">Обект на дипломната работа </w:t>
-      </w:r>
-      <w:r>
-        <w:rPr>
-          <w:lang w:val="bg-BG" w:eastAsia="en-US" w:bidi="ar-SA"/>
-        </w:rPr>
-        <w:t>е</w:t>
-      </w:r>
-      <w:r>
-        <w:rPr>
-          <w:lang w:val="bg-BG" w:eastAsia="en-US" w:bidi="ar-SA"/>
-        </w:rPr>
-        <w:t xml:space="preserve"> </w:t>
-      </w:r>
-      <w:r>
-        <w:rPr>
-          <w:lang w:val="bg-BG" w:eastAsia="en-US" w:bidi="ar-SA"/>
-        </w:rPr>
-        <w:t>моделирането и</w:t>
-      </w:r>
-      <w:r>
-        <w:rPr>
-          <w:lang w:val="bg-BG" w:eastAsia="en-US" w:bidi="ar-SA"/>
-        </w:rPr>
-        <w:t xml:space="preserve"> обуч</w:t>
-      </w:r>
-      <w:r>
-        <w:rPr>
-          <w:lang w:val="bg-BG" w:eastAsia="en-US" w:bidi="ar-SA"/>
-        </w:rPr>
-        <w:t>е</w:t>
-      </w:r>
-      <w:r>
-        <w:rPr>
-          <w:lang w:val="bg-BG" w:eastAsia="en-US" w:bidi="ar-SA"/>
-        </w:rPr>
-        <w:t xml:space="preserve">нието </w:t>
-      </w:r>
-      <w:r>
-        <w:rPr>
-          <w:lang w:val="bg-BG" w:eastAsia="en-US" w:bidi="ar-SA"/>
-        </w:rPr>
-        <w:t xml:space="preserve">на модел, който да класифицира отделните действия </w:t>
-      </w:r>
-      <w:r>
-        <w:rPr>
-          <w:lang w:val="bg-BG" w:eastAsia="en-US" w:bidi="ar-SA"/>
-        </w:rPr>
-        <w:t>на човек, работещ на поточна линия, използвайки данните от очила, които следят движението на очите и главата.</w:t>
-      </w:r>
-    </w:p>
-    <w:p>
-      <w:pPr>
-        <w:pStyle w:val="Normal"/>
-        <w:rPr>
-          <w:lang w:val="bg-BG" w:eastAsia="en-US" w:bidi="ar-SA"/>
-        </w:rPr>
+      <w:bookmarkEnd w:id="1"/>
+    </w:p>
+    <w:p>
+      <w:pPr>
+        <w:pStyle w:val="Normal"/>
+        <w:spacing w:lineRule="auto" w:line="240"/>
+        <w:rPr/>
+      </w:pPr>
+      <w:r>
+        <w:rPr>
+          <w:lang w:val="bg-BG" w:eastAsia="en-US" w:bidi="ar-SA"/>
+        </w:rPr>
+        <w:t>Обект на дипломната работа е моделирането и обучението на модел, който да класифицира отделните действия на човек, работещ на поточна линия, използвайки данните от очила, които следят движението на очите и главата.</w:t>
+      </w:r>
+    </w:p>
+    <w:p>
+      <w:pPr>
+        <w:pStyle w:val="Normal"/>
+        <w:spacing w:lineRule="auto" w:line="240"/>
+        <w:rPr/>
       </w:pPr>
       <w:r>
         <w:rPr>
@@ -2387,19 +2800,7 @@
         <w:rPr>
           <w:lang w:val="bg-BG" w:eastAsia="en-US" w:bidi="ar-SA"/>
         </w:rPr>
-        <w:t xml:space="preserve">комплекта, </w:t>
-      </w:r>
-      <w:r>
-        <w:rPr>
-          <w:lang w:val="bg-BG" w:eastAsia="en-US" w:bidi="ar-SA"/>
-        </w:rPr>
-        <w:t xml:space="preserve">а техните действия биват записани. </w:t>
-      </w:r>
-      <w:r>
-        <w:rPr>
-          <w:lang w:val="bg-BG" w:eastAsia="en-US" w:bidi="ar-SA"/>
-        </w:rPr>
-        <w:t xml:space="preserve">Освен различни видове движения, очилата записват работното поле, на което участника в експеримента сглобява </w:t>
+        <w:t xml:space="preserve">комплекта, а техните действия биват записани. Освен различни видове движения, очилата записват работното поле, на което участника сглобява </w:t>
       </w:r>
       <w:r>
         <w:rPr>
@@ -2411,119 +2812,39 @@
         <w:rPr>
           <w:lang w:val="bg-BG" w:eastAsia="en-US" w:bidi="ar-SA"/>
         </w:rPr>
-        <w:t>комплекта.</w:t>
-      </w:r>
-    </w:p>
-    <w:p>
-      <w:pPr>
-        <w:pStyle w:val="Normal"/>
-        <w:rPr>
-          <w:lang w:val="bg-BG" w:eastAsia="en-US" w:bidi="ar-SA"/>
-        </w:rPr>
-      </w:pPr>
-      <w:r>
-        <w:rPr>
-          <w:lang w:val="bg-BG" w:eastAsia="en-US" w:bidi="ar-SA"/>
-        </w:rPr>
-        <w:t xml:space="preserve">Разработен е софтуер за </w:t>
-      </w:r>
-      <w:r>
-        <w:rPr>
-          <w:lang w:val="bg-BG" w:eastAsia="en-US" w:bidi="ar-SA"/>
-        </w:rPr>
-        <w:t xml:space="preserve">класифициране на получените данни. При пускане на софтуера, потребителя може да избере папка с данните на даден участник в експеримента. Софтуера може да възпроизвежда записа на работното поле, </w:t>
-      </w:r>
-      <w:r>
-        <w:rPr>
-          <w:lang w:val="bg-BG" w:eastAsia="en-US" w:bidi="ar-SA"/>
-        </w:rPr>
-        <w:t>като наслага точката, в която участника е гледал в дадения момент, върху възпроизведения запис.</w:t>
-      </w:r>
-    </w:p>
-    <w:p>
-      <w:pPr>
-        <w:pStyle w:val="Normal"/>
-        <w:rPr>
-          <w:lang w:val="bg-BG" w:eastAsia="en-US" w:bidi="ar-SA"/>
-        </w:rPr>
-      </w:pPr>
-      <w:r>
-        <w:rPr>
-          <w:lang w:val="bg-BG" w:eastAsia="en-US" w:bidi="ar-SA"/>
-        </w:rPr>
-        <w:t xml:space="preserve">За разработката на софтуера </w:t>
-      </w:r>
-      <w:r>
-        <w:rPr>
-          <w:lang w:val="bg-BG" w:eastAsia="en-US" w:bidi="ar-SA"/>
-        </w:rPr>
-        <w:t xml:space="preserve">за </w:t>
-      </w:r>
-      <w:r>
-        <w:rPr>
-          <w:lang w:val="bg-BG" w:eastAsia="en-US" w:bidi="ar-SA"/>
-        </w:rPr>
-        <w:t>класифициране</w:t>
-      </w:r>
-      <w:r>
-        <w:rPr>
-          <w:lang w:val="bg-BG" w:eastAsia="en-US" w:bidi="ar-SA"/>
-        </w:rPr>
-        <w:t xml:space="preserve"> е използван текстовият редактор VS Code с множество модули и езикът за програмиране Python. </w:t>
-      </w:r>
-      <w:r>
-        <w:rPr>
-          <w:lang w:val="bg-BG" w:eastAsia="en-US" w:bidi="ar-SA"/>
-        </w:rPr>
-        <w:t>За р</w:t>
-      </w:r>
-      <w:r>
-        <w:rPr>
-          <w:lang w:val="bg-BG" w:eastAsia="en-US" w:bidi="ar-SA"/>
-        </w:rPr>
-        <w:t xml:space="preserve">азработката на графичния потребителски интерфейс е </w:t>
-      </w:r>
-      <w:r>
-        <w:rPr>
-          <w:lang w:val="bg-BG" w:eastAsia="en-US" w:bidi="ar-SA"/>
-        </w:rPr>
-        <w:t>използвана библиотеката PyQt6. Използван</w:t>
-      </w:r>
-      <w:r>
-        <w:rPr>
-          <w:lang w:val="bg-BG" w:eastAsia="en-US" w:bidi="ar-SA"/>
-        </w:rPr>
-        <w:t>а</w:t>
-      </w:r>
-      <w:r>
-        <w:rPr>
-          <w:lang w:val="bg-BG" w:eastAsia="en-US" w:bidi="ar-SA"/>
-        </w:rPr>
-        <w:t xml:space="preserve"> </w:t>
-      </w:r>
-      <w:r>
-        <w:rPr>
-          <w:lang w:val="bg-BG" w:eastAsia="en-US" w:bidi="ar-SA"/>
-        </w:rPr>
-        <w:t>е</w:t>
-      </w:r>
-      <w:r>
-        <w:rPr>
-          <w:lang w:val="bg-BG" w:eastAsia="en-US" w:bidi="ar-SA"/>
-        </w:rPr>
-        <w:t xml:space="preserve"> библиотек</w:t>
-      </w:r>
-      <w:r>
-        <w:rPr>
-          <w:lang w:val="bg-BG" w:eastAsia="en-US" w:bidi="ar-SA"/>
-        </w:rPr>
-        <w:t>ата</w:t>
-      </w:r>
-      <w:r>
-        <w:rPr>
-          <w:lang w:val="bg-BG" w:eastAsia="en-US" w:bidi="ar-SA"/>
-        </w:rPr>
-        <w:t xml:space="preserve"> </w:t>
+        <w:t xml:space="preserve">комплекта. </w:t>
+      </w:r>
+      <w:r>
+        <w:rPr>
+          <w:lang w:val="bg-BG" w:eastAsia="en-US" w:bidi="ar-SA"/>
+        </w:rPr>
+        <w:t>Общия брой на участниците е двадесет и осем, но поради технически проблеми два от записите са неизползваеми.</w:t>
+      </w:r>
+    </w:p>
+    <w:p>
+      <w:pPr>
+        <w:pStyle w:val="Normal"/>
+        <w:spacing w:lineRule="auto" w:line="240"/>
+        <w:rPr/>
+      </w:pPr>
+      <w:r>
+        <w:rPr>
+          <w:lang w:val="bg-BG" w:eastAsia="en-US" w:bidi="ar-SA"/>
+        </w:rPr>
+        <w:t>Разработен е софтуер за класифициране на получените данни. При пускане на софтуера, потребителя може да избере папка с данните на даден участник в експеримента. Софтуера може да възпроизвежда записа на работното поле, като наслага точката, в която участника е гледал в дадения момент, върху възпроизведения запис.</w:t>
+      </w:r>
+    </w:p>
+    <w:p>
+      <w:pPr>
+        <w:pStyle w:val="Normal"/>
+        <w:spacing w:lineRule="auto" w:line="240"/>
+        <w:rPr/>
+      </w:pPr>
+      <w:r>
+        <w:rPr>
+          <w:lang w:val="bg-BG" w:eastAsia="en-US" w:bidi="ar-SA"/>
+        </w:rPr>
+        <w:t xml:space="preserve">За разработката на софтуера за класифициране е използван текстовият редактор VS Code с множество модули и езикът за програмиране Python. За графичния потребителски интерфейс е използвана библиотеката PyQt6. Използвана е библиотеката </w:t>
       </w:r>
       <w:r>
         <w:rPr>
@@ -2547,55 +2868,50 @@
         <w:rPr>
           <w:lang w:val="bg-BG" w:eastAsia="en-US" w:bidi="ar-SA"/>
         </w:rPr>
-        <w:t xml:space="preserve">за зареждане и запазване на класифицираните данни във фаил с разширение </w:t>
+        <w:t xml:space="preserve">за зареждане и запазване на класифицираните данни във </w:t>
+      </w:r>
+      <w:r>
+        <w:rPr>
+          <w:lang w:val="bg-BG" w:eastAsia="en-US" w:bidi="ar-SA"/>
+        </w:rPr>
+        <w:t>фа</w:t>
+      </w:r>
+      <w:r>
+        <w:rPr>
+          <w:lang w:val="bg-BG" w:eastAsia="en-US" w:bidi="ar-SA"/>
+        </w:rPr>
+        <w:t>й</w:t>
       </w:r>
       <w:r>
         <w:rPr>
           <w:lang w:val="en-US" w:eastAsia="en-US" w:bidi="ar-SA"/>
         </w:rPr>
+        <w:t>л</w:t>
+      </w:r>
+      <w:r>
+        <w:rPr>
+          <w:lang w:val="bg-BG" w:eastAsia="en-US" w:bidi="ar-SA"/>
+        </w:rPr>
+        <w:t xml:space="preserve"> с разширение </w:t>
+      </w:r>
+      <w:r>
+        <w:rPr>
+          <w:lang w:val="en-US" w:eastAsia="en-US" w:bidi="ar-SA"/>
+        </w:rPr>
         <w:t>csv.</w:t>
       </w:r>
     </w:p>
     <w:p>
       <w:pPr>
         <w:pStyle w:val="Normal"/>
+        <w:spacing w:lineRule="auto" w:line="240"/>
         <w:rPr/>
       </w:pPr>
       <w:r>
         <w:rPr>
           <w:lang w:val="bg-BG" w:eastAsia="en-US" w:bidi="ar-SA"/>
         </w:rPr>
-        <w:t xml:space="preserve">За </w:t>
-      </w:r>
-      <w:r>
-        <w:rPr>
-          <w:lang w:val="bg-BG" w:eastAsia="en-US" w:bidi="ar-SA"/>
-        </w:rPr>
-        <w:t xml:space="preserve">обработката на данните, създаването и обучението на модела е </w:t>
-      </w:r>
-      <w:r>
-        <w:rPr>
-          <w:lang w:val="bg-BG" w:eastAsia="en-US" w:bidi="ar-SA"/>
-        </w:rPr>
-        <w:t xml:space="preserve"> използван езикът за програмиране Python, </w:t>
-      </w:r>
-      <w:r>
-        <w:rPr>
-          <w:lang w:val="bg-BG" w:eastAsia="en-US" w:bidi="ar-SA"/>
-        </w:rPr>
-        <w:t xml:space="preserve">както и </w:t>
-      </w:r>
-      <w:r>
-        <w:rPr>
-          <w:lang w:val="bg-BG" w:eastAsia="en-US" w:bidi="ar-SA"/>
-        </w:rPr>
-        <w:t xml:space="preserve">локално разположена </w:t>
-      </w:r>
-      <w:r>
-        <w:rPr>
-          <w:lang w:val="bg-BG" w:eastAsia="en-US" w:bidi="ar-SA"/>
-        </w:rPr>
-        <w:t>(</w:t>
+        <w:t>За обработката на данните, създаването и обучението на модела е  използван езикът за програмиране Python, както и локално разположена (</w:t>
       </w:r>
       <w:r>
         <w:rPr>
@@ -2607,133 +2923,79 @@
         <w:rPr>
           <w:lang w:val="bg-BG" w:eastAsia="en-US" w:bidi="ar-SA"/>
         </w:rPr>
-        <w:t>)</w:t>
-      </w:r>
-      <w:r>
-        <w:rPr>
-          <w:lang w:val="bg-BG" w:eastAsia="en-US" w:bidi="ar-SA"/>
-        </w:rPr>
-        <w:t xml:space="preserve"> инстанция на JupyterLab, изпълнявана в Docker контейнер, базиран на образа „nvidia/cuda:12.1.1-runtime-ubuntu22.04„. </w:t>
-      </w:r>
-      <w:r>
-        <w:rPr>
-          <w:lang w:val="bg-BG" w:eastAsia="en-US" w:bidi="ar-SA"/>
-        </w:rPr>
-        <w:t>Инстанцията е разположена на домашен компютър и е достъпна посредством локалната мрежа. Локалната мрежа бе достъпена от разстояние посредством локално разположен</w:t>
-      </w:r>
-      <w:r>
-        <w:rPr>
-          <w:lang w:val="bg-BG" w:eastAsia="en-US" w:bidi="ar-SA"/>
-        </w:rPr>
-        <w:t>a</w:t>
-      </w:r>
-      <w:r>
-        <w:rPr>
-          <w:lang w:val="bg-BG" w:eastAsia="en-US" w:bidi="ar-SA"/>
-        </w:rPr>
-        <w:t xml:space="preserve"> (</w:t>
+        <w:t xml:space="preserve">) инстанция на JupyterLab, изпълнявана в Docker контейнер, базиран на образа „nvidia/cuda:12.1.1-runtime-ubuntu22.04„. Инстанцията е разположена на домашен компютър и е достъпна посредством локалната мрежа. Локалната мрежа бе </w:t>
+      </w:r>
+      <w:r>
+        <w:rPr>
+          <w:lang w:val="bg-BG" w:eastAsia="en-US" w:bidi="ar-SA"/>
+        </w:rPr>
+        <w:t xml:space="preserve">достъпвана </w:t>
+      </w:r>
+      <w:r>
+        <w:rPr>
+          <w:lang w:val="bg-BG" w:eastAsia="en-US" w:bidi="ar-SA"/>
+        </w:rPr>
+        <w:t>от разстояние посредством локално разположенa виртуална частна мрежа</w:t>
       </w:r>
       <w:r>
         <w:rPr>
           <w:lang w:val="en-US" w:eastAsia="en-US" w:bidi="ar-SA"/>
         </w:rPr>
+        <w:t xml:space="preserve">. </w:t>
+      </w:r>
+      <w:r>
+        <w:rPr>
+          <w:lang w:val="bg-BG" w:eastAsia="en-US" w:bidi="ar-SA"/>
+        </w:rPr>
+        <w:t xml:space="preserve">Като резервна опция при евентуален проблем с  виртуалната частна мрежа, беше осъществена връзка чрез </w:t>
+      </w:r>
+      <w:r>
+        <w:rPr>
+          <w:lang w:val="en-US" w:eastAsia="en-US" w:bidi="ar-SA"/>
+        </w:rPr>
+        <w:t xml:space="preserve">AnyDesk, </w:t>
+      </w:r>
+      <w:r>
+        <w:rPr>
+          <w:lang w:val="bg-BG" w:eastAsia="en-US" w:bidi="ar-SA"/>
+        </w:rPr>
+        <w:t>както и локално разположенa (</w:t>
+      </w:r>
+      <w:r>
+        <w:rPr>
+          <w:lang w:val="en-US" w:eastAsia="en-US" w:bidi="ar-SA"/>
+        </w:rPr>
         <w:t>self-hosted</w:t>
       </w:r>
       <w:r>
         <w:rPr>
           <w:lang w:val="bg-BG" w:eastAsia="en-US" w:bidi="ar-SA"/>
         </w:rPr>
-        <w:t xml:space="preserve">) </w:t>
-      </w:r>
-      <w:r>
-        <w:rPr>
-          <w:lang w:val="bg-BG" w:eastAsia="en-US" w:bidi="ar-SA"/>
-        </w:rPr>
-        <w:t>виртуална частна мрежа</w:t>
+        <w:t xml:space="preserve">) инстанция на </w:t>
       </w:r>
       <w:r>
         <w:rPr>
           <w:lang w:val="en-US" w:eastAsia="en-US" w:bidi="ar-SA"/>
         </w:rPr>
-        <w:t xml:space="preserve">. </w:t>
-      </w:r>
-      <w:r>
-        <w:rPr>
-          <w:lang w:val="bg-BG" w:eastAsia="en-US" w:bidi="ar-SA"/>
-        </w:rPr>
-        <w:t xml:space="preserve">Като резервна опция при евентуален проблем с  виртуалната частна мрежа, беше осъществена връзка чрез </w:t>
+        <w:t xml:space="preserve">Sunshine </w:t>
+      </w:r>
+      <w:r>
+        <w:rPr>
+          <w:lang w:val="bg-BG" w:eastAsia="en-US" w:bidi="ar-SA"/>
+        </w:rPr>
+        <w:t xml:space="preserve">и </w:t>
       </w:r>
       <w:r>
         <w:rPr>
           <w:lang w:val="en-US" w:eastAsia="en-US" w:bidi="ar-SA"/>
         </w:rPr>
-        <w:t xml:space="preserve">AnyDesk, </w:t>
-      </w:r>
-      <w:r>
-        <w:rPr>
-          <w:lang w:val="bg-BG" w:eastAsia="en-US" w:bidi="ar-SA"/>
-        </w:rPr>
-        <w:t xml:space="preserve">както и </w:t>
-      </w:r>
-      <w:r>
-        <w:rPr>
-          <w:lang w:val="bg-BG" w:eastAsia="en-US" w:bidi="ar-SA"/>
-        </w:rPr>
-        <w:t>локално разположен</w:t>
-      </w:r>
-      <w:r>
-        <w:rPr>
-          <w:lang w:val="bg-BG" w:eastAsia="en-US" w:bidi="ar-SA"/>
-        </w:rPr>
-        <w:t>a</w:t>
-      </w:r>
-      <w:r>
-        <w:rPr>
-          <w:lang w:val="bg-BG" w:eastAsia="en-US" w:bidi="ar-SA"/>
-        </w:rPr>
-        <w:t xml:space="preserve"> (</w:t>
-      </w:r>
-      <w:r>
-        <w:rPr>
-          <w:lang w:val="en-US" w:eastAsia="en-US" w:bidi="ar-SA"/>
-        </w:rPr>
-        <w:t>self-hosted</w:t>
-      </w:r>
-      <w:r>
-        <w:rPr>
-          <w:lang w:val="bg-BG" w:eastAsia="en-US" w:bidi="ar-SA"/>
-        </w:rPr>
-        <w:t xml:space="preserve">) </w:t>
-      </w:r>
-      <w:r>
-        <w:rPr>
-          <w:lang w:val="bg-BG" w:eastAsia="en-US" w:bidi="ar-SA"/>
-        </w:rPr>
-        <w:t xml:space="preserve">инстанция на </w:t>
-      </w:r>
-      <w:r>
-        <w:rPr>
-          <w:lang w:val="en-US" w:eastAsia="en-US" w:bidi="ar-SA"/>
-        </w:rPr>
-        <w:t xml:space="preserve">Sunshine </w:t>
-      </w:r>
-      <w:r>
-        <w:rPr>
-          <w:lang w:val="bg-BG" w:eastAsia="en-US" w:bidi="ar-SA"/>
-        </w:rPr>
-        <w:t xml:space="preserve">и </w:t>
-      </w:r>
-      <w:r>
-        <w:rPr>
-          <w:lang w:val="en-US" w:eastAsia="en-US" w:bidi="ar-SA"/>
-        </w:rPr>
         <w:t>Moonlight.</w:t>
       </w:r>
     </w:p>
     <w:p>
       <w:pPr>
         <w:pStyle w:val="Normal"/>
-        <w:overflowPunct w:val="true"/>
+        <w:overflowPunct w:val="false"/>
         <w:spacing w:lineRule="auto" w:line="278" w:before="0" w:after="160"/>
         <w:ind w:hanging="0"/>
         <w:rPr>
@@ -2744,6 +3006,19 @@
         <w:rPr>
           <w:lang w:val="bg-BG" w:eastAsia="en-US" w:bidi="ar-SA"/>
         </w:rPr>
+        <w:tab/>
+      </w:r>
+      <w:r>
+        <w:rPr>
+          <w:lang w:val="bg-BG" w:eastAsia="en-US" w:bidi="ar-SA"/>
+        </w:rPr>
+        <w:t>Използван модел, кой модели съм сравнявал, как съм оптимизирал параметрите на моделите, р</w:t>
+      </w:r>
+      <w:r>
+        <w:rPr>
+          <w:lang w:val="bg-BG" w:eastAsia="en-US" w:bidi="ar-SA"/>
+        </w:rPr>
+        <w:t>езултати .......</w:t>
       </w:r>
       <w:r>
         <w:br w:type="page"/>
@@ -2758,7 +3033,7 @@
           <w:ilvl w:val="0"/>
           <w:numId w:val="4"/>
         </w:numPr>
-        <w:overflowPunct w:val="true"/>
+        <w:overflowPunct w:val="false"/>
         <w:spacing w:lineRule="auto" w:line="276" w:before="0" w:after="0"/>
         <w:ind w:hanging="357" w:left="357"/>
         <w:contextualSpacing/>
@@ -2771,7 +3046,9 @@
           <w:lang w:val="bg-BG" w:eastAsia="en-US" w:bidi="ar-SA"/>
         </w:rPr>
       </w:pPr>
-      <w:bookmarkStart w:id="1" w:name="_Toc169282652"/>
+      <w:bookmarkStart w:id="2" w:name="__RefHeading___Toc957_4158184810"/>
+      <w:bookmarkStart w:id="3" w:name="_Toc169282652"/>
+      <w:bookmarkEnd w:id="2"/>
       <w:r>
         <w:rPr>
           <w:b/>
@@ -2782,24 +3059,111 @@
         </w:rPr>
         <w:t>Увод</w:t>
       </w:r>
-      <w:bookmarkEnd w:id="1"/>
+      <w:bookmarkEnd w:id="3"/>
+    </w:p>
+    <w:p>
+      <w:pPr>
+        <w:pStyle w:val="ListParagraph"/>
+        <w:widowControl/>
+        <w:numPr>
+          <w:ilvl w:val="0"/>
+          <w:numId w:val="0"/>
+        </w:numPr>
+        <w:suppressAutoHyphens w:val="true"/>
+        <w:overflowPunct w:val="false"/>
+        <w:spacing w:lineRule="auto" w:line="276" w:before="0" w:after="0"/>
+        <w:ind w:hanging="357" w:left="357"/>
+        <w:contextualSpacing/>
+        <w:jc w:val="left"/>
+        <w:outlineLvl w:val="0"/>
+        <w:rPr>
+          <w:b/>
+          <w:bCs/>
+          <w:sz w:val="32"/>
+          <w:szCs w:val="28"/>
+          <w:lang w:val="bg-BG" w:eastAsia="en-US" w:bidi="ar-SA"/>
+        </w:rPr>
+      </w:pPr>
+      <w:r>
+        <w:rPr>
+          <w:b/>
+          <w:bCs/>
+          <w:sz w:val="32"/>
+          <w:szCs w:val="32"/>
+          <w:lang w:val="bg-BG" w:eastAsia="en-US" w:bidi="ar-SA"/>
+        </w:rPr>
+      </w:r>
+      <w:r>
+        <w:br w:type="page"/>
+      </w:r>
     </w:p>
     <w:p>
       <w:pPr>
         <w:pStyle w:val="ListParagraph"/>
         <w:numPr>
           <w:ilvl w:val="0"/>
-          <w:numId w:val="5"/>
+          <w:numId w:val="4"/>
         </w:numPr>
-        <w:rPr>
-          <w:lang w:val="bg-BG" w:eastAsia="en-US" w:bidi="ar-SA"/>
-        </w:rPr>
-      </w:pPr>
-      <w:r>
-        <w:rPr>
-          <w:lang w:val="bg-BG" w:eastAsia="en-US" w:bidi="ar-SA"/>
-        </w:rPr>
-        <w:t>Обяснявам какво е защита на зрението</w:t>
+        <w:overflowPunct w:val="false"/>
+        <w:spacing w:lineRule="auto" w:line="276" w:before="0" w:after="0"/>
+        <w:ind w:hanging="357" w:left="357"/>
+        <w:contextualSpacing/>
+        <w:outlineLvl w:val="0"/>
+        <w:rPr>
+          <w:b/>
+          <w:bCs/>
+          <w:sz w:val="32"/>
+          <w:szCs w:val="28"/>
+          <w:lang w:val="bg-BG" w:eastAsia="en-US" w:bidi="ar-SA"/>
+        </w:rPr>
+      </w:pPr>
+      <w:bookmarkStart w:id="4" w:name="__RefHeading___Toc959_4158184810"/>
+      <w:bookmarkEnd w:id="4"/>
+      <w:r>
+        <w:rPr>
+          <w:b/>
+          <w:bCs/>
+          <w:sz w:val="32"/>
+          <w:szCs w:val="32"/>
+          <w:lang w:val="bg-BG" w:eastAsia="en-US" w:bidi="ar-SA"/>
+        </w:rPr>
+        <w:t xml:space="preserve">Обзор на съществуващи решения </w:t>
+      </w:r>
+    </w:p>
+    <w:p>
+      <w:pPr>
+        <w:pStyle w:val="ListParagraph"/>
+        <w:widowControl/>
+        <w:numPr>
+          <w:ilvl w:val="0"/>
+          <w:numId w:val="0"/>
+        </w:numPr>
+        <w:suppressAutoHyphens w:val="true"/>
+        <w:overflowPunct w:val="false"/>
+        <w:spacing w:lineRule="auto" w:line="276" w:before="0" w:after="0"/>
+        <w:ind w:hanging="357" w:left="357"/>
+        <w:contextualSpacing/>
+        <w:jc w:val="left"/>
+        <w:outlineLvl w:val="0"/>
+        <w:rPr>
+          <w:b/>
+          <w:bCs/>
+          <w:sz w:val="32"/>
+          <w:szCs w:val="28"/>
+          <w:lang w:val="bg-BG" w:eastAsia="en-US" w:bidi="ar-SA"/>
+        </w:rPr>
+      </w:pPr>
+      <w:r>
+        <w:rPr>
+          <w:b/>
+          <w:bCs/>
+          <w:sz w:val="32"/>
+          <w:szCs w:val="32"/>
+          <w:lang w:val="bg-BG" w:eastAsia="en-US" w:bidi="ar-SA"/>
+        </w:rPr>
+      </w:r>
+      <w:r>
+        <w:br w:type="page"/>
       </w:r>
     </w:p>
     <w:p>
@@ -2807,17 +3171,68 @@
         <w:pStyle w:val="ListParagraph"/>
         <w:numPr>
           <w:ilvl w:val="0"/>
-          <w:numId w:val="5"/>
+          <w:numId w:val="4"/>
         </w:numPr>
-        <w:rPr>
-          <w:lang w:val="bg-BG" w:eastAsia="en-US" w:bidi="ar-SA"/>
-        </w:rPr>
-      </w:pPr>
-      <w:r>
-        <w:rPr>
-          <w:lang w:val="bg-BG" w:eastAsia="en-US" w:bidi="ar-SA"/>
-        </w:rPr>
-        <w:t>Какво се предлага за защита на зрението, колко помага</w:t>
+        <w:overflowPunct w:val="false"/>
+        <w:spacing w:lineRule="auto" w:line="276" w:before="0" w:after="0"/>
+        <w:ind w:hanging="357" w:left="357"/>
+        <w:contextualSpacing/>
+        <w:outlineLvl w:val="0"/>
+        <w:rPr>
+          <w:b/>
+          <w:bCs/>
+          <w:sz w:val="32"/>
+          <w:szCs w:val="28"/>
+          <w:lang w:val="bg-BG" w:eastAsia="en-US" w:bidi="ar-SA"/>
+        </w:rPr>
+      </w:pPr>
+      <w:bookmarkStart w:id="5" w:name="__RefHeading___Toc961_4158184810"/>
+      <w:bookmarkEnd w:id="5"/>
+      <w:r>
+        <w:rPr>
+          <w:b/>
+          <w:bCs/>
+          <w:sz w:val="32"/>
+          <w:szCs w:val="32"/>
+          <w:lang w:val="bg-BG" w:eastAsia="en-US" w:bidi="ar-SA"/>
+        </w:rPr>
+        <w:t>Поставени цели и задачи</w:t>
+      </w:r>
+    </w:p>
+    <w:p>
+      <w:pPr>
+        <w:pStyle w:val="ListParagraph"/>
+        <w:widowControl/>
+        <w:numPr>
+          <w:ilvl w:val="0"/>
+          <w:numId w:val="0"/>
+        </w:numPr>
+        <w:suppressAutoHyphens w:val="true"/>
+        <w:overflowPunct w:val="false"/>
+        <w:spacing w:lineRule="auto" w:line="276" w:before="0" w:after="0"/>
+        <w:ind w:hanging="357" w:left="357"/>
+        <w:contextualSpacing/>
+        <w:jc w:val="left"/>
+        <w:outlineLvl w:val="0"/>
+        <w:rPr>
+          <w:b/>
+          <w:bCs/>
+          <w:sz w:val="32"/>
+          <w:szCs w:val="28"/>
+          <w:lang w:val="bg-BG" w:eastAsia="en-US" w:bidi="ar-SA"/>
+        </w:rPr>
+      </w:pPr>
+      <w:r>
+        <w:rPr>
+          <w:b/>
+          <w:bCs/>
+          <w:sz w:val="32"/>
+          <w:szCs w:val="32"/>
+          <w:lang w:val="bg-BG" w:eastAsia="en-US" w:bidi="ar-SA"/>
+        </w:rPr>
+      </w:r>
+      <w:r>
+        <w:br w:type="page"/>
       </w:r>
     </w:p>
     <w:p>
@@ -2825,17 +3240,68 @@
         <w:pStyle w:val="ListParagraph"/>
         <w:numPr>
           <w:ilvl w:val="0"/>
-          <w:numId w:val="5"/>
+          <w:numId w:val="4"/>
         </w:numPr>
-        <w:rPr>
-          <w:lang w:val="bg-BG" w:eastAsia="en-US" w:bidi="ar-SA"/>
-        </w:rPr>
-      </w:pPr>
-      <w:r>
-        <w:rPr>
-          <w:lang w:val="bg-BG" w:eastAsia="en-US" w:bidi="ar-SA"/>
-        </w:rPr>
-        <w:t>Какво предлага моята програма и защо е полезна</w:t>
+        <w:overflowPunct w:val="false"/>
+        <w:spacing w:lineRule="auto" w:line="276" w:before="0" w:after="0"/>
+        <w:ind w:hanging="357" w:left="357"/>
+        <w:contextualSpacing/>
+        <w:outlineLvl w:val="0"/>
+        <w:rPr>
+          <w:b/>
+          <w:bCs/>
+          <w:sz w:val="32"/>
+          <w:szCs w:val="28"/>
+          <w:lang w:val="bg-BG" w:eastAsia="en-US" w:bidi="ar-SA"/>
+        </w:rPr>
+      </w:pPr>
+      <w:bookmarkStart w:id="6" w:name="__RefHeading___Toc965_4158184810"/>
+      <w:bookmarkEnd w:id="6"/>
+      <w:r>
+        <w:rPr>
+          <w:b/>
+          <w:bCs/>
+          <w:sz w:val="32"/>
+          <w:szCs w:val="32"/>
+          <w:lang w:val="bg-BG" w:eastAsia="en-US" w:bidi="ar-SA"/>
+        </w:rPr>
+        <w:t>Описание на експеримент за събиране на данните</w:t>
+      </w:r>
+    </w:p>
+    <w:p>
+      <w:pPr>
+        <w:pStyle w:val="ListParagraph"/>
+        <w:widowControl/>
+        <w:numPr>
+          <w:ilvl w:val="0"/>
+          <w:numId w:val="0"/>
+        </w:numPr>
+        <w:suppressAutoHyphens w:val="true"/>
+        <w:overflowPunct w:val="false"/>
+        <w:spacing w:lineRule="auto" w:line="276" w:before="0" w:after="0"/>
+        <w:ind w:hanging="357" w:left="357"/>
+        <w:contextualSpacing/>
+        <w:jc w:val="left"/>
+        <w:outlineLvl w:val="0"/>
+        <w:rPr>
+          <w:b/>
+          <w:bCs/>
+          <w:sz w:val="32"/>
+          <w:szCs w:val="28"/>
+          <w:lang w:val="bg-BG" w:eastAsia="en-US" w:bidi="ar-SA"/>
+        </w:rPr>
+      </w:pPr>
+      <w:r>
+        <w:rPr>
+          <w:b/>
+          <w:bCs/>
+          <w:sz w:val="32"/>
+          <w:szCs w:val="32"/>
+          <w:lang w:val="bg-BG" w:eastAsia="en-US" w:bidi="ar-SA"/>
+        </w:rPr>
+      </w:r>
+      <w:r>
+        <w:br w:type="page"/>
       </w:r>
     </w:p>
     <w:p>
@@ -2843,82 +3309,286 @@
         <w:pStyle w:val="ListParagraph"/>
         <w:numPr>
           <w:ilvl w:val="0"/>
-          <w:numId w:val="5"/>
+          <w:numId w:val="4"/>
         </w:numPr>
-        <w:rPr>
-          <w:lang w:val="bg-BG" w:eastAsia="en-US" w:bidi="ar-SA"/>
-        </w:rPr>
-      </w:pPr>
-      <w:r>
-        <w:rPr>
-          <w:lang w:val="bg-BG" w:eastAsia="en-US" w:bidi="ar-SA"/>
-        </w:rPr>
-        <w:t>Целева група, употреба, цел на проекта</w:t>
-      </w:r>
-    </w:p>
-    <w:p>
-      <w:pPr>
-        <w:pStyle w:val="Normal"/>
-        <w:rPr>
-          <w:lang w:val="bg-BG" w:eastAsia="en-US" w:bidi="ar-SA"/>
-        </w:rPr>
-      </w:pPr>
-      <w:r>
-        <w:rPr>
-          <w:lang w:val="bg-BG" w:eastAsia="en-US" w:bidi="ar-SA"/>
-        </w:rPr>
-      </w:r>
-    </w:p>
-    <w:p>
-      <w:pPr>
-        <w:pStyle w:val="Normal"/>
-        <w:rPr>
-          <w:lang w:val="bg-BG" w:eastAsia="en-US" w:bidi="ar-SA"/>
-        </w:rPr>
-      </w:pPr>
-      <w:r>
-        <w:rPr>
-          <w:lang w:val="bg-BG" w:eastAsia="en-US" w:bidi="ar-SA"/>
-        </w:rPr>
-      </w:r>
-    </w:p>
-    <w:p>
-      <w:pPr>
-        <w:pStyle w:val="Normal"/>
-        <w:rPr>
-          <w:lang w:val="bg-BG" w:eastAsia="en-US" w:bidi="ar-SA"/>
-        </w:rPr>
-      </w:pPr>
-      <w:r>
-        <w:rPr>
-          <w:lang w:val="bg-BG" w:eastAsia="en-US" w:bidi="ar-SA"/>
-        </w:rPr>
-      </w:r>
-    </w:p>
-    <w:p>
-      <w:pPr>
-        <w:pStyle w:val="Normal"/>
-        <w:rPr>
-          <w:lang w:val="bg-BG" w:eastAsia="en-US" w:bidi="ar-SA"/>
-        </w:rPr>
-      </w:pPr>
-      <w:r>
-        <w:rPr>
-          <w:lang w:val="bg-BG" w:eastAsia="en-US" w:bidi="ar-SA"/>
-        </w:rPr>
-      </w:r>
-    </w:p>
-    <w:p>
-      <w:pPr>
-        <w:pStyle w:val="Normal"/>
-        <w:rPr>
-          <w:lang w:val="bg-BG" w:eastAsia="en-US" w:bidi="ar-SA"/>
-        </w:rPr>
-      </w:pPr>
-      <w:r>
-        <w:rPr>
-          <w:lang w:val="bg-BG" w:eastAsia="en-US" w:bidi="ar-SA"/>
-        </w:rPr>
+        <w:overflowPunct w:val="false"/>
+        <w:spacing w:lineRule="auto" w:line="276" w:before="0" w:after="0"/>
+        <w:ind w:hanging="357" w:left="357"/>
+        <w:contextualSpacing/>
+        <w:outlineLvl w:val="0"/>
+        <w:rPr>
+          <w:b/>
+          <w:bCs/>
+          <w:sz w:val="32"/>
+          <w:szCs w:val="28"/>
+          <w:lang w:val="bg-BG" w:eastAsia="en-US" w:bidi="ar-SA"/>
+        </w:rPr>
+      </w:pPr>
+      <w:bookmarkStart w:id="7" w:name="__RefHeading___Toc969_4158184810"/>
+      <w:bookmarkEnd w:id="7"/>
+      <w:r>
+        <w:rPr>
+          <w:b/>
+          <w:bCs/>
+          <w:sz w:val="32"/>
+          <w:szCs w:val="32"/>
+          <w:lang w:val="bg-BG" w:eastAsia="en-US" w:bidi="ar-SA"/>
+        </w:rPr>
+        <w:t>С</w:t>
+      </w:r>
+      <w:r>
+        <w:rPr>
+          <w:b/>
+          <w:bCs/>
+          <w:sz w:val="32"/>
+          <w:szCs w:val="32"/>
+          <w:lang w:val="bg-BG" w:eastAsia="en-US" w:bidi="ar-SA"/>
+        </w:rPr>
+        <w:t xml:space="preserve">офтуер за класифициране </w:t>
+      </w:r>
+      <w:r>
+        <w:rPr>
+          <w:b/>
+          <w:bCs/>
+          <w:sz w:val="32"/>
+          <w:szCs w:val="32"/>
+          <w:lang w:val="bg-BG" w:eastAsia="en-US" w:bidi="ar-SA"/>
+        </w:rPr>
+        <w:t>на данните</w:t>
+      </w:r>
+    </w:p>
+    <w:p>
+      <w:pPr>
+        <w:pStyle w:val="ListParagraph"/>
+        <w:numPr>
+          <w:ilvl w:val="1"/>
+          <w:numId w:val="4"/>
+        </w:numPr>
+        <w:overflowPunct w:val="false"/>
+        <w:spacing w:lineRule="auto" w:line="276" w:before="0" w:after="0"/>
+        <w:ind w:hanging="357" w:left="357"/>
+        <w:contextualSpacing/>
+        <w:outlineLvl w:val="0"/>
+        <w:rPr>
+          <w:b/>
+          <w:bCs/>
+          <w:sz w:val="32"/>
+          <w:szCs w:val="28"/>
+          <w:lang w:val="bg-BG" w:eastAsia="en-US" w:bidi="ar-SA"/>
+        </w:rPr>
+      </w:pPr>
+      <w:bookmarkStart w:id="8" w:name="__RefHeading___Toc2735_4158184810"/>
+      <w:bookmarkEnd w:id="8"/>
+      <w:r>
+        <w:rPr>
+          <w:b/>
+          <w:bCs/>
+          <w:sz w:val="32"/>
+          <w:szCs w:val="32"/>
+          <w:lang w:val="bg-BG" w:eastAsia="en-US" w:bidi="ar-SA"/>
+        </w:rPr>
+        <w:t>Изисквания, архитектура и организация на данните</w:t>
+      </w:r>
+    </w:p>
+    <w:p>
+      <w:pPr>
+        <w:pStyle w:val="ListParagraph"/>
+        <w:numPr>
+          <w:ilvl w:val="1"/>
+          <w:numId w:val="4"/>
+        </w:numPr>
+        <w:overflowPunct w:val="false"/>
+        <w:spacing w:lineRule="auto" w:line="276" w:before="0" w:after="0"/>
+        <w:ind w:hanging="357" w:left="357"/>
+        <w:contextualSpacing/>
+        <w:outlineLvl w:val="0"/>
+        <w:rPr>
+          <w:b/>
+          <w:bCs/>
+          <w:sz w:val="32"/>
+          <w:szCs w:val="28"/>
+          <w:lang w:val="bg-BG" w:eastAsia="en-US" w:bidi="ar-SA"/>
+        </w:rPr>
+      </w:pPr>
+      <w:bookmarkStart w:id="9" w:name="__RefHeading___Toc2737_4158184810"/>
+      <w:bookmarkEnd w:id="9"/>
+      <w:r>
+        <w:rPr>
+          <w:b/>
+          <w:bCs/>
+          <w:sz w:val="32"/>
+          <w:szCs w:val="32"/>
+          <w:lang w:val="bg-BG" w:eastAsia="en-US" w:bidi="ar-SA"/>
+        </w:rPr>
+        <w:t>Избор на език и среда за програмиране</w:t>
+      </w:r>
+    </w:p>
+    <w:p>
+      <w:pPr>
+        <w:pStyle w:val="ListParagraph"/>
+        <w:numPr>
+          <w:ilvl w:val="1"/>
+          <w:numId w:val="4"/>
+        </w:numPr>
+        <w:overflowPunct w:val="false"/>
+        <w:spacing w:lineRule="auto" w:line="276" w:before="0" w:after="0"/>
+        <w:ind w:hanging="357" w:left="357"/>
+        <w:contextualSpacing/>
+        <w:outlineLvl w:val="0"/>
+        <w:rPr>
+          <w:b/>
+          <w:bCs/>
+          <w:sz w:val="32"/>
+          <w:szCs w:val="28"/>
+          <w:lang w:val="bg-BG" w:eastAsia="en-US" w:bidi="ar-SA"/>
+        </w:rPr>
+      </w:pPr>
+      <w:bookmarkStart w:id="10" w:name="__RefHeading___Toc2739_4158184810"/>
+      <w:bookmarkEnd w:id="10"/>
+      <w:r>
+        <w:rPr>
+          <w:b/>
+          <w:bCs/>
+          <w:sz w:val="32"/>
+          <w:szCs w:val="32"/>
+          <w:lang w:val="bg-BG" w:eastAsia="en-US" w:bidi="ar-SA"/>
+        </w:rPr>
+        <w:t>Реализация на програмната система</w:t>
+      </w:r>
+    </w:p>
+    <w:p>
+      <w:pPr>
+        <w:pStyle w:val="ListParagraph"/>
+        <w:numPr>
+          <w:ilvl w:val="2"/>
+          <w:numId w:val="4"/>
+        </w:numPr>
+        <w:overflowPunct w:val="false"/>
+        <w:spacing w:lineRule="auto" w:line="276" w:before="0" w:after="0"/>
+        <w:ind w:hanging="357" w:left="357"/>
+        <w:contextualSpacing/>
+        <w:outlineLvl w:val="0"/>
+        <w:rPr>
+          <w:b/>
+          <w:bCs/>
+          <w:sz w:val="32"/>
+          <w:szCs w:val="28"/>
+          <w:lang w:val="bg-BG" w:eastAsia="en-US" w:bidi="ar-SA"/>
+        </w:rPr>
+      </w:pPr>
+      <w:bookmarkStart w:id="11" w:name="__RefHeading___Toc2741_4158184810"/>
+      <w:bookmarkEnd w:id="11"/>
+      <w:r>
+        <w:rPr>
+          <w:b/>
+          <w:bCs/>
+          <w:sz w:val="32"/>
+          <w:szCs w:val="32"/>
+          <w:lang w:val="bg-BG" w:eastAsia="en-US" w:bidi="ar-SA"/>
+        </w:rPr>
+        <w:t>Описание на програмните модули</w:t>
+      </w:r>
+    </w:p>
+    <w:p>
+      <w:pPr>
+        <w:pStyle w:val="ListParagraph"/>
+        <w:numPr>
+          <w:ilvl w:val="2"/>
+          <w:numId w:val="4"/>
+        </w:numPr>
+        <w:overflowPunct w:val="false"/>
+        <w:spacing w:lineRule="auto" w:line="276" w:before="0" w:after="0"/>
+        <w:ind w:hanging="357" w:left="357"/>
+        <w:contextualSpacing/>
+        <w:outlineLvl w:val="0"/>
+        <w:rPr>
+          <w:b/>
+          <w:bCs/>
+          <w:sz w:val="32"/>
+          <w:szCs w:val="28"/>
+          <w:lang w:val="bg-BG" w:eastAsia="en-US" w:bidi="ar-SA"/>
+        </w:rPr>
+      </w:pPr>
+      <w:bookmarkStart w:id="12" w:name="__RefHeading___Toc2743_4158184810"/>
+      <w:bookmarkEnd w:id="12"/>
+      <w:r>
+        <w:rPr>
+          <w:b/>
+          <w:bCs/>
+          <w:sz w:val="32"/>
+          <w:szCs w:val="32"/>
+          <w:lang w:val="bg-BG" w:eastAsia="en-US" w:bidi="ar-SA"/>
+        </w:rPr>
+        <w:t>Структура и организация на програмния интерфейс</w:t>
+      </w:r>
+    </w:p>
+    <w:p>
+      <w:pPr>
+        <w:pStyle w:val="ListParagraph"/>
+        <w:numPr>
+          <w:ilvl w:val="1"/>
+          <w:numId w:val="4"/>
+        </w:numPr>
+        <w:overflowPunct w:val="false"/>
+        <w:spacing w:lineRule="auto" w:line="276" w:before="0" w:after="0"/>
+        <w:ind w:hanging="357" w:left="357"/>
+        <w:contextualSpacing/>
+        <w:outlineLvl w:val="0"/>
+        <w:rPr>
+          <w:b/>
+          <w:bCs/>
+          <w:sz w:val="32"/>
+          <w:szCs w:val="28"/>
+          <w:lang w:val="bg-BG" w:eastAsia="en-US" w:bidi="ar-SA"/>
+        </w:rPr>
+      </w:pPr>
+      <w:bookmarkStart w:id="13" w:name="__RefHeading___Toc2745_4158184810"/>
+      <w:bookmarkEnd w:id="13"/>
+      <w:r>
+        <w:rPr>
+          <w:b/>
+          <w:bCs/>
+          <w:sz w:val="32"/>
+          <w:szCs w:val="32"/>
+          <w:lang w:val="bg-BG" w:eastAsia="en-US" w:bidi="ar-SA"/>
+        </w:rPr>
+        <w:t>Формат на входните и изходните данни</w:t>
+      </w:r>
+    </w:p>
+    <w:p>
+      <w:pPr>
+        <w:pStyle w:val="ListParagraph"/>
+        <w:widowControl/>
+        <w:numPr>
+          <w:ilvl w:val="0"/>
+          <w:numId w:val="0"/>
+        </w:numPr>
+        <w:suppressAutoHyphens w:val="true"/>
+        <w:overflowPunct w:val="false"/>
+        <w:spacing w:lineRule="auto" w:line="276" w:before="0" w:after="0"/>
+        <w:ind w:hanging="357" w:left="357"/>
+        <w:contextualSpacing/>
+        <w:jc w:val="left"/>
+        <w:outlineLvl w:val="0"/>
+        <w:rPr>
+          <w:b/>
+          <w:bCs/>
+          <w:sz w:val="32"/>
+          <w:szCs w:val="28"/>
+          <w:lang w:val="bg-BG" w:eastAsia="en-US" w:bidi="ar-SA"/>
+        </w:rPr>
+      </w:pPr>
+      <w:r>
+        <w:rPr>
+          <w:b/>
+          <w:bCs/>
+          <w:sz w:val="32"/>
+          <w:szCs w:val="32"/>
+          <w:lang w:val="bg-BG" w:eastAsia="en-US" w:bidi="ar-SA"/>
+        </w:rPr>
+      </w:r>
+      <w:r>
+        <w:br w:type="page"/>
       </w:r>
     </w:p>
     <w:p>
@@ -2926,17 +3596,559 @@
         <w:pStyle w:val="ListParagraph"/>
         <w:numPr>
           <w:ilvl w:val="0"/>
-          <w:numId w:val="5"/>
+          <w:numId w:val="4"/>
         </w:numPr>
-        <w:rPr>
-          <w:lang w:val="bg-BG" w:eastAsia="en-US" w:bidi="ar-SA"/>
-        </w:rPr>
-      </w:pPr>
-      <w:r>
-        <w:rPr>
-          <w:lang w:val="bg-BG" w:eastAsia="en-US" w:bidi="ar-SA"/>
-        </w:rPr>
-        <w:t>Говоря за ИИ</w:t>
+        <w:overflowPunct w:val="false"/>
+        <w:spacing w:lineRule="auto" w:line="276" w:before="0" w:after="0"/>
+        <w:ind w:hanging="357" w:left="357"/>
+        <w:contextualSpacing/>
+        <w:outlineLvl w:val="0"/>
+        <w:rPr>
+          <w:b/>
+          <w:bCs/>
+          <w:sz w:val="32"/>
+          <w:szCs w:val="28"/>
+          <w:lang w:val="bg-BG" w:eastAsia="en-US" w:bidi="ar-SA"/>
+        </w:rPr>
+      </w:pPr>
+      <w:bookmarkStart w:id="14" w:name="__RefHeading___Toc10516_4158184810"/>
+      <w:bookmarkEnd w:id="14"/>
+      <w:r>
+        <w:rPr>
+          <w:b/>
+          <w:bCs/>
+          <w:sz w:val="32"/>
+          <w:szCs w:val="32"/>
+          <w:lang w:val="bg-BG" w:eastAsia="en-US" w:bidi="ar-SA"/>
+        </w:rPr>
+        <w:t>Архитектура на системата и отдалечен достъп</w:t>
+      </w:r>
+    </w:p>
+    <w:p>
+      <w:pPr>
+        <w:pStyle w:val="Normal"/>
+        <w:rPr>
+          <w:lang w:val="bg-BG"/>
+        </w:rPr>
+      </w:pPr>
+      <w:r>
+        <w:rPr>
+          <w:lang w:val="bg-BG"/>
+        </w:rPr>
+        <w:t>За среда за разработка е избран JupyterLab, тъй като представлява едно от най-разпространените решения за разработка и експериментиране с модели за машинно обучение. Платформата поддържа т</w:t>
+      </w:r>
+      <w:r>
+        <w:rPr>
+          <w:lang w:val="bg-BG"/>
+        </w:rPr>
+        <w:t xml:space="preserve">ака </w:t>
+      </w:r>
+      <w:r>
+        <w:rPr>
+          <w:lang w:val="bg-BG"/>
+        </w:rPr>
+        <w:t>нар</w:t>
+      </w:r>
+      <w:r>
+        <w:rPr>
+          <w:lang w:val="bg-BG"/>
+        </w:rPr>
+        <w:t>ечените</w:t>
+      </w:r>
+      <w:r>
+        <w:rPr>
+          <w:lang w:val="bg-BG"/>
+        </w:rPr>
+        <w:t xml:space="preserve"> notebooks, които позволяват комбинирането на програмен код, визуализации и документация в единен документ. </w:t>
+      </w:r>
+    </w:p>
+    <w:p>
+      <w:pPr>
+        <w:pStyle w:val="Normal"/>
+        <w:rPr>
+          <w:lang w:val="bg-BG"/>
+        </w:rPr>
+      </w:pPr>
+      <w:r>
+        <w:rPr>
+          <w:lang w:val="bg-BG"/>
+        </w:rPr>
+        <w:t xml:space="preserve">Избора, да се инсталира локална инстанция на </w:t>
+      </w:r>
+      <w:r>
+        <w:rPr>
+          <w:lang w:val="en-US"/>
+        </w:rPr>
+        <w:t xml:space="preserve">JupyterLab </w:t>
+      </w:r>
+      <w:r>
+        <w:rPr>
+          <w:lang w:val="bg-BG"/>
+        </w:rPr>
+        <w:t>е взет с цел да се избегне зависимостта от чужда платформа, както и да позволи на целия експеримент да бъде възможно най-възпроизв</w:t>
+      </w:r>
+      <w:r>
+        <w:rPr>
+          <w:lang w:val="bg-BG"/>
+        </w:rPr>
+        <w:t>е</w:t>
+      </w:r>
+      <w:r>
+        <w:rPr>
+          <w:lang w:val="bg-BG"/>
+        </w:rPr>
+        <w:t xml:space="preserve">дим. </w:t>
+      </w:r>
+    </w:p>
+    <w:p>
+      <w:pPr>
+        <w:pStyle w:val="Normal"/>
+        <w:rPr>
+          <w:lang w:val="bg-BG"/>
+        </w:rPr>
+      </w:pPr>
+      <w:r>
+        <w:rPr>
+          <w:lang w:val="bg-BG"/>
+        </w:rPr>
+        <w:t xml:space="preserve">За да бъде постигната тази цел, бе използвана </w:t>
+      </w:r>
+      <w:r>
+        <w:rPr>
+          <w:lang w:val="en-US"/>
+        </w:rPr>
+        <w:t>Dooker.</w:t>
+      </w:r>
+      <w:r>
+        <w:rPr>
+          <w:lang w:val="bg-BG"/>
+        </w:rPr>
+        <w:t xml:space="preserve"> Docker представлява платформа за контейнеризация, която позволява разработването и изпълнението на приложения в изолирани среди, наречени контейнери. </w:t>
+      </w:r>
+      <w:r>
+        <w:rPr>
+          <w:lang w:val="en-US"/>
+        </w:rPr>
+        <w:t>[1]</w:t>
+      </w:r>
+    </w:p>
+    <w:p>
+      <w:pPr>
+        <w:pStyle w:val="Normal"/>
+        <w:rPr>
+          <w:lang w:val="bg-BG"/>
+        </w:rPr>
+      </w:pPr>
+      <w:r>
+        <w:rPr>
+          <w:lang w:val="bg-BG"/>
+        </w:rPr>
+        <w:t>К</w:t>
+      </w:r>
+      <w:r>
+        <w:rPr>
+          <w:lang w:val="bg-BG"/>
+        </w:rPr>
+        <w:t xml:space="preserve">онтейнеризацията </w:t>
+      </w:r>
+      <w:r>
+        <w:rPr>
+          <w:lang w:val="bg-BG"/>
+        </w:rPr>
+        <w:t xml:space="preserve">в този случай се постига чрез </w:t>
+      </w:r>
+      <w:r>
+        <w:rPr>
+          <w:lang w:val="en-US"/>
+        </w:rPr>
+        <w:t xml:space="preserve">Docker </w:t>
+      </w:r>
+      <w:r>
+        <w:rPr>
+          <w:lang w:val="bg-BG"/>
+        </w:rPr>
+        <w:t xml:space="preserve">контейнер. Docker контейнерът представлява стандартизирана единица за разпространение и изпълнение на софтуер, която съдържа приложението и всички необходими зависимости за неговата работа. Това позволява приложението да функционира по еднакъв начин в различни среди за изпълнение. </w:t>
+      </w:r>
+      <w:r>
+        <w:rPr>
+          <w:lang w:val="en-US"/>
+        </w:rPr>
+        <w:t>[1]</w:t>
+      </w:r>
+    </w:p>
+    <w:p>
+      <w:pPr>
+        <w:pStyle w:val="Normal"/>
+        <w:rPr/>
+      </w:pPr>
+      <w:r>
+        <w:rPr>
+          <w:lang w:val="bg-BG"/>
+        </w:rPr>
+        <w:t xml:space="preserve">За създаването на контейнера е създаден </w:t>
+      </w:r>
+      <w:r>
+        <w:rPr>
+          <w:lang w:val="en-US"/>
+        </w:rPr>
+        <w:t xml:space="preserve">Docker </w:t>
+      </w:r>
+      <w:r>
+        <w:rPr>
+          <w:lang w:val="bg-BG" w:eastAsia="en-US" w:bidi="ar-SA"/>
+        </w:rPr>
+        <w:t xml:space="preserve">образ </w:t>
+      </w:r>
+      <w:r>
+        <w:rPr>
+          <w:lang w:val="bg-BG" w:eastAsia="en-US" w:bidi="ar-SA"/>
+        </w:rPr>
+        <w:t>(</w:t>
+      </w:r>
+      <w:r>
+        <w:rPr>
+          <w:lang w:val="en-US" w:eastAsia="en-US" w:bidi="ar-SA"/>
+        </w:rPr>
+        <w:t>Docker image</w:t>
+      </w:r>
+      <w:r>
+        <w:rPr>
+          <w:lang w:val="bg-BG" w:eastAsia="en-US" w:bidi="ar-SA"/>
+        </w:rPr>
+        <w:t xml:space="preserve">). Docker образът представлява неизменяем шаблон, съдържащ необходимите инструкции и файлове за създаване на Docker контейнер. </w:t>
+      </w:r>
+      <w:r>
+        <w:rPr>
+          <w:lang w:val="en-US" w:eastAsia="en-US" w:bidi="ar-SA"/>
+        </w:rPr>
+        <w:t xml:space="preserve">[1] </w:t>
+      </w:r>
+    </w:p>
+    <w:p>
+      <w:pPr>
+        <w:pStyle w:val="Normal"/>
+        <w:rPr/>
+      </w:pPr>
+      <w:r>
+        <w:rPr>
+          <w:lang w:val="bg-BG" w:eastAsia="en-US" w:bidi="ar-SA"/>
+        </w:rPr>
+        <w:t xml:space="preserve">Създадения </w:t>
+      </w:r>
+      <w:r>
+        <w:rPr>
+          <w:lang w:val="en-US" w:eastAsia="en-US" w:bidi="ar-SA"/>
+        </w:rPr>
+        <w:t xml:space="preserve">Docker </w:t>
+      </w:r>
+      <w:r>
+        <w:rPr>
+          <w:lang w:val="bg-BG" w:eastAsia="en-US" w:bidi="ar-SA"/>
+        </w:rPr>
+        <w:t xml:space="preserve">образ </w:t>
+      </w:r>
+      <w:r>
+        <w:rPr>
+          <w:lang w:val="bg-BG" w:eastAsia="en-US" w:bidi="ar-SA"/>
+        </w:rPr>
+        <w:t>Съдържа следните директиви:</w:t>
+      </w:r>
+    </w:p>
+    <w:p>
+      <w:pPr>
+        <w:pStyle w:val="Normal"/>
+        <w:rPr>
+          <w:lang w:val="bg-BG" w:eastAsia="en-US" w:bidi="ar-SA"/>
+        </w:rPr>
+      </w:pPr>
+      <w:r>
+        <w:rPr>
+          <w:lang w:val="bg-BG" w:eastAsia="en-US" w:bidi="ar-SA"/>
+        </w:rPr>
+        <w:t>FROM nvidia/cuda:12.1.1-runtime-ubuntu22.04</w:t>
+      </w:r>
+    </w:p>
+    <w:p>
+      <w:pPr>
+        <w:pStyle w:val="Normal"/>
+        <w:rPr>
+          <w:lang w:val="bg-BG" w:eastAsia="en-US" w:bidi="ar-SA"/>
+        </w:rPr>
+      </w:pPr>
+      <w:r>
+        <w:rPr>
+          <w:lang w:val="bg-BG" w:eastAsia="en-US" w:bidi="ar-SA"/>
+        </w:rPr>
+        <w:t>WORKDIR /workspace</w:t>
+      </w:r>
+    </w:p>
+    <w:p>
+      <w:pPr>
+        <w:pStyle w:val="Normal"/>
+        <w:rPr>
+          <w:lang w:val="bg-BG" w:eastAsia="en-US" w:bidi="ar-SA"/>
+        </w:rPr>
+      </w:pPr>
+      <w:r>
+        <w:rPr>
+          <w:lang w:val="bg-BG" w:eastAsia="en-US" w:bidi="ar-SA"/>
+        </w:rPr>
+        <w:t>RUN apt-get update &amp;&amp; apt-get install -y python3-pip git &amp;&amp; rm -rf /var/lib/apt/lists/*</w:t>
+      </w:r>
+    </w:p>
+    <w:p>
+      <w:pPr>
+        <w:pStyle w:val="Normal"/>
+        <w:rPr>
+          <w:lang w:val="bg-BG" w:eastAsia="en-US" w:bidi="ar-SA"/>
+        </w:rPr>
+      </w:pPr>
+      <w:r>
+        <w:rPr>
+          <w:lang w:val="bg-BG" w:eastAsia="en-US" w:bidi="ar-SA"/>
+        </w:rPr>
+        <w:t>RUN pip install --no-cache-dir fastai jupyter matplotlib pandas scikit-learn polars</w:t>
+      </w:r>
+    </w:p>
+    <w:p>
+      <w:pPr>
+        <w:pStyle w:val="Normal"/>
+        <w:rPr>
+          <w:lang w:val="bg-BG" w:eastAsia="en-US" w:bidi="ar-SA"/>
+        </w:rPr>
+      </w:pPr>
+      <w:r>
+        <w:rPr>
+          <w:lang w:val="bg-BG" w:eastAsia="en-US" w:bidi="ar-SA"/>
+        </w:rPr>
+        <w:t>EXPOSE 8888</w:t>
+      </w:r>
+    </w:p>
+    <w:p>
+      <w:pPr>
+        <w:pStyle w:val="Normal"/>
+        <w:rPr>
+          <w:lang w:val="bg-BG" w:eastAsia="en-US" w:bidi="ar-SA"/>
+        </w:rPr>
+      </w:pPr>
+      <w:r>
+        <w:rPr>
+          <w:lang w:val="bg-BG" w:eastAsia="en-US" w:bidi="ar-SA"/>
+        </w:rPr>
+        <w:t>CMD ["jupyter", "lab", "--ip=0.0.0.0", "--port=8888", "--no-browser", "—allow-root"]</w:t>
+      </w:r>
+    </w:p>
+    <w:p>
+      <w:pPr>
+        <w:pStyle w:val="Normal"/>
+        <w:rPr>
+          <w:lang w:val="bg-BG" w:eastAsia="en-US" w:bidi="ar-SA"/>
+        </w:rPr>
+      </w:pPr>
+      <w:r>
+        <w:rPr>
+          <w:lang w:val="bg-BG" w:eastAsia="en-US" w:bidi="ar-SA"/>
+        </w:rPr>
+      </w:r>
+    </w:p>
+    <w:p>
+      <w:pPr>
+        <w:pStyle w:val="Normal"/>
+        <w:ind w:hanging="0" w:left="0"/>
+        <w:rPr>
+          <w:lang w:val="bg-BG" w:eastAsia="en-US" w:bidi="ar-SA"/>
+        </w:rPr>
+      </w:pPr>
+      <w:r>
+        <w:rPr>
+          <w:lang w:val="bg-BG" w:eastAsia="en-US" w:bidi="ar-SA"/>
+        </w:rPr>
+        <w:t xml:space="preserve">Директивата </w:t>
+      </w:r>
+      <w:r>
+        <w:rPr>
+          <w:lang w:val="en-US" w:eastAsia="en-US" w:bidi="ar-SA"/>
+        </w:rPr>
+        <w:t xml:space="preserve">FROM </w:t>
+      </w:r>
+    </w:p>
+    <w:p>
+      <w:pPr>
+        <w:pStyle w:val="Normal"/>
+        <w:rPr/>
+      </w:pPr>
+      <w:r>
+        <w:rPr>
+          <w:lang w:val="bg-BG" w:eastAsia="en-US" w:bidi="ar-SA"/>
+        </w:rPr>
+        <w:t xml:space="preserve">е базиран на образа „nvidia/cuda:12.1.1-runtime-ubuntu22.04“, като допълнително </w:t>
+      </w:r>
+      <w:r>
+        <w:rPr>
+          <w:lang w:val="bg-BG" w:eastAsia="en-US" w:bidi="ar-SA"/>
+        </w:rPr>
+        <w:t>задава работната</w:t>
+      </w:r>
+      <w:r>
+        <w:rPr>
+          <w:lang w:val="bg-BG" w:eastAsia="en-US" w:bidi="ar-SA"/>
+        </w:rPr>
+        <w:t xml:space="preserve"> дир</w:t>
+      </w:r>
+      <w:r>
+        <w:rPr>
+          <w:lang w:val="en-US" w:eastAsia="en-US" w:bidi="ar-SA"/>
+        </w:rPr>
+        <w:t>ектори</w:t>
+      </w:r>
+      <w:r>
+        <w:rPr>
+          <w:lang w:val="bg-BG" w:eastAsia="en-US" w:bidi="ar-SA"/>
+        </w:rPr>
+        <w:t>я „</w:t>
+      </w:r>
+      <w:r>
+        <w:rPr>
+          <w:lang w:val="en-US" w:eastAsia="en-US" w:bidi="ar-SA"/>
+        </w:rPr>
+        <w:t>workspace</w:t>
+      </w:r>
+      <w:r>
+        <w:rPr>
+          <w:lang w:val="bg-BG" w:eastAsia="en-US" w:bidi="ar-SA"/>
+        </w:rPr>
+        <w:t xml:space="preserve">“; </w:t>
+      </w:r>
+      <w:r>
+        <w:rPr>
+          <w:lang w:val="bg-BG" w:eastAsia="en-US" w:bidi="ar-SA"/>
+        </w:rPr>
+        <w:t>обновява всички зависимости от основния образ; инсталира</w:t>
+      </w:r>
+      <w:r>
+        <w:rPr>
+          <w:lang w:val="en-US" w:eastAsia="en-US" w:bidi="ar-SA"/>
+        </w:rPr>
+        <w:t xml:space="preserve"> pip</w:t>
+      </w:r>
+      <w:r>
+        <w:rPr>
+          <w:lang w:val="bg-BG" w:eastAsia="en-US" w:bidi="ar-SA"/>
+        </w:rPr>
+        <w:t xml:space="preserve"> и</w:t>
+      </w:r>
+      <w:r>
+        <w:rPr>
+          <w:lang w:val="bg-BG" w:eastAsia="en-US" w:bidi="ar-SA"/>
+        </w:rPr>
+        <w:t xml:space="preserve"> </w:t>
+      </w:r>
+      <w:r>
+        <w:rPr>
+          <w:lang w:val="en-US" w:eastAsia="en-US" w:bidi="ar-SA"/>
+        </w:rPr>
+        <w:t xml:space="preserve">git; </w:t>
+      </w:r>
+      <w:r>
+        <w:rPr>
+          <w:lang w:val="bg-BG" w:eastAsia="en-US" w:bidi="ar-SA"/>
+        </w:rPr>
+        <w:t xml:space="preserve">изтрива всички временни файлове с цел намаляване големината на образа. След като </w:t>
+      </w:r>
+      <w:r>
+        <w:rPr>
+          <w:lang w:val="en-US" w:eastAsia="en-US" w:bidi="ar-SA"/>
+        </w:rPr>
+        <w:t xml:space="preserve">pip </w:t>
+      </w:r>
+      <w:r>
+        <w:rPr>
+          <w:lang w:val="bg-BG" w:eastAsia="en-US" w:bidi="ar-SA"/>
+        </w:rPr>
+        <w:t xml:space="preserve">е вече инсталиран, се инсталират всички нужни библиотеки а именно: fastai, jupyter, matplotlib, pandas, scikit-learn, polars. </w:t>
+        <w:br/>
+      </w:r>
+    </w:p>
+    <w:p>
+      <w:pPr>
+        <w:pStyle w:val="Normal"/>
+        <w:rPr/>
+      </w:pPr>
+      <w:r>
+        <w:rPr/>
+        <w:t xml:space="preserve">Директивата </w:t>
+      </w:r>
+      <w:r>
+        <w:rPr>
+          <w:rStyle w:val="SourceText"/>
+        </w:rPr>
+        <w:t>EXPOSE 8888</w:t>
+      </w:r>
+      <w:r>
+        <w:rPr/>
+        <w:t xml:space="preserve"> указва, че приложението в контейнера слуша на порт 8888. Тя има информативен характер и не публикува автоматично порта към хост системата. </w:t>
+      </w:r>
+    </w:p>
+    <w:p>
+      <w:pPr>
+        <w:pStyle w:val="Normal"/>
+        <w:rPr/>
+      </w:pPr>
+      <w:r>
+        <w:rPr/>
+      </w:r>
+    </w:p>
+    <w:p>
+      <w:pPr>
+        <w:pStyle w:val="Normal"/>
+        <w:rPr/>
+      </w:pPr>
+      <w:r>
+        <w:rPr/>
+        <w:t xml:space="preserve">Директивата </w:t>
+      </w:r>
+      <w:r>
+        <w:rPr>
+          <w:rStyle w:val="SourceText"/>
+        </w:rPr>
+        <w:t>CMD</w:t>
+      </w:r>
+      <w:r>
+        <w:rPr/>
+        <w:t xml:space="preserve"> дефинира командата по подразбиране, която се изпълнява при стартиране на контейнера. В конкретния случай се стартира JupyterLab сървър, който се свързва към всички мрежови интерфейси в контейнера (</w:t>
+      </w:r>
+      <w:r>
+        <w:rPr>
+          <w:rStyle w:val="SourceText"/>
+        </w:rPr>
+        <w:t>0.0.0.0</w:t>
+      </w:r>
+      <w:r>
+        <w:rPr/>
+        <w:t xml:space="preserve">) и използва порт 8888. Опцията </w:t>
+      </w:r>
+      <w:r>
+        <w:rPr>
+          <w:rStyle w:val="SourceText"/>
+        </w:rPr>
+        <w:t>--no-browser</w:t>
+      </w:r>
+      <w:r>
+        <w:rPr/>
+        <w:t xml:space="preserve"> предотвратява автоматичното отваряне на браузър, а </w:t>
+      </w:r>
+      <w:r>
+        <w:rPr>
+          <w:rStyle w:val="SourceText"/>
+        </w:rPr>
+        <w:t>--allow-root</w:t>
+      </w:r>
+      <w:r>
+        <w:rPr/>
+        <w:t xml:space="preserve"> позволява изпълнение с административни права. </w:t>
+      </w:r>
+      <w:r>
+        <w:br w:type="page"/>
       </w:r>
     </w:p>
     <w:p>
@@ -2944,17 +4156,177 @@
         <w:pStyle w:val="ListParagraph"/>
         <w:numPr>
           <w:ilvl w:val="0"/>
-          <w:numId w:val="5"/>
+          <w:numId w:val="4"/>
         </w:numPr>
-        <w:rPr>
-          <w:lang w:val="bg-BG" w:eastAsia="en-US" w:bidi="ar-SA"/>
-        </w:rPr>
-      </w:pPr>
-      <w:r>
-        <w:rPr>
-          <w:lang w:val="bg-BG" w:eastAsia="en-US" w:bidi="ar-SA"/>
-        </w:rPr>
-        <w:t>Машинно обучение</w:t>
+        <w:overflowPunct w:val="false"/>
+        <w:spacing w:lineRule="auto" w:line="276" w:before="0" w:after="0"/>
+        <w:ind w:hanging="357" w:left="357"/>
+        <w:contextualSpacing/>
+        <w:outlineLvl w:val="0"/>
+        <w:rPr>
+          <w:b/>
+          <w:bCs/>
+          <w:sz w:val="32"/>
+          <w:szCs w:val="28"/>
+          <w:lang w:val="bg-BG" w:eastAsia="en-US" w:bidi="ar-SA"/>
+        </w:rPr>
+      </w:pPr>
+      <w:bookmarkStart w:id="15" w:name="__RefHeading___Toc5688_4158184810"/>
+      <w:bookmarkEnd w:id="15"/>
+      <w:r>
+        <w:rPr>
+          <w:b/>
+          <w:bCs/>
+          <w:sz w:val="32"/>
+          <w:szCs w:val="32"/>
+          <w:lang w:val="bg-BG" w:eastAsia="en-US" w:bidi="ar-SA"/>
+        </w:rPr>
+        <w:t>Създаване и обучение на модела</w:t>
+      </w:r>
+    </w:p>
+    <w:p>
+      <w:pPr>
+        <w:pStyle w:val="ListParagraph"/>
+        <w:numPr>
+          <w:ilvl w:val="1"/>
+          <w:numId w:val="4"/>
+        </w:numPr>
+        <w:overflowPunct w:val="false"/>
+        <w:spacing w:lineRule="auto" w:line="276" w:before="0" w:after="0"/>
+        <w:ind w:hanging="357" w:left="357"/>
+        <w:contextualSpacing/>
+        <w:outlineLvl w:val="0"/>
+        <w:rPr>
+          <w:b/>
+          <w:bCs/>
+          <w:sz w:val="32"/>
+          <w:szCs w:val="28"/>
+          <w:lang w:val="bg-BG" w:eastAsia="en-US" w:bidi="ar-SA"/>
+        </w:rPr>
+      </w:pPr>
+      <w:bookmarkStart w:id="16" w:name="__RefHeading___Toc967_4158184810"/>
+      <w:bookmarkEnd w:id="16"/>
+      <w:r>
+        <w:rPr>
+          <w:b/>
+          <w:bCs/>
+          <w:sz w:val="32"/>
+          <w:szCs w:val="32"/>
+          <w:lang w:val="bg-BG" w:eastAsia="en-US" w:bidi="ar-SA"/>
+        </w:rPr>
+        <w:t>Предварителна о</w:t>
+      </w:r>
+      <w:r>
+        <w:rPr>
+          <w:b/>
+          <w:bCs/>
+          <w:sz w:val="32"/>
+          <w:szCs w:val="32"/>
+          <w:lang w:val="bg-BG" w:eastAsia="en-US" w:bidi="ar-SA"/>
+        </w:rPr>
+        <w:t>бработка на данните</w:t>
+      </w:r>
+    </w:p>
+    <w:p>
+      <w:pPr>
+        <w:pStyle w:val="ListParagraph"/>
+        <w:numPr>
+          <w:ilvl w:val="1"/>
+          <w:numId w:val="4"/>
+        </w:numPr>
+        <w:overflowPunct w:val="false"/>
+        <w:spacing w:lineRule="auto" w:line="276" w:before="0" w:after="0"/>
+        <w:ind w:hanging="357" w:left="357"/>
+        <w:contextualSpacing/>
+        <w:outlineLvl w:val="0"/>
+        <w:rPr>
+          <w:b/>
+          <w:bCs/>
+          <w:sz w:val="32"/>
+          <w:szCs w:val="28"/>
+          <w:lang w:val="bg-BG" w:eastAsia="en-US" w:bidi="ar-SA"/>
+        </w:rPr>
+      </w:pPr>
+      <w:bookmarkStart w:id="17" w:name="__RefHeading___Toc5690_4158184810"/>
+      <w:bookmarkEnd w:id="17"/>
+      <w:r>
+        <w:rPr>
+          <w:b/>
+          <w:bCs/>
+          <w:sz w:val="32"/>
+          <w:szCs w:val="32"/>
+          <w:lang w:val="bg-BG" w:eastAsia="en-US" w:bidi="ar-SA"/>
+        </w:rPr>
+        <w:t>Избор на модел за машинно обучение</w:t>
+      </w:r>
+    </w:p>
+    <w:p>
+      <w:pPr>
+        <w:pStyle w:val="ListParagraph"/>
+        <w:numPr>
+          <w:ilvl w:val="1"/>
+          <w:numId w:val="4"/>
+        </w:numPr>
+        <w:overflowPunct w:val="false"/>
+        <w:spacing w:lineRule="auto" w:line="276" w:before="0" w:after="0"/>
+        <w:ind w:hanging="357" w:left="357"/>
+        <w:contextualSpacing/>
+        <w:outlineLvl w:val="0"/>
+        <w:rPr>
+          <w:b/>
+          <w:bCs/>
+          <w:sz w:val="32"/>
+          <w:szCs w:val="28"/>
+          <w:lang w:val="bg-BG" w:eastAsia="en-US" w:bidi="ar-SA"/>
+        </w:rPr>
+      </w:pPr>
+      <w:bookmarkStart w:id="18" w:name="__RefHeading___Toc5692_4158184810"/>
+      <w:bookmarkEnd w:id="18"/>
+      <w:r>
+        <w:rPr>
+          <w:b/>
+          <w:bCs/>
+          <w:sz w:val="32"/>
+          <w:szCs w:val="32"/>
+          <w:lang w:val="bg-BG" w:eastAsia="en-US" w:bidi="ar-SA"/>
+        </w:rPr>
+        <w:t>Методология на обучението</w:t>
+      </w:r>
+    </w:p>
+    <w:p>
+      <w:pPr>
+        <w:pStyle w:val="ListParagraph"/>
+        <w:widowControl/>
+        <w:numPr>
+          <w:ilvl w:val="0"/>
+          <w:numId w:val="0"/>
+        </w:numPr>
+        <w:suppressAutoHyphens w:val="true"/>
+        <w:overflowPunct w:val="false"/>
+        <w:spacing w:lineRule="auto" w:line="276" w:before="0" w:after="0"/>
+        <w:ind w:hanging="357" w:left="357"/>
+        <w:contextualSpacing/>
+        <w:jc w:val="left"/>
+        <w:outlineLvl w:val="0"/>
+        <w:rPr>
+          <w:b/>
+          <w:bCs/>
+          <w:sz w:val="32"/>
+          <w:szCs w:val="28"/>
+          <w:lang w:val="bg-BG" w:eastAsia="en-US" w:bidi="ar-SA"/>
+        </w:rPr>
+      </w:pPr>
+      <w:r>
+        <w:rPr>
+          <w:b/>
+          <w:bCs/>
+          <w:sz w:val="32"/>
+          <w:szCs w:val="32"/>
+          <w:lang w:val="bg-BG" w:eastAsia="en-US" w:bidi="ar-SA"/>
+        </w:rPr>
+      </w:r>
+      <w:r>
+        <w:br w:type="page"/>
       </w:r>
     </w:p>
     <w:p>
@@ -2962,17 +4334,75 @@
         <w:pStyle w:val="ListParagraph"/>
         <w:numPr>
           <w:ilvl w:val="0"/>
-          <w:numId w:val="5"/>
+          <w:numId w:val="4"/>
         </w:numPr>
-        <w:rPr>
-          <w:lang w:val="bg-BG" w:eastAsia="en-US" w:bidi="ar-SA"/>
-        </w:rPr>
-      </w:pPr>
-      <w:r>
-        <w:rPr>
-          <w:lang w:val="bg-BG" w:eastAsia="en-US" w:bidi="ar-SA"/>
-        </w:rPr>
-        <w:t>Transfer learning</w:t>
+        <w:overflowPunct w:val="false"/>
+        <w:spacing w:lineRule="auto" w:line="276" w:before="0" w:after="0"/>
+        <w:ind w:hanging="357" w:left="357"/>
+        <w:contextualSpacing/>
+        <w:outlineLvl w:val="0"/>
+        <w:rPr>
+          <w:b/>
+          <w:bCs/>
+          <w:sz w:val="32"/>
+          <w:szCs w:val="32"/>
+          <w:lang w:val="bg-BG" w:eastAsia="en-US" w:bidi="ar-SA"/>
+        </w:rPr>
+      </w:pPr>
+      <w:bookmarkStart w:id="19" w:name="__RefHeading___Toc10518_4158184810"/>
+      <w:bookmarkEnd w:id="19"/>
+      <w:r>
+        <w:rPr>
+          <w:b/>
+          <w:bCs/>
+          <w:sz w:val="32"/>
+          <w:szCs w:val="32"/>
+          <w:lang w:val="bg-BG" w:eastAsia="en-US" w:bidi="ar-SA"/>
+        </w:rPr>
+        <w:t xml:space="preserve">Сравнение между </w:t>
+      </w:r>
+      <w:r>
+        <w:rPr>
+          <w:b/>
+          <w:bCs/>
+          <w:sz w:val="32"/>
+          <w:szCs w:val="32"/>
+          <w:lang w:val="en-US" w:eastAsia="en-US" w:bidi="ar-SA"/>
+        </w:rPr>
+        <w:t xml:space="preserve">CNN </w:t>
+      </w:r>
+      <w:r>
+        <w:rPr>
+          <w:b/>
+          <w:bCs/>
+          <w:sz w:val="32"/>
+          <w:szCs w:val="32"/>
+          <w:lang w:val="bg-BG" w:eastAsia="en-US" w:bidi="ar-SA"/>
+        </w:rPr>
+        <w:t xml:space="preserve">и </w:t>
+      </w:r>
+      <w:r>
+        <w:rPr>
+          <w:b/>
+          <w:bCs/>
+          <w:sz w:val="32"/>
+          <w:szCs w:val="32"/>
+          <w:lang w:val="en-US" w:eastAsia="en-US" w:bidi="ar-SA"/>
+        </w:rPr>
+        <w:t xml:space="preserve">Transformer </w:t>
+      </w:r>
+      <w:r>
+        <w:rPr>
+          <w:b/>
+          <w:bCs/>
+          <w:sz w:val="32"/>
+          <w:szCs w:val="32"/>
+          <w:lang w:val="bg-BG" w:eastAsia="en-US" w:bidi="ar-SA"/>
+        </w:rPr>
+        <w:t>модел</w:t>
+      </w:r>
+      <w:r>
+        <w:br w:type="page"/>
       </w:r>
     </w:p>
     <w:p>
@@ -2980,17 +4410,68 @@
         <w:pStyle w:val="ListParagraph"/>
         <w:numPr>
           <w:ilvl w:val="0"/>
-          <w:numId w:val="5"/>
+          <w:numId w:val="4"/>
         </w:numPr>
-        <w:rPr>
-          <w:lang w:val="bg-BG" w:eastAsia="en-US" w:bidi="ar-SA"/>
-        </w:rPr>
-      </w:pPr>
-      <w:r>
-        <w:rPr>
-          <w:lang w:val="bg-BG" w:eastAsia="en-US" w:bidi="ar-SA"/>
-        </w:rPr>
-        <w:t>Общи работи за модела/моделите</w:t>
+        <w:overflowPunct w:val="false"/>
+        <w:spacing w:lineRule="auto" w:line="276" w:before="0" w:after="0"/>
+        <w:ind w:hanging="357" w:left="357"/>
+        <w:contextualSpacing/>
+        <w:outlineLvl w:val="0"/>
+        <w:rPr>
+          <w:b/>
+          <w:bCs/>
+          <w:sz w:val="32"/>
+          <w:szCs w:val="32"/>
+          <w:lang w:val="bg-BG" w:eastAsia="en-US" w:bidi="ar-SA"/>
+        </w:rPr>
+      </w:pPr>
+      <w:bookmarkStart w:id="20" w:name="__RefHeading___Toc10520_4158184810"/>
+      <w:bookmarkEnd w:id="20"/>
+      <w:r>
+        <w:rPr>
+          <w:b/>
+          <w:bCs/>
+          <w:sz w:val="32"/>
+          <w:szCs w:val="32"/>
+          <w:lang w:val="bg-BG" w:eastAsia="en-US" w:bidi="ar-SA"/>
+        </w:rPr>
+        <w:t>Резултати при различна продължителност на записите</w:t>
+      </w:r>
+    </w:p>
+    <w:p>
+      <w:pPr>
+        <w:pStyle w:val="ListParagraph"/>
+        <w:widowControl/>
+        <w:numPr>
+          <w:ilvl w:val="0"/>
+          <w:numId w:val="0"/>
+        </w:numPr>
+        <w:suppressAutoHyphens w:val="true"/>
+        <w:overflowPunct w:val="false"/>
+        <w:spacing w:lineRule="auto" w:line="276" w:before="0" w:after="0"/>
+        <w:ind w:hanging="357" w:left="357"/>
+        <w:contextualSpacing/>
+        <w:jc w:val="left"/>
+        <w:outlineLvl w:val="0"/>
+        <w:rPr>
+          <w:b/>
+          <w:bCs/>
+          <w:sz w:val="32"/>
+          <w:szCs w:val="28"/>
+          <w:lang w:val="bg-BG" w:eastAsia="en-US" w:bidi="ar-SA"/>
+        </w:rPr>
+      </w:pPr>
+      <w:r>
+        <w:rPr>
+          <w:b/>
+          <w:bCs/>
+          <w:sz w:val="32"/>
+          <w:szCs w:val="32"/>
+          <w:lang w:val="bg-BG" w:eastAsia="en-US" w:bidi="ar-SA"/>
+        </w:rPr>
+      </w:r>
+      <w:r>
+        <w:br w:type="page"/>
       </w:r>
     </w:p>
     <w:p>
@@ -2998,17 +4479,68 @@
         <w:pStyle w:val="ListParagraph"/>
         <w:numPr>
           <w:ilvl w:val="0"/>
-          <w:numId w:val="5"/>
+          <w:numId w:val="4"/>
         </w:numPr>
-        <w:rPr>
-          <w:lang w:val="bg-BG" w:eastAsia="en-US" w:bidi="ar-SA"/>
-        </w:rPr>
-      </w:pPr>
-      <w:r>
-        <w:rPr>
-          <w:lang w:val="bg-BG" w:eastAsia="en-US" w:bidi="ar-SA"/>
-        </w:rPr>
-        <w:t>Computer vision</w:t>
+        <w:overflowPunct w:val="false"/>
+        <w:spacing w:lineRule="auto" w:line="276" w:before="0" w:after="0"/>
+        <w:ind w:hanging="357" w:left="357"/>
+        <w:contextualSpacing/>
+        <w:outlineLvl w:val="0"/>
+        <w:rPr>
+          <w:b/>
+          <w:bCs/>
+          <w:sz w:val="32"/>
+          <w:szCs w:val="28"/>
+          <w:lang w:val="bg-BG" w:eastAsia="en-US" w:bidi="ar-SA"/>
+        </w:rPr>
+      </w:pPr>
+      <w:bookmarkStart w:id="21" w:name="__RefHeading___Toc5694_4158184810"/>
+      <w:bookmarkEnd w:id="21"/>
+      <w:r>
+        <w:rPr>
+          <w:b/>
+          <w:bCs/>
+          <w:sz w:val="32"/>
+          <w:szCs w:val="32"/>
+          <w:lang w:val="bg-BG" w:eastAsia="en-US" w:bidi="ar-SA"/>
+        </w:rPr>
+        <w:t>Основни резултати</w:t>
+      </w:r>
+    </w:p>
+    <w:p>
+      <w:pPr>
+        <w:pStyle w:val="ListParagraph"/>
+        <w:widowControl/>
+        <w:numPr>
+          <w:ilvl w:val="0"/>
+          <w:numId w:val="0"/>
+        </w:numPr>
+        <w:suppressAutoHyphens w:val="true"/>
+        <w:overflowPunct w:val="false"/>
+        <w:spacing w:lineRule="auto" w:line="276" w:before="0" w:after="0"/>
+        <w:ind w:hanging="357" w:left="357"/>
+        <w:contextualSpacing/>
+        <w:jc w:val="left"/>
+        <w:outlineLvl w:val="0"/>
+        <w:rPr>
+          <w:b/>
+          <w:bCs/>
+          <w:sz w:val="32"/>
+          <w:szCs w:val="28"/>
+          <w:lang w:val="bg-BG" w:eastAsia="en-US" w:bidi="ar-SA"/>
+        </w:rPr>
+      </w:pPr>
+      <w:r>
+        <w:rPr>
+          <w:b/>
+          <w:bCs/>
+          <w:sz w:val="32"/>
+          <w:szCs w:val="32"/>
+          <w:lang w:val="bg-BG" w:eastAsia="en-US" w:bidi="ar-SA"/>
+        </w:rPr>
+      </w:r>
+      <w:r>
+        <w:br w:type="page"/>
       </w:r>
     </w:p>
     <w:p>
@@ -3016,19 +4548,161 @@
         <w:pStyle w:val="ListParagraph"/>
         <w:numPr>
           <w:ilvl w:val="0"/>
-          <w:numId w:val="5"/>
+          <w:numId w:val="4"/>
         </w:numPr>
-        <w:spacing w:before="0" w:after="120"/>
+        <w:overflowPunct w:val="false"/>
+        <w:spacing w:lineRule="auto" w:line="276" w:before="0" w:after="0"/>
+        <w:ind w:hanging="357" w:left="357"/>
         <w:contextualSpacing/>
-        <w:rPr>
-          <w:lang w:val="bg-BG" w:eastAsia="en-US" w:bidi="ar-SA"/>
-        </w:rPr>
-      </w:pPr>
-      <w:r>
-        <w:rPr>
-          <w:lang w:val="bg-BG" w:eastAsia="en-US" w:bidi="ar-SA"/>
-        </w:rPr>
-        <w:t>Какво е landmarks, MediaPipe</w:t>
+        <w:outlineLvl w:val="0"/>
+        <w:rPr>
+          <w:b/>
+          <w:bCs/>
+          <w:sz w:val="32"/>
+          <w:szCs w:val="28"/>
+          <w:lang w:val="bg-BG" w:eastAsia="en-US" w:bidi="ar-SA"/>
+        </w:rPr>
+      </w:pPr>
+      <w:bookmarkStart w:id="22" w:name="__RefHeading___Toc5696_4158184810"/>
+      <w:bookmarkEnd w:id="22"/>
+      <w:r>
+        <w:rPr>
+          <w:b/>
+          <w:bCs/>
+          <w:sz w:val="32"/>
+          <w:szCs w:val="32"/>
+          <w:lang w:val="bg-BG" w:eastAsia="en-US" w:bidi="ar-SA"/>
+        </w:rPr>
+        <w:t>Изводи и препоръки</w:t>
+      </w:r>
+    </w:p>
+    <w:p>
+      <w:pPr>
+        <w:pStyle w:val="ListParagraph"/>
+        <w:widowControl/>
+        <w:numPr>
+          <w:ilvl w:val="0"/>
+          <w:numId w:val="0"/>
+        </w:numPr>
+        <w:suppressAutoHyphens w:val="true"/>
+        <w:overflowPunct w:val="false"/>
+        <w:spacing w:lineRule="auto" w:line="276" w:before="0" w:after="0"/>
+        <w:ind w:hanging="357" w:left="357"/>
+        <w:contextualSpacing/>
+        <w:jc w:val="left"/>
+        <w:outlineLvl w:val="0"/>
+        <w:rPr>
+          <w:b/>
+          <w:bCs/>
+          <w:sz w:val="32"/>
+          <w:szCs w:val="28"/>
+          <w:lang w:val="bg-BG" w:eastAsia="en-US" w:bidi="ar-SA"/>
+        </w:rPr>
+      </w:pPr>
+      <w:r>
+        <w:rPr>
+          <w:b/>
+          <w:bCs/>
+          <w:sz w:val="32"/>
+          <w:szCs w:val="32"/>
+          <w:lang w:val="bg-BG" w:eastAsia="en-US" w:bidi="ar-SA"/>
+        </w:rPr>
+      </w:r>
+      <w:r>
+        <w:br w:type="page"/>
+      </w:r>
+    </w:p>
+    <w:p>
+      <w:pPr>
+        <w:pStyle w:val="ListParagraph"/>
+        <w:numPr>
+          <w:ilvl w:val="0"/>
+          <w:numId w:val="4"/>
+        </w:numPr>
+        <w:overflowPunct w:val="false"/>
+        <w:spacing w:lineRule="auto" w:line="276" w:before="0" w:after="0"/>
+        <w:ind w:hanging="357" w:left="357"/>
+        <w:contextualSpacing/>
+        <w:outlineLvl w:val="0"/>
+        <w:rPr>
+          <w:b/>
+          <w:bCs/>
+          <w:sz w:val="32"/>
+          <w:szCs w:val="28"/>
+          <w:lang w:val="bg-BG" w:eastAsia="en-US" w:bidi="ar-SA"/>
+        </w:rPr>
+      </w:pPr>
+      <w:bookmarkStart w:id="23" w:name="__RefHeading___Toc2749_4158184810"/>
+      <w:bookmarkEnd w:id="23"/>
+      <w:r>
+        <w:rPr>
+          <w:b/>
+          <w:bCs/>
+          <w:sz w:val="32"/>
+          <w:szCs w:val="32"/>
+          <w:lang w:val="bg-BG" w:eastAsia="en-US" w:bidi="ar-SA"/>
+        </w:rPr>
+        <w:t>Използвана литература</w:t>
+      </w:r>
+    </w:p>
+    <w:p>
+      <w:pPr>
+        <w:pStyle w:val="Normal"/>
+        <w:rPr>
+          <w:lang w:val="bg-BG" w:eastAsia="en-US" w:bidi="ar-SA"/>
+        </w:rPr>
+      </w:pPr>
+      <w:r>
+        <w:rPr>
+          <w:lang w:val="bg-BG" w:eastAsia="en-US" w:bidi="ar-SA"/>
+        </w:rPr>
+        <w:t xml:space="preserve">7. Архитектура на системата и отдалечен достъп </w:t>
+      </w:r>
+    </w:p>
+    <w:p>
+      <w:pPr>
+        <w:pStyle w:val="Normal"/>
+        <w:rPr/>
+      </w:pPr>
+      <w:r>
+        <w:rPr/>
+        <w:t xml:space="preserve">[1] </w:t>
+      </w:r>
+      <w:r>
+        <w:br w:type="page"/>
+      </w:r>
+    </w:p>
+    <w:p>
+      <w:pPr>
+        <w:pStyle w:val="ListParagraph"/>
+        <w:numPr>
+          <w:ilvl w:val="0"/>
+          <w:numId w:val="4"/>
+        </w:numPr>
+        <w:overflowPunct w:val="false"/>
+        <w:spacing w:lineRule="auto" w:line="276" w:before="0" w:after="0"/>
+        <w:ind w:hanging="357" w:left="357"/>
+        <w:contextualSpacing/>
+        <w:outlineLvl w:val="0"/>
+        <w:rPr>
+          <w:b/>
+          <w:bCs/>
+          <w:sz w:val="32"/>
+          <w:szCs w:val="28"/>
+          <w:lang w:val="bg-BG" w:eastAsia="en-US" w:bidi="ar-SA"/>
+        </w:rPr>
+      </w:pPr>
+      <w:bookmarkStart w:id="24" w:name="__RefHeading___Toc971_4158184810"/>
+      <w:bookmarkEnd w:id="24"/>
+      <w:r>
+        <w:rPr>
+          <w:b/>
+          <w:bCs/>
+          <w:sz w:val="32"/>
+          <w:szCs w:val="32"/>
+          <w:lang w:val="bg-BG" w:eastAsia="en-US" w:bidi="ar-SA"/>
+        </w:rPr>
+        <w:t>Приложения</w:t>
       </w:r>
     </w:p>
     <w:sectPr>
@@ -3051,7 +4725,7 @@
       <w:start w:val="1"/>
       <w:numFmt w:val="none"/>
       <w:suff w:val="nothing"/>
-      <w:lvlText w:val="%1"/>
+      <w:lvlText w:val=""/>
       <w:lvlJc w:val="left"/>
       <w:pPr>
         <w:tabs>
@@ -3064,7 +4738,7 @@
       <w:start w:val="1"/>
       <w:numFmt w:val="none"/>
       <w:suff w:val="nothing"/>
-      <w:lvlText w:val="%2"/>
+      <w:lvlText w:val=""/>
       <w:lvlJc w:val="left"/>
       <w:pPr>
         <w:tabs>
@@ -3077,7 +4751,7 @@
       <w:start w:val="1"/>
       <w:numFmt w:val="none"/>
       <w:suff w:val="nothing"/>
-      <w:lvlText w:val="%3"/>
+      <w:lvlText w:val=""/>
       <w:lvlJc w:val="left"/>
       <w:pPr>
         <w:tabs>
@@ -3090,7 +4764,7 @@
       <w:start w:val="1"/>
       <w:numFmt w:val="none"/>
       <w:suff w:val="nothing"/>
-      <w:lvlText w:val="%4"/>
+      <w:lvlText w:val=""/>
       <w:lvlJc w:val="left"/>
       <w:pPr>
         <w:tabs>
@@ -3103,7 +4777,7 @@
       <w:start w:val="1"/>
       <w:numFmt w:val="none"/>
       <w:suff w:val="nothing"/>
-      <w:lvlText w:val="%5"/>
+      <w:lvlText w:val=""/>
       <w:lvlJc w:val="left"/>
       <w:pPr>
         <w:tabs>
@@ -3116,7 +4790,7 @@
       <w:start w:val="1"/>
       <w:numFmt w:val="none"/>
       <w:suff w:val="nothing"/>
-      <w:lvlText w:val="%6"/>
+      <w:lvlText w:val=""/>
       <w:lvlJc w:val="left"/>
       <w:pPr>
         <w:tabs>
@@ -3129,7 +4803,7 @@
       <w:start w:val="1"/>
       <w:numFmt w:val="none"/>
       <w:suff w:val="nothing"/>
-      <w:lvlText w:val="%7"/>
+      <w:lvlText w:val=""/>
       <w:lvlJc w:val="left"/>
       <w:pPr>
         <w:tabs>
@@ -3142,7 +4816,7 @@
       <w:start w:val="1"/>
       <w:numFmt w:val="none"/>
       <w:suff w:val="nothing"/>
-      <w:lvlText w:val="%8"/>
+      <w:lvlText w:val=""/>
       <w:lvlJc w:val="left"/>
       <w:pPr>
         <w:tabs>
@@ -3155,7 +4829,7 @@
       <w:start w:val="1"/>
       <w:numFmt w:val="none"/>
       <w:suff w:val="nothing"/>
-      <w:lvlText w:val="%9"/>
+      <w:lvlText w:val=""/>
       <w:lvlJc w:val="left"/>
       <w:pPr>
         <w:tabs>
@@ -3431,7 +5105,7 @@
       <w:lvlJc w:val="left"/>
       <w:pPr>
         <w:tabs>
-          <w:tab w:val="num" w:pos="0"/>
+          <w:tab w:val="num" w:pos="720"/>
         </w:tabs>
         <w:ind w:left="720" w:hanging="360"/>
       </w:pPr>
@@ -3439,247 +5113,110 @@
     </w:lvl>
     <w:lvl w:ilvl="1">
       <w:start w:val="1"/>
-      <w:numFmt w:val="lowerLetter"/>
-      <w:lvlText w:val="%2."/>
-      <w:lvlJc w:val="left"/>
-      <w:pPr>
-        <w:tabs>
-          <w:tab w:val="num" w:pos="0"/>
+      <w:numFmt w:val="decimal"/>
+      <w:lvlText w:val="%1.%2."/>
+      <w:lvlJc w:val="left"/>
+      <w:pPr>
+        <w:tabs>
+          <w:tab w:val="num" w:pos="1080"/>
+        </w:tabs>
+        <w:ind w:left="1080" w:hanging="360"/>
+      </w:pPr>
+      <w:rPr/>
+    </w:lvl>
+    <w:lvl w:ilvl="2">
+      <w:start w:val="1"/>
+      <w:numFmt w:val="decimal"/>
+      <w:lvlText w:val="%1.%2.%3."/>
+      <w:lvlJc w:val="left"/>
+      <w:pPr>
+        <w:tabs>
+          <w:tab w:val="num" w:pos="1440"/>
         </w:tabs>
         <w:ind w:left="1440" w:hanging="360"/>
       </w:pPr>
       <w:rPr/>
     </w:lvl>
-    <w:lvl w:ilvl="2">
-      <w:start w:val="1"/>
-      <w:numFmt w:val="lowerRoman"/>
-      <w:lvlText w:val="%3."/>
-      <w:lvlJc w:val="right"/>
-      <w:pPr>
-        <w:tabs>
-          <w:tab w:val="num" w:pos="0"/>
-        </w:tabs>
-        <w:ind w:left="2160" w:hanging="180"/>
+    <w:lvl w:ilvl="3">
+      <w:start w:val="1"/>
+      <w:numFmt w:val="decimal"/>
+      <w:lvlText w:val="%1.%2.%3.%4."/>
+      <w:lvlJc w:val="left"/>
+      <w:pPr>
+        <w:tabs>
+          <w:tab w:val="num" w:pos="1800"/>
+        </w:tabs>
+        <w:ind w:left="1800" w:hanging="360"/>
       </w:pPr>
       <w:rPr/>
     </w:lvl>
-    <w:lvl w:ilvl="3">
+    <w:lvl w:ilvl="4">
       <w:start w:val="1"/>
       <w:numFmt w:val="decimal"/>
-      <w:lvlText w:val="%4."/>
-      <w:lvlJc w:val="left"/>
-      <w:pPr>
-        <w:tabs>
-          <w:tab w:val="num" w:pos="0"/>
+      <w:lvlText w:val="%1.%2.%3.%4.%5."/>
+      <w:lvlJc w:val="left"/>
+      <w:pPr>
+        <w:tabs>
+          <w:tab w:val="num" w:pos="2160"/>
+        </w:tabs>
+        <w:ind w:left="2160" w:hanging="360"/>
+      </w:pPr>
+      <w:rPr/>
+    </w:lvl>
+    <w:lvl w:ilvl="5">
+      <w:start w:val="1"/>
+      <w:numFmt w:val="decimal"/>
+      <w:lvlText w:val="%1.%2.%3.%4.%5.%6."/>
+      <w:lvlJc w:val="left"/>
+      <w:pPr>
+        <w:tabs>
+          <w:tab w:val="num" w:pos="2520"/>
+        </w:tabs>
+        <w:ind w:left="2520" w:hanging="360"/>
+      </w:pPr>
+      <w:rPr/>
+    </w:lvl>
+    <w:lvl w:ilvl="6">
+      <w:start w:val="1"/>
+      <w:numFmt w:val="decimal"/>
+      <w:lvlText w:val="%1.%2.%3.%4.%5.%6.%7."/>
+      <w:lvlJc w:val="left"/>
+      <w:pPr>
+        <w:tabs>
+          <w:tab w:val="num" w:pos="2880"/>
         </w:tabs>
         <w:ind w:left="2880" w:hanging="360"/>
       </w:pPr>
       <w:rPr/>
     </w:lvl>
-    <w:lvl w:ilvl="4">
-      <w:start w:val="1"/>
-      <w:numFmt w:val="lowerLetter"/>
-      <w:lvlText w:val="%5."/>
-      <w:lvlJc w:val="left"/>
-      <w:pPr>
-        <w:tabs>
-          <w:tab w:val="num" w:pos="0"/>
+    <w:lvl w:ilvl="7">
+      <w:start w:val="1"/>
+      <w:numFmt w:val="decimal"/>
+      <w:lvlText w:val="%1.%2.%3.%4.%5.%6.%7.%8."/>
+      <w:lvlJc w:val="left"/>
+      <w:pPr>
+        <w:tabs>
+          <w:tab w:val="num" w:pos="3240"/>
+        </w:tabs>
+        <w:ind w:left="3240" w:hanging="360"/>
+      </w:pPr>
+      <w:rPr/>
+    </w:lvl>
+    <w:lvl w:ilvl="8">
+      <w:start w:val="1"/>
+      <w:numFmt w:val="decimal"/>
+      <w:lvlText w:val="%1.%2.%3.%4.%5.%6.%7.%8.%9."/>
+      <w:lvlJc w:val="left"/>
+      <w:pPr>
+        <w:tabs>
+          <w:tab w:val="num" w:pos="3600"/>
         </w:tabs>
         <w:ind w:left="3600" w:hanging="360"/>
-      </w:pPr>
-      <w:rPr/>
-    </w:lvl>
-    <w:lvl w:ilvl="5">
-      <w:start w:val="1"/>
-      <w:numFmt w:val="lowerRoman"/>
-      <w:lvlText w:val="%6."/>
-      <w:lvlJc w:val="right"/>
-      <w:pPr>
-        <w:tabs>
-          <w:tab w:val="num" w:pos="0"/>
-        </w:tabs>
-        <w:ind w:left="4320" w:hanging="180"/>
-      </w:pPr>
-      <w:rPr/>
-    </w:lvl>
-    <w:lvl w:ilvl="6">
-      <w:start w:val="1"/>
-      <w:numFmt w:val="decimal"/>
-      <w:lvlText w:val="%7."/>
-      <w:lvlJc w:val="left"/>
-      <w:pPr>
-        <w:tabs>
-          <w:tab w:val="num" w:pos="0"/>
-        </w:tabs>
-        <w:ind w:left="5040" w:hanging="360"/>
-      </w:pPr>
-      <w:rPr/>
-    </w:lvl>
-    <w:lvl w:ilvl="7">
-      <w:start w:val="1"/>
-      <w:numFmt w:val="lowerLetter"/>
-      <w:lvlText w:val="%8."/>
-      <w:lvlJc w:val="left"/>
-      <w:pPr>
-        <w:tabs>
-          <w:tab w:val="num" w:pos="0"/>
-        </w:tabs>
-        <w:ind w:left="5760" w:hanging="360"/>
-      </w:pPr>
-      <w:rPr/>
-    </w:lvl>
-    <w:lvl w:ilvl="8">
-      <w:start w:val="1"/>
-      <w:numFmt w:val="lowerRoman"/>
-      <w:lvlText w:val="%9."/>
-      <w:lvlJc w:val="right"/>
-      <w:pPr>
-        <w:tabs>
-          <w:tab w:val="num" w:pos="0"/>
-        </w:tabs>
-        <w:ind w:left="6480" w:hanging="180"/>
       </w:pPr>
       <w:rPr/>
     </w:lvl>
   </w:abstractNum>
   <w:abstractNum w:abstractNumId="5">
-    <w:lvl w:ilvl="0">
-      <w:start w:val="1"/>
-      <w:numFmt w:val="bullet"/>
-      <w:lvlText w:val="-"/>
-      <w:lvlJc w:val="left"/>
-      <w:pPr>
-        <w:tabs>
-          <w:tab w:val="num" w:pos="0"/>
-        </w:tabs>
-        <w:ind w:left="927" w:hanging="360"/>
-      </w:pPr>
-      <w:rPr>
-        <w:rFonts w:ascii="Arial" w:hAnsi="Arial" w:cs="Arial" w:hint="default"/>
-      </w:rPr>
-    </w:lvl>
-    <w:lvl w:ilvl="1">
-      <w:start w:val="1"/>
-      <w:numFmt w:val="bullet"/>
-      <w:lvlText w:val="o"/>
-      <w:lvlJc w:val="left"/>
-      <w:pPr>
-        <w:tabs>
-          <w:tab w:val="num" w:pos="0"/>
-        </w:tabs>
-        <w:ind w:left="1647" w:hanging="360"/>
-      </w:pPr>
-      <w:rPr>
-        <w:rFonts w:ascii="Courier New" w:hAnsi="Courier New" w:cs="Courier New" w:hint="default"/>
-      </w:rPr>
-    </w:lvl>
-    <w:lvl w:ilvl="2">
-      <w:start w:val="1"/>
-      <w:numFmt w:val="bullet"/>
-      <w:lvlText w:val=""/>
-      <w:lvlJc w:val="left"/>
-      <w:pPr>
-        <w:tabs>
-          <w:tab w:val="num" w:pos="0"/>
-        </w:tabs>
-        <w:ind w:left="2367" w:hanging="360"/>
-      </w:pPr>
-      <w:rPr>
-        <w:rFonts w:ascii="Wingdings" w:hAnsi="Wingdings" w:cs="Wingdings" w:hint="default"/>
-      </w:rPr>
-    </w:lvl>
-    <w:lvl w:ilvl="3">
-      <w:start w:val="1"/>
-      <w:numFmt w:val="bullet"/>
-      <w:lvlText w:val=""/>
-      <w:lvlJc w:val="left"/>
-      <w:pPr>
-        <w:tabs>
-          <w:tab w:val="num" w:pos="0"/>
-        </w:tabs>
-        <w:ind w:left="3087" w:hanging="360"/>
-      </w:pPr>
-      <w:rPr>
-        <w:rFonts w:ascii="Symbol" w:hAnsi="Symbol" w:cs="Symbol" w:hint="default"/>
-      </w:rPr>
-    </w:lvl>
-    <w:lvl w:ilvl="4">
-      <w:start w:val="1"/>
-      <w:numFmt w:val="bullet"/>
-      <w:lvlText w:val="o"/>
-      <w:lvlJc w:val="left"/>
-      <w:pPr>
-        <w:tabs>
-          <w:tab w:val="num" w:pos="0"/>
-        </w:tabs>
-        <w:ind w:left="3807" w:hanging="360"/>
-      </w:pPr>
-      <w:rPr>
-        <w:rFonts w:ascii="Courier New" w:hAnsi="Courier New" w:cs="Courier New" w:hint="default"/>
-      </w:rPr>
-    </w:lvl>
-    <w:lvl w:ilvl="5">
-      <w:start w:val="1"/>
-      <w:numFmt w:val="bullet"/>
-      <w:lvlText w:val=""/>
-      <w:lvlJc w:val="left"/>
-      <w:pPr>
-        <w:tabs>
-          <w:tab w:val="num" w:pos="0"/>
-        </w:tabs>
-        <w:ind w:left="4527" w:hanging="360"/>
-      </w:pPr>
-      <w:rPr>
-        <w:rFonts w:ascii="Wingdings" w:hAnsi="Wingdings" w:cs="Wingdings" w:hint="default"/>
-      </w:rPr>
-    </w:lvl>
-    <w:lvl w:ilvl="6">
-      <w:start w:val="1"/>
-      <w:numFmt w:val="bullet"/>
-      <w:lvlText w:val=""/>
-      <w:lvlJc w:val="left"/>
-      <w:pPr>
-        <w:tabs>
-          <w:tab w:val="num" w:pos="0"/>
-        </w:tabs>
-        <w:ind w:left="5247" w:hanging="360"/>
-      </w:pPr>
-      <w:rPr>
-        <w:rFonts w:ascii="Symbol" w:hAnsi="Symbol" w:cs="Symbol" w:hint="default"/>
-      </w:rPr>
-    </w:lvl>
-    <w:lvl w:ilvl="7">
-      <w:start w:val="1"/>
-      <w:numFmt w:val="bullet"/>
-      <w:lvlText w:val="o"/>
-      <w:lvlJc w:val="left"/>
-      <w:pPr>
-        <w:tabs>
-          <w:tab w:val="num" w:pos="0"/>
-        </w:tabs>
-        <w:ind w:left="5967" w:hanging="360"/>
-      </w:pPr>
-      <w:rPr>
-        <w:rFonts w:ascii="Courier New" w:hAnsi="Courier New" w:cs="Courier New" w:hint="default"/>
-      </w:rPr>
-    </w:lvl>
-    <w:lvl w:ilvl="8">
-      <w:start w:val="1"/>
-      <w:numFmt w:val="bullet"/>
-      <w:lvlText w:val=""/>
-      <w:lvlJc w:val="left"/>
-      <w:pPr>
-        <w:tabs>
-          <w:tab w:val="num" w:pos="0"/>
-        </w:tabs>
-        <w:ind w:left="6687" w:hanging="360"/>
-      </w:pPr>
-      <w:rPr>
-        <w:rFonts w:ascii="Wingdings" w:hAnsi="Wingdings" w:cs="Wingdings" w:hint="default"/>
-      </w:rPr>
-    </w:lvl>
-  </w:abstractNum>
-  <w:abstractNum w:abstractNumId="6">
     <w:lvl w:ilvl="0">
       <w:start w:val="3"/>
       <w:numFmt w:val="decimal"/>
@@ -3807,7 +5344,7 @@
       <w:rPr/>
     </w:lvl>
   </w:abstractNum>
-  <w:abstractNum w:abstractNumId="7">
+  <w:abstractNum w:abstractNumId="6">
     <w:lvl w:ilvl="0">
       <w:start w:val="1"/>
       <w:numFmt w:val="decimal"/>
@@ -3935,7 +5472,7 @@
       <w:rPr/>
     </w:lvl>
   </w:abstractNum>
-  <w:abstractNum w:abstractNumId="8">
+  <w:abstractNum w:abstractNumId="7">
     <w:lvl w:ilvl="0">
       <w:start w:val="2"/>
       <w:numFmt w:val="decimal"/>
@@ -4063,7 +5600,7 @@
       <w:rPr/>
     </w:lvl>
   </w:abstractNum>
-  <w:abstractNum w:abstractNumId="9">
+  <w:abstractNum w:abstractNumId="8">
     <w:lvl w:ilvl="0">
       <w:start w:val="3"/>
       <w:numFmt w:val="decimal"/>
@@ -4216,22 +5753,19 @@
     <w:abstractNumId w:val="8"/>
   </w:num>
   <w:num w:numId="9">
-    <w:abstractNumId w:val="9"/>
+    <w:abstractNumId w:val="6"/>
+    <w:lvlOverride w:ilvl="0">
+      <w:startOverride w:val="1"/>
+    </w:lvlOverride>
   </w:num>
   <w:num w:numId="10">
     <w:abstractNumId w:val="7"/>
     <w:lvlOverride w:ilvl="0">
-      <w:startOverride w:val="1"/>
+      <w:startOverride w:val="2"/>
     </w:lvlOverride>
   </w:num>
   <w:num w:numId="11">
     <w:abstractNumId w:val="8"/>
-    <w:lvlOverride w:ilvl="0">
-      <w:startOverride w:val="2"/>
-    </w:lvlOverride>
-  </w:num>
-  <w:num w:numId="12">
-    <w:abstractNumId w:val="9"/>
     <w:lvlOverride w:ilvl="0">
       <w:startOverride w:val="3"/>
     </w:lvlOverride>
@@ -4263,9 +5797,7 @@
     <w:pPr>
       <w:widowControl/>
       <w:suppressAutoHyphens w:val="true"/>
-      <w:kinsoku w:val="true"/>
-      <w:overflowPunct w:val="false"/>
-      <w:autoSpaceDE w:val="true"/>
+      <w:overflowPunct w:val="true"/>
       <w:bidi w:val="0"/>
       <w:spacing w:lineRule="auto" w:line="240" w:before="0" w:after="120"/>
       <w:ind w:firstLine="567"/>
@@ -4674,6 +6206,23 @@
       <w:rFonts w:ascii="Liberation Mono" w:hAnsi="Liberation Mono" w:eastAsia="Liberation Mono" w:cs="Liberation Mono"/>
     </w:rPr>
   </w:style>
+  <w:style w:type="character" w:styleId="Hyperlink">
+    <w:name w:val="Hyperlink"/>
+    <w:rPr>
+      <w:color w:val="000080"/>
+      <w:u w:val="single"/>
+    </w:rPr>
+  </w:style>
+  <w:style w:type="character" w:styleId="IndexLink">
+    <w:name w:val="Index Link"/>
+    <w:qFormat/>
+    <w:rPr/>
+  </w:style>
+  <w:style w:type="character" w:styleId="NumberingSymbols">
+    <w:name w:val="Numbering Symbols"/>
+    <w:qFormat/>
+    <w:rPr/>
+  </w:style>
   <w:style w:type="paragraph" w:styleId="Heading">
     <w:name w:val="Heading"/>
     <w:basedOn w:val="Normal"/>
@@ -4815,6 +6364,47 @@
       <w:color w:themeColor="accent1" w:themeShade="bf" w:val="0F4761"/>
     </w:rPr>
   </w:style>
+  <w:style w:type="paragraph" w:styleId="IndexHeading">
+    <w:name w:val="index heading"/>
+    <w:basedOn w:val="Heading"/>
+    <w:pPr>
+      <w:suppressLineNumbers/>
+      <w:ind w:hanging="0" w:left="0"/>
+    </w:pPr>
+    <w:rPr>
+      <w:b/>
+      <w:bCs/>
+      <w:sz w:val="32"/>
+      <w:szCs w:val="32"/>
+    </w:rPr>
+  </w:style>
+  <w:style w:type="paragraph" w:styleId="TOCHeading">
+    <w:name w:val="TOC Heading"/>
+    <w:basedOn w:val="IndexHeading"/>
+    <w:qFormat/>
+    <w:pPr>
+      <w:suppressLineNumbers/>
+      <w:ind w:hanging="0" w:left="0"/>
+    </w:pPr>
+    <w:rPr>
+      <w:b/>
+      <w:bCs/>
+      <w:sz w:val="32"/>
+      <w:szCs w:val="32"/>
+    </w:rPr>
+  </w:style>
+  <w:style w:type="paragraph" w:styleId="TOC1">
+    <w:name w:val="toc 1"/>
+    <w:basedOn w:val="Index"/>
+    <w:pPr>
+      <w:tabs>
+        <w:tab w:val="clear" w:pos="720"/>
+        <w:tab w:val="right" w:pos="9354" w:leader="dot"/>
+      </w:tabs>
+      <w:ind w:hanging="0" w:left="0"/>
+    </w:pPr>
+    <w:rPr/>
+  </w:style>
   <w:style w:type="numbering" w:styleId="NoList">
     <w:name w:val="No List"/>
     <w:qFormat/>

</xml_diff>

<commit_message>
Working on documentation 6.  Software for classification
</commit_message>
<xml_diff>
--- a/Zapiska_Georgi_Chaparov.docx
+++ b/Zapiska_Georgi_Chaparov.docx
@@ -2140,16 +2140,17 @@
             </w:rPr>
             <w:fldChar w:fldCharType="separate"/>
           </w:r>
-          <w:hyperlink w:anchor="__RefHeading___Toc279_4158184810" w:tooltip="Анoтaция">
-            <w:r>
-              <w:rPr>
-                <w:rStyle w:val="IndexLink"/>
-              </w:rPr>
-              <w:t>1. Анoтaция</w:t>
-              <w:tab/>
-              <w:t>8</w:t>
-            </w:r>
-          </w:hyperlink>
+          <w:r>
+            <w:rPr>
+              <w:rStyle w:val="IndexLink"/>
+            </w:rPr>
+            <w:t>1. Анoтaция</w:t>
+          </w:r>
+          <w:r>
+            <w:rPr/>
+            <w:tab/>
+            <w:t>8</w:t>
+          </w:r>
         </w:p>
         <w:p>
           <w:pPr>
@@ -2160,16 +2161,12 @@
             </w:tabs>
             <w:rPr/>
           </w:pPr>
-          <w:hyperlink w:anchor="__RefHeading___Toc957_4158184810" w:tooltip="Увод">
-            <w:r>
-              <w:rPr>
-                <w:rStyle w:val="IndexLink"/>
-              </w:rPr>
-              <w:t>2. Увод</w:t>
-              <w:tab/>
-              <w:t>9</w:t>
-            </w:r>
-          </w:hyperlink>
+          <w:r>
+            <w:rPr/>
+            <w:t>2. Увод</w:t>
+            <w:tab/>
+            <w:t>9</w:t>
+          </w:r>
         </w:p>
         <w:p>
           <w:pPr>
@@ -2180,16 +2177,12 @@
             </w:tabs>
             <w:rPr/>
           </w:pPr>
-          <w:hyperlink w:anchor="__RefHeading___Toc959_4158184810" w:tooltip="Обзор на съществуващи решения">
-            <w:r>
-              <w:rPr>
-                <w:rStyle w:val="IndexLink"/>
-              </w:rPr>
-              <w:t>3. Обзор на съществуващи решения</w:t>
-              <w:tab/>
-              <w:t>10</w:t>
-            </w:r>
-          </w:hyperlink>
+          <w:r>
+            <w:rPr/>
+            <w:t>3. Обзор на съществуващи решения</w:t>
+            <w:tab/>
+            <w:t>10</w:t>
+          </w:r>
         </w:p>
         <w:p>
           <w:pPr>
@@ -2200,16 +2193,12 @@
             </w:tabs>
             <w:rPr/>
           </w:pPr>
-          <w:hyperlink w:anchor="__RefHeading___Toc961_4158184810" w:tooltip="Поставени цели и задачи">
-            <w:r>
-              <w:rPr>
-                <w:rStyle w:val="IndexLink"/>
-              </w:rPr>
-              <w:t>4. Поставени цели и задачи</w:t>
-              <w:tab/>
-              <w:t>11</w:t>
-            </w:r>
-          </w:hyperlink>
+          <w:r>
+            <w:rPr/>
+            <w:t>4. Поставени цели и задачи</w:t>
+            <w:tab/>
+            <w:t>11</w:t>
+          </w:r>
         </w:p>
         <w:p>
           <w:pPr>
@@ -2220,16 +2209,12 @@
             </w:tabs>
             <w:rPr/>
           </w:pPr>
-          <w:hyperlink w:anchor="__RefHeading___Toc965_4158184810" w:tooltip="Описание на експеримент и хардуер за събиране на данните">
-            <w:r>
-              <w:rPr>
-                <w:rStyle w:val="IndexLink"/>
-              </w:rPr>
-              <w:t>5. Описание на експеримент и хардуер за събиране на данните</w:t>
-              <w:tab/>
-              <w:t>12</w:t>
-            </w:r>
-          </w:hyperlink>
+          <w:r>
+            <w:rPr/>
+            <w:t>5. Описание на експеримент и хардуер за събиране на данните</w:t>
+            <w:tab/>
+            <w:t>12</w:t>
+          </w:r>
         </w:p>
         <w:p>
           <w:pPr>
@@ -2240,16 +2225,12 @@
             </w:tabs>
             <w:rPr/>
           </w:pPr>
-          <w:hyperlink w:anchor="__RefHeading___Toc969_4158184810" w:tooltip="Софтуер за класифициране на данните">
-            <w:r>
-              <w:rPr>
-                <w:rStyle w:val="IndexLink"/>
-              </w:rPr>
-              <w:t>6. Софтуер за класифициране на данните</w:t>
-              <w:tab/>
-              <w:t>13</w:t>
-            </w:r>
-          </w:hyperlink>
+          <w:r>
+            <w:rPr/>
+            <w:t>6. Софтуер за класифициране на данните</w:t>
+            <w:tab/>
+            <w:t>14</w:t>
+          </w:r>
         </w:p>
         <w:p>
           <w:pPr>
@@ -2260,16 +2241,12 @@
             </w:tabs>
             <w:rPr/>
           </w:pPr>
-          <w:hyperlink w:anchor="__RefHeading___Toc2735_4158184810" w:tooltip="Изисквания, архитектура и организация на данните">
-            <w:r>
-              <w:rPr>
-                <w:rStyle w:val="IndexLink"/>
-              </w:rPr>
-              <w:t>6.1. Изисквания, архитектура и организация на данните</w:t>
-              <w:tab/>
-              <w:t>13</w:t>
-            </w:r>
-          </w:hyperlink>
+          <w:r>
+            <w:rPr/>
+            <w:t>6.1. Изисквания, архитектура и организация на данните</w:t>
+            <w:tab/>
+            <w:t>14</w:t>
+          </w:r>
         </w:p>
         <w:p>
           <w:pPr>
@@ -2280,16 +2257,12 @@
             </w:tabs>
             <w:rPr/>
           </w:pPr>
-          <w:hyperlink w:anchor="__RefHeading___Toc2737_4158184810" w:tooltip="Избор на език и среда за програмиране">
-            <w:r>
-              <w:rPr>
-                <w:rStyle w:val="IndexLink"/>
-              </w:rPr>
-              <w:t>6.2. Избор на език и среда за програмиране</w:t>
-              <w:tab/>
-              <w:t>13</w:t>
-            </w:r>
-          </w:hyperlink>
+          <w:r>
+            <w:rPr/>
+            <w:t>6.2. Избор на език и среда за програмиране</w:t>
+            <w:tab/>
+            <w:t>14</w:t>
+          </w:r>
         </w:p>
         <w:p>
           <w:pPr>
@@ -2300,16 +2273,12 @@
             </w:tabs>
             <w:rPr/>
           </w:pPr>
-          <w:hyperlink w:anchor="__RefHeading___Toc2739_4158184810" w:tooltip="Реализация на програмната система">
-            <w:r>
-              <w:rPr>
-                <w:rStyle w:val="IndexLink"/>
-              </w:rPr>
-              <w:t>6.3. Реализация на програмната система</w:t>
-              <w:tab/>
-              <w:t>13</w:t>
-            </w:r>
-          </w:hyperlink>
+          <w:r>
+            <w:rPr/>
+            <w:t>6.3. Реализация на програмната система</w:t>
+            <w:tab/>
+            <w:t>14</w:t>
+          </w:r>
         </w:p>
         <w:p>
           <w:pPr>
@@ -2320,16 +2289,12 @@
             </w:tabs>
             <w:rPr/>
           </w:pPr>
-          <w:hyperlink w:anchor="__RefHeading___Toc2741_4158184810" w:tooltip="Описание на програмните модули">
-            <w:r>
-              <w:rPr>
-                <w:rStyle w:val="IndexLink"/>
-              </w:rPr>
-              <w:t>6.3.1. Описание на програмните модули</w:t>
-              <w:tab/>
-              <w:t>13</w:t>
-            </w:r>
-          </w:hyperlink>
+          <w:r>
+            <w:rPr/>
+            <w:t>6.3.1. Описание на програмните модули</w:t>
+            <w:tab/>
+            <w:t>14</w:t>
+          </w:r>
         </w:p>
         <w:p>
           <w:pPr>
@@ -2340,16 +2305,12 @@
             </w:tabs>
             <w:rPr/>
           </w:pPr>
-          <w:hyperlink w:anchor="__RefHeading___Toc2743_4158184810" w:tooltip="Структура и организация на програмния интерфейс">
-            <w:r>
-              <w:rPr>
-                <w:rStyle w:val="IndexLink"/>
-              </w:rPr>
-              <w:t>6.3.2. Структура и организация на програмния интерфейс</w:t>
-              <w:tab/>
-              <w:t>13</w:t>
-            </w:r>
-          </w:hyperlink>
+          <w:r>
+            <w:rPr/>
+            <w:t>6.3.2. Структура и организация на програмния интерфейс</w:t>
+            <w:tab/>
+            <w:t>14</w:t>
+          </w:r>
         </w:p>
         <w:p>
           <w:pPr>
@@ -2360,16 +2321,12 @@
             </w:tabs>
             <w:rPr/>
           </w:pPr>
-          <w:hyperlink w:anchor="__RefHeading___Toc2745_4158184810" w:tooltip="Формат на входните и изходните данни">
-            <w:r>
-              <w:rPr>
-                <w:rStyle w:val="IndexLink"/>
-              </w:rPr>
-              <w:t>6.4. Формат на входните и изходните данни</w:t>
-              <w:tab/>
-              <w:t>13</w:t>
-            </w:r>
-          </w:hyperlink>
+          <w:r>
+            <w:rPr/>
+            <w:t>6.4. Формат на входните и изходните данни</w:t>
+            <w:tab/>
+            <w:t>14</w:t>
+          </w:r>
         </w:p>
         <w:p>
           <w:pPr>
@@ -2380,16 +2337,12 @@
             </w:tabs>
             <w:rPr/>
           </w:pPr>
-          <w:hyperlink w:anchor="__RefHeading___Toc10516_4158184810" w:tooltip="Архитектура на системата и отдалечен достъп">
-            <w:r>
-              <w:rPr>
-                <w:rStyle w:val="IndexLink"/>
-              </w:rPr>
-              <w:t>7. Архитектура на системата и отдалечен достъп</w:t>
-              <w:tab/>
-              <w:t>14</w:t>
-            </w:r>
-          </w:hyperlink>
+          <w:r>
+            <w:rPr/>
+            <w:t>7. Среда за разработка и отдалечен достъп</w:t>
+            <w:tab/>
+            <w:t>15</w:t>
+          </w:r>
         </w:p>
         <w:p>
           <w:pPr>
@@ -2400,16 +2353,12 @@
             </w:tabs>
             <w:rPr/>
           </w:pPr>
-          <w:hyperlink w:anchor="__RefHeading___Toc2865_1987151165" w:tooltip="Създаване на Docker образ">
-            <w:r>
-              <w:rPr>
-                <w:rStyle w:val="IndexLink"/>
-              </w:rPr>
-              <w:t>7.1. Създаване на Docker образ</w:t>
-              <w:tab/>
-              <w:t>14</w:t>
-            </w:r>
-          </w:hyperlink>
+          <w:r>
+            <w:rPr/>
+            <w:t>7.1. Създаване на Docker образ</w:t>
+            <w:tab/>
+            <w:t>15</w:t>
+          </w:r>
         </w:p>
         <w:p>
           <w:pPr>
@@ -2420,16 +2369,12 @@
             </w:tabs>
             <w:rPr/>
           </w:pPr>
-          <w:hyperlink w:anchor="__RefHeading___Toc5688_4158184810" w:tooltip="Създаване и обучение на модела">
-            <w:r>
-              <w:rPr>
-                <w:rStyle w:val="IndexLink"/>
-              </w:rPr>
-              <w:t>8. Създаване и обучение на модела</w:t>
-              <w:tab/>
-              <w:t>19</w:t>
-            </w:r>
-          </w:hyperlink>
+          <w:r>
+            <w:rPr/>
+            <w:t>8. Създаване и обучение на модела</w:t>
+            <w:tab/>
+            <w:t>20</w:t>
+          </w:r>
         </w:p>
         <w:p>
           <w:pPr>
@@ -2440,16 +2385,12 @@
             </w:tabs>
             <w:rPr/>
           </w:pPr>
-          <w:hyperlink w:anchor="__RefHeading___Toc967_4158184810" w:tooltip="Предварителна обработка на данните">
-            <w:r>
-              <w:rPr>
-                <w:rStyle w:val="IndexLink"/>
-              </w:rPr>
-              <w:t>8.1. Предварителна обработка на данните</w:t>
-              <w:tab/>
-              <w:t>19</w:t>
-            </w:r>
-          </w:hyperlink>
+          <w:r>
+            <w:rPr/>
+            <w:t>8.1. Предварителна обработка на данните</w:t>
+            <w:tab/>
+            <w:t>20</w:t>
+          </w:r>
         </w:p>
         <w:p>
           <w:pPr>
@@ -2460,16 +2401,12 @@
             </w:tabs>
             <w:rPr/>
           </w:pPr>
-          <w:hyperlink w:anchor="__RefHeading___Toc5690_4158184810" w:tooltip="Избор на модел за машинно обучение">
-            <w:r>
-              <w:rPr>
-                <w:rStyle w:val="IndexLink"/>
-              </w:rPr>
-              <w:t>8.2. Избор на модел за машинно обучение</w:t>
-              <w:tab/>
-              <w:t>19</w:t>
-            </w:r>
-          </w:hyperlink>
+          <w:r>
+            <w:rPr/>
+            <w:t>8.2. Избор на модел за машинно обучение</w:t>
+            <w:tab/>
+            <w:t>20</w:t>
+          </w:r>
         </w:p>
         <w:p>
           <w:pPr>
@@ -2480,16 +2417,12 @@
             </w:tabs>
             <w:rPr/>
           </w:pPr>
-          <w:hyperlink w:anchor="__RefHeading___Toc5692_4158184810" w:tooltip="Методология на обучението">
-            <w:r>
-              <w:rPr>
-                <w:rStyle w:val="IndexLink"/>
-              </w:rPr>
-              <w:t>8.3. Методология на обучението</w:t>
-              <w:tab/>
-              <w:t>19</w:t>
-            </w:r>
-          </w:hyperlink>
+          <w:r>
+            <w:rPr/>
+            <w:t>8.3. Методология на обучението</w:t>
+            <w:tab/>
+            <w:t>20</w:t>
+          </w:r>
         </w:p>
         <w:p>
           <w:pPr>
@@ -2500,16 +2433,12 @@
             </w:tabs>
             <w:rPr/>
           </w:pPr>
-          <w:hyperlink w:anchor="__RefHeading___Toc10518_4158184810" w:tooltip="Сравнение между CNN и Transformer модел">
-            <w:r>
-              <w:rPr>
-                <w:rStyle w:val="IndexLink"/>
-              </w:rPr>
-              <w:t>9. Сравнение между CNN и Transformer модел</w:t>
-              <w:tab/>
-              <w:t>20</w:t>
-            </w:r>
-          </w:hyperlink>
+          <w:r>
+            <w:rPr/>
+            <w:t>9. Сравнение между CNN и Transformer модел</w:t>
+            <w:tab/>
+            <w:t>21</w:t>
+          </w:r>
         </w:p>
         <w:p>
           <w:pPr>
@@ -2520,16 +2449,12 @@
             </w:tabs>
             <w:rPr/>
           </w:pPr>
-          <w:hyperlink w:anchor="__RefHeading___Toc10520_4158184810" w:tooltip="Резултати при различна продължителност на записите">
-            <w:r>
-              <w:rPr>
-                <w:rStyle w:val="IndexLink"/>
-              </w:rPr>
-              <w:t>10. Резултати при различна продължителност на записите</w:t>
-              <w:tab/>
-              <w:t>21</w:t>
-            </w:r>
-          </w:hyperlink>
+          <w:r>
+            <w:rPr/>
+            <w:t>10. Резултати при различна продължителност на записите</w:t>
+            <w:tab/>
+            <w:t>22</w:t>
+          </w:r>
         </w:p>
         <w:p>
           <w:pPr>
@@ -2540,16 +2465,12 @@
             </w:tabs>
             <w:rPr/>
           </w:pPr>
-          <w:hyperlink w:anchor="__RefHeading___Toc5694_4158184810" w:tooltip="Основни резултати">
-            <w:r>
-              <w:rPr>
-                <w:rStyle w:val="IndexLink"/>
-              </w:rPr>
-              <w:t>11. Основни резултати</w:t>
-              <w:tab/>
-              <w:t>22</w:t>
-            </w:r>
-          </w:hyperlink>
+          <w:r>
+            <w:rPr/>
+            <w:t>11. Основни резултати</w:t>
+            <w:tab/>
+            <w:t>23</w:t>
+          </w:r>
         </w:p>
         <w:p>
           <w:pPr>
@@ -2560,16 +2481,12 @@
             </w:tabs>
             <w:rPr/>
           </w:pPr>
-          <w:hyperlink w:anchor="__RefHeading___Toc5696_4158184810" w:tooltip="Изводи и препоръки">
-            <w:r>
-              <w:rPr>
-                <w:rStyle w:val="IndexLink"/>
-              </w:rPr>
-              <w:t>12. Изводи и препоръки</w:t>
-              <w:tab/>
-              <w:t>23</w:t>
-            </w:r>
-          </w:hyperlink>
+          <w:r>
+            <w:rPr/>
+            <w:t>12. Изводи и препоръки</w:t>
+            <w:tab/>
+            <w:t>24</w:t>
+          </w:r>
         </w:p>
         <w:p>
           <w:pPr>
@@ -2580,16 +2497,12 @@
             </w:tabs>
             <w:rPr/>
           </w:pPr>
-          <w:hyperlink w:anchor="__RefHeading___Toc2749_4158184810" w:tooltip="Използвана литература">
-            <w:r>
-              <w:rPr>
-                <w:rStyle w:val="IndexLink"/>
-              </w:rPr>
-              <w:t>13. Използвана литература</w:t>
-              <w:tab/>
-              <w:t>24</w:t>
-            </w:r>
-          </w:hyperlink>
+          <w:r>
+            <w:rPr/>
+            <w:t>13. Използвана литература</w:t>
+            <w:tab/>
+            <w:t>25</w:t>
+          </w:r>
         </w:p>
         <w:p>
           <w:pPr>
@@ -2600,20 +2513,14 @@
             </w:tabs>
             <w:rPr/>
           </w:pPr>
-          <w:hyperlink w:anchor="__RefHeading___Toc971_4158184810" w:tooltip="Приложения">
-            <w:r>
-              <w:rPr>
-                <w:rStyle w:val="IndexLink"/>
-              </w:rPr>
-              <w:t>14. Приложения</w:t>
-              <w:tab/>
-              <w:t>25</w:t>
-            </w:r>
-          </w:hyperlink>
           <w:r>
-            <w:rPr>
-              <w:rStyle w:val="IndexLink"/>
-            </w:rPr>
+            <w:rPr/>
+            <w:t>14. Приложения</w:t>
+            <w:tab/>
+            <w:t>26</w:t>
+          </w:r>
+          <w:r>
+            <w:rPr/>
             <w:fldChar w:fldCharType="end"/>
           </w:r>
         </w:p>
@@ -2784,7 +2691,9 @@
       <w:pPr>
         <w:pStyle w:val="Normal"/>
         <w:spacing w:lineRule="auto" w:line="360"/>
-        <w:rPr/>
+        <w:rPr>
+          <w:lang w:val="bg-BG" w:eastAsia="en-US" w:bidi="ar-SA"/>
+        </w:rPr>
       </w:pPr>
       <w:r>
         <w:rPr>
@@ -2846,7 +2755,9 @@
       <w:pPr>
         <w:pStyle w:val="Normal"/>
         <w:spacing w:lineRule="auto" w:line="360"/>
-        <w:rPr/>
+        <w:rPr>
+          <w:lang w:val="bg-BG" w:eastAsia="en-US" w:bidi="ar-SA"/>
+        </w:rPr>
       </w:pPr>
       <w:r>
         <w:rPr>
@@ -3251,27 +3162,7 @@
           <w:szCs w:val="32"/>
           <w:lang w:val="bg-BG" w:eastAsia="en-US" w:bidi="ar-SA"/>
         </w:rPr>
-        <w:t xml:space="preserve">Описание на експеримент </w:t>
-      </w:r>
-      <w:r>
-        <w:rPr>
-          <w:b/>
-          <w:bCs/>
-          <w:sz w:val="32"/>
-          <w:szCs w:val="32"/>
-          <w:lang w:val="bg-BG" w:eastAsia="en-US" w:bidi="ar-SA"/>
-        </w:rPr>
-        <w:t>и хардуер</w:t>
-      </w:r>
-      <w:r>
-        <w:rPr>
-          <w:b/>
-          <w:bCs/>
-          <w:sz w:val="32"/>
-          <w:szCs w:val="32"/>
-          <w:lang w:val="bg-BG" w:eastAsia="en-US" w:bidi="ar-SA"/>
-        </w:rPr>
-        <w:t xml:space="preserve"> за събиране на данните</w:t>
+        <w:t>Описание на експеримент и хардуер за събиране на данните</w:t>
       </w:r>
     </w:p>
     <w:p>
@@ -3323,67 +3214,7 @@
         <w:rPr>
           <w:lang w:val="bg-BG"/>
         </w:rPr>
-        <w:t xml:space="preserve"> Комплект</w:t>
-      </w:r>
-      <w:r>
-        <w:rPr>
-          <w:lang w:val="bg-BG"/>
-        </w:rPr>
-        <w:t>ът</w:t>
-      </w:r>
-      <w:r>
-        <w:rPr>
-          <w:lang w:val="bg-BG"/>
-        </w:rPr>
-        <w:t xml:space="preserve"> предоставя възможност за </w:t>
-      </w:r>
-      <w:r>
-        <w:rPr>
-          <w:lang w:val="bg-BG"/>
-        </w:rPr>
-        <w:t>три</w:t>
-      </w:r>
-      <w:r>
-        <w:rPr>
-          <w:lang w:val="bg-BG"/>
-        </w:rPr>
-        <w:t xml:space="preserve"> различни постройки, като използваната тук е космически кораб с общ брой на частите – </w:t>
-      </w:r>
-      <w:r>
-        <w:rPr>
-          <w:lang w:val="bg-BG"/>
-        </w:rPr>
-        <w:t>седемдесет и две</w:t>
-      </w:r>
-      <w:r>
-        <w:rPr>
-          <w:lang w:val="bg-BG"/>
-        </w:rPr>
-        <w:t>. Общия</w:t>
-      </w:r>
-      <w:r>
-        <w:rPr>
-          <w:lang w:val="bg-BG"/>
-        </w:rPr>
-        <w:t>т</w:t>
-      </w:r>
-      <w:r>
-        <w:rPr>
-          <w:lang w:val="bg-BG"/>
-        </w:rPr>
-        <w:t xml:space="preserve"> брой инструкции в упътването е </w:t>
-      </w:r>
-      <w:r>
-        <w:rPr>
-          <w:lang w:val="bg-BG"/>
-        </w:rPr>
-        <w:t>двадесет и три</w:t>
-      </w:r>
-      <w:r>
-        <w:rPr>
-          <w:lang w:val="bg-BG"/>
-        </w:rPr>
-        <w:t xml:space="preserve">. </w:t>
+        <w:t xml:space="preserve"> Комплектът предоставя възможност за три различни постройки, като използваната тук е космически кораб с общ брой на частите – седемдесет и две. Общият брой инструкции в упътването е двадесет и три. </w:t>
       </w:r>
     </w:p>
     <w:p>
@@ -3399,31 +3230,31 @@
         <w:rPr>
           <w:lang w:val="bg-BG"/>
         </w:rPr>
-        <w:t>Всеки участник започва експеримента с всичките нужни части, събрани пред него, а упътването е пред тях. Експеримент</w:t>
-      </w:r>
-      <w:r>
-        <w:rPr>
-          <w:lang w:val="bg-BG"/>
-        </w:rPr>
-        <w:t>ът</w:t>
-      </w:r>
-      <w:r>
-        <w:rPr>
-          <w:lang w:val="bg-BG"/>
-        </w:rPr>
-        <w:t xml:space="preserve"> приключва в момента, в който участникът приключи със строенето на постройката, или щом участникът няма повече желание да продължи експеримента. В случай, че участника се е отказал от завършването на експеримента и записа е по-малък от </w:t>
-      </w:r>
-      <w:r>
-        <w:rPr>
-          <w:lang w:val="bg-BG"/>
-        </w:rPr>
-        <w:t>десет</w:t>
-      </w:r>
-      <w:r>
-        <w:rPr>
-          <w:lang w:val="bg-BG"/>
-        </w:rPr>
-        <w:t xml:space="preserve"> минути, то записът бива отхвърлен.</w:t>
+        <w:t xml:space="preserve">Преди началото на експеримента всеки участник заедно с организатора на експеримента трябва да се </w:t>
+      </w:r>
+      <w:r>
+        <w:rPr>
+          <w:lang w:val="bg-BG"/>
+        </w:rPr>
+        <w:t>подпишат</w:t>
+      </w:r>
+      <w:r>
+        <w:rPr>
+          <w:lang w:val="bg-BG"/>
+        </w:rPr>
+        <w:t xml:space="preserve"> на </w:t>
+      </w:r>
+      <w:r>
+        <w:rPr>
+          <w:lang w:val="bg-BG"/>
+        </w:rPr>
+        <w:t>договор, идентичен с Приложение А</w:t>
+      </w:r>
+      <w:r>
+        <w:rPr>
+          <w:lang w:val="bg-BG"/>
+        </w:rPr>
+        <w:t xml:space="preserve">. Договорът се изготвя и подписва в два еднообразни екземпляра – по един за всяка от страните. </w:t>
       </w:r>
     </w:p>
     <w:p>
@@ -3439,43 +3270,7 @@
         <w:rPr>
           <w:lang w:val="bg-BG"/>
         </w:rPr>
-        <w:t xml:space="preserve">Общият брой на участниците е </w:t>
-      </w:r>
-      <w:r>
-        <w:rPr>
-          <w:lang w:val="bg-BG"/>
-        </w:rPr>
-        <w:t>двадесет и осем</w:t>
-      </w:r>
-      <w:r>
-        <w:rPr>
-          <w:lang w:val="bg-BG"/>
-        </w:rPr>
-        <w:t xml:space="preserve">. Няколко от участниците проявиха желание да приключат експеримента преждевременно, но във всеки един от тези случаи, записите бяха по-дълги от </w:t>
-      </w:r>
-      <w:r>
-        <w:rPr>
-          <w:lang w:val="bg-BG"/>
-        </w:rPr>
-        <w:t>десет</w:t>
-      </w:r>
-      <w:r>
-        <w:rPr>
-          <w:lang w:val="bg-BG"/>
-        </w:rPr>
-        <w:t xml:space="preserve"> минути. Поради технически проблеми с очилата, два от записите са загубен</w:t>
-      </w:r>
-      <w:r>
-        <w:rPr>
-          <w:lang w:val="bg-BG"/>
-        </w:rPr>
-        <w:t>и</w:t>
-      </w:r>
-      <w:r>
-        <w:rPr>
-          <w:lang w:val="bg-BG"/>
-        </w:rPr>
-        <w:t>, като единствената информация от тези участници е суровите данни за техния поглед. Загубата на записа възпрепятства класифицирането на тези данни.</w:t>
+        <w:t>Всеки участник започва експеримента с всичките нужни части, събрани пред него, а упътването е пред тях. Експериментът приключва в момента, в който участникът приключи със строенето на постройката, или щом участникът няма повече желание да продължи експеримента. В случай, че участника се е отказал от завършването на експеримента и записа е по-малък от десет минути, то записът бива отхвърлен.</w:t>
       </w:r>
     </w:p>
     <w:p>
@@ -3491,7 +3286,7 @@
         <w:rPr>
           <w:lang w:val="bg-BG"/>
         </w:rPr>
-        <w:t>Общия брой на използваните записи за обучение на модела е двадесет и шест.</w:t>
+        <w:t>Общият брой на участниците е двадесет и осем. Няколко от участниците проявиха желание да приключат експеримента преждевременно, но във всеки един от тези случаи, записите бяха по-дълги от десет минути. Поради технически проблеми с очилата, два от записите са загубени, като единствената информация от тези участници е суровите данни за техния поглед. Загубата на записа възпрепятства класифицирането на тези данни.</w:t>
       </w:r>
     </w:p>
     <w:p>
@@ -3507,25 +3302,23 @@
         <w:rPr>
           <w:lang w:val="bg-BG"/>
         </w:rPr>
-        <w:t xml:space="preserve">За записване на действията на </w:t>
-      </w:r>
-      <w:r>
-        <w:rPr>
-          <w:lang w:val="bg-BG"/>
-        </w:rPr>
-        <w:t>участниците, с</w:t>
-      </w:r>
-      <w:r>
-        <w:rPr>
-          <w:lang w:val="bg-BG"/>
-        </w:rPr>
-        <w:t>а</w:t>
-      </w:r>
-      <w:r>
-        <w:rPr>
-          <w:lang w:val="bg-BG"/>
-        </w:rPr>
-        <w:t xml:space="preserve"> използвани очилата </w:t>
+        <w:t>Общия брой на използваните записи за обучение на модела е двадесет и шест.</w:t>
+      </w:r>
+    </w:p>
+    <w:p>
+      <w:pPr>
+        <w:pStyle w:val="Normal"/>
+        <w:bidi w:val="0"/>
+        <w:spacing w:lineRule="auto" w:line="360"/>
+        <w:rPr>
+          <w:lang w:val="bg-BG"/>
+        </w:rPr>
+      </w:pPr>
+      <w:r>
+        <w:rPr>
+          <w:lang w:val="bg-BG"/>
+        </w:rPr>
+        <w:t xml:space="preserve">За записване на действията на участниците, са използвани очилата </w:t>
       </w:r>
       <w:r>
         <w:rPr>
@@ -3594,17 +3387,7 @@
           <w:szCs w:val="32"/>
           <w:lang w:val="en-US"/>
         </w:rPr>
-        <w:t xml:space="preserve"> </w:t>
-      </w:r>
-      <w:r>
-        <w:rPr>
-          <w:b/>
-          <w:bCs/>
-          <w:sz w:val="32"/>
-          <w:szCs w:val="32"/>
-          <w:lang w:val="en-US"/>
-        </w:rPr>
-        <w:t>Pupil Labs</w:t>
+        <w:t xml:space="preserve"> Pupil Labs</w:t>
       </w:r>
     </w:p>
     <w:p>
@@ -3626,25 +3409,303 @@
         <w:rPr>
           <w:lang w:val="bg-BG"/>
         </w:rPr>
-        <w:t xml:space="preserve">представлява рамка на очила с вграден модул между двете </w:t>
-      </w:r>
-      <w:r>
-        <w:rPr>
-          <w:lang w:val="bg-BG"/>
-        </w:rPr>
-        <w:t>лещи</w:t>
-      </w:r>
-      <w:r>
-        <w:rPr>
-          <w:lang w:val="bg-BG"/>
+        <w:t xml:space="preserve">представлява рамка на очила с вграден модул между двете лещи. </w:t>
+      </w:r>
+    </w:p>
+    <w:p>
+      <w:pPr>
+        <w:pStyle w:val="Normal"/>
+        <w:bidi w:val="0"/>
+        <w:spacing w:lineRule="auto" w:line="360"/>
+        <w:rPr>
+          <w:lang w:val="en-US"/>
+        </w:rPr>
+      </w:pPr>
+      <w:r>
+        <w:rPr>
+          <w:lang w:val="bg-BG"/>
+        </w:rPr>
+        <w:t>Очилата разполагат с камера, която гледа напред и записва това, което вижда човека, който ги носи. Резолюцията на тази камера е 1600</w:t>
+      </w:r>
+      <w:r>
+        <w:rPr>
+          <w:lang w:val="en-US"/>
+        </w:rPr>
+        <w:t>px</w:t>
+      </w:r>
+      <w:r>
+        <w:rPr>
+          <w:lang w:val="bg-BG"/>
+        </w:rPr>
+        <w:t xml:space="preserve"> на 1200</w:t>
+      </w:r>
+      <w:r>
+        <w:rPr>
+          <w:lang w:val="en-US"/>
+        </w:rPr>
+        <w:t>px</w:t>
+      </w:r>
+      <w:r>
+        <w:rPr>
+          <w:lang w:val="bg-BG"/>
+        </w:rPr>
+        <w:t xml:space="preserve"> и работи на честота от 30</w:t>
+      </w:r>
+      <w:r>
+        <w:rPr>
+          <w:lang w:val="en-US"/>
+        </w:rPr>
+        <w:t xml:space="preserve">Hz. </w:t>
+      </w:r>
+      <w:r>
+        <w:rPr>
+          <w:lang w:val="bg-BG"/>
+        </w:rPr>
+        <w:t xml:space="preserve">Ъгъла на видимост по хоризонтала е 103°, по вертикала 77°, а по хоризонтала 128°. </w:t>
+      </w:r>
+      <w:r>
+        <w:rPr>
+          <w:lang w:val="en-US"/>
+        </w:rPr>
+        <w:t>[3]</w:t>
+      </w:r>
+    </w:p>
+    <w:p>
+      <w:pPr>
+        <w:pStyle w:val="Normal"/>
+        <w:bidi w:val="0"/>
+        <w:spacing w:lineRule="auto" w:line="360"/>
+        <w:rPr>
+          <w:lang w:val="en-US"/>
+        </w:rPr>
+      </w:pPr>
+      <w:r>
+        <w:rPr>
+          <w:lang w:val="bg-BG"/>
+        </w:rPr>
+        <w:t>Очилата имат два инфрачервени сензора като всеки един от тях следи по едно око. Резолюцията на един от тях е 192</w:t>
+      </w:r>
+      <w:r>
+        <w:rPr>
+          <w:lang w:val="en-US"/>
+        </w:rPr>
+        <w:t>px</w:t>
+      </w:r>
+      <w:r>
+        <w:rPr>
+          <w:lang w:val="bg-BG"/>
+        </w:rPr>
+        <w:t xml:space="preserve"> на 192</w:t>
+      </w:r>
+      <w:r>
+        <w:rPr>
+          <w:lang w:val="en-US"/>
+        </w:rPr>
+        <w:t xml:space="preserve">px, </w:t>
+      </w:r>
+      <w:r>
+        <w:rPr>
+          <w:lang w:val="bg-BG"/>
+        </w:rPr>
+        <w:t>а работната честота е 200</w:t>
+      </w:r>
+      <w:r>
+        <w:rPr>
+          <w:lang w:val="en-US"/>
+        </w:rPr>
+        <w:t>Hz. [3]</w:t>
+      </w:r>
+    </w:p>
+    <w:p>
+      <w:pPr>
+        <w:pStyle w:val="Normal"/>
+        <w:bidi w:val="0"/>
+        <w:spacing w:lineRule="auto" w:line="360"/>
+        <w:rPr>
+          <w:lang w:val="bg-BG" w:eastAsia="en-US" w:bidi="ar-SA"/>
+        </w:rPr>
+      </w:pPr>
+      <w:r>
+        <w:rPr>
+          <w:lang w:val="bg-BG" w:eastAsia="en-US" w:bidi="ar-SA"/>
+        </w:rPr>
+        <w:t>Друга важна характеристика е инерциалния измервателен модул. Той разполага с акселерометър, магнитометър и жироскоп.</w:t>
+      </w:r>
+      <w:r>
+        <w:rPr>
+          <w:lang w:val="en-US" w:eastAsia="en-US" w:bidi="ar-SA"/>
+        </w:rPr>
+        <w:t xml:space="preserve"> </w:t>
+      </w:r>
+      <w:r>
+        <w:rPr>
+          <w:lang w:val="bg-BG" w:eastAsia="en-US" w:bidi="ar-SA"/>
+        </w:rPr>
+        <w:t>Благодарение на него, движенията на главата се записват с честота 110</w:t>
+      </w:r>
+      <w:r>
+        <w:rPr>
+          <w:lang w:val="en-US" w:eastAsia="en-US" w:bidi="ar-SA"/>
+        </w:rPr>
+        <w:t>Hz</w:t>
+      </w:r>
+      <w:r>
+        <w:rPr>
+          <w:lang w:val="bg-BG" w:eastAsia="en-US" w:bidi="ar-SA"/>
         </w:rPr>
         <w:t xml:space="preserve">. </w:t>
       </w:r>
       <w:r>
         <w:rPr>
-          <w:lang w:val="bg-BG"/>
-        </w:rPr>
-        <w:t xml:space="preserve">Разполага с камера, която гледа напред и записва това, което вижда човека, който ги носи. </w:t>
+          <w:lang w:val="en-US" w:eastAsia="en-US" w:bidi="ar-SA"/>
+        </w:rPr>
+        <w:t>[3]</w:t>
+      </w:r>
+    </w:p>
+    <w:p>
+      <w:pPr>
+        <w:pStyle w:val="Normal"/>
+        <w:bidi w:val="0"/>
+        <w:spacing w:lineRule="auto" w:line="360"/>
+        <w:rPr>
+          <w:lang w:val="bg-BG" w:eastAsia="en-US" w:bidi="ar-SA"/>
+        </w:rPr>
+      </w:pPr>
+      <w:r>
+        <w:rPr>
+          <w:lang w:val="bg-BG" w:eastAsia="en-US" w:bidi="ar-SA"/>
+        </w:rPr>
+        <w:t xml:space="preserve">Друго, с което разполагат очилата е два стерео микрофона, но те не са използвани по време на събирането на данните. </w:t>
+      </w:r>
+      <w:r>
+        <w:rPr>
+          <w:lang w:val="en-US" w:eastAsia="en-US" w:bidi="ar-SA"/>
+        </w:rPr>
+        <w:t>[3]</w:t>
+      </w:r>
+    </w:p>
+    <w:p>
+      <w:pPr>
+        <w:pStyle w:val="Normal"/>
+        <w:bidi w:val="0"/>
+        <w:spacing w:lineRule="auto" w:line="360"/>
+        <w:rPr>
+          <w:lang w:val="en-US" w:eastAsia="en-US" w:bidi="ar-SA"/>
+        </w:rPr>
+      </w:pPr>
+      <w:r>
+        <w:rPr>
+          <w:lang w:val="en-US" w:eastAsia="en-US" w:bidi="ar-SA"/>
+        </w:rPr>
+        <w:t xml:space="preserve">NeoNet </w:t>
+      </w:r>
+      <w:r>
+        <w:rPr>
+          <w:lang w:val="bg-BG" w:eastAsia="en-US" w:bidi="ar-SA"/>
+        </w:rPr>
+        <w:t xml:space="preserve">е името на машинно обучения модел, на който се подават данните от инфрачервените камери. Именно той връща информацията за поглед, мигания, диаметър на зеницата, ориентация и позиция на очите и отвор на клепача. </w:t>
+      </w:r>
+      <w:r>
+        <w:rPr>
+          <w:lang w:val="en-US" w:eastAsia="en-US" w:bidi="ar-SA"/>
+        </w:rPr>
+        <w:t>[4]</w:t>
+      </w:r>
+    </w:p>
+    <w:p>
+      <w:pPr>
+        <w:pStyle w:val="Normal"/>
+        <w:bidi w:val="0"/>
+        <w:spacing w:lineRule="auto" w:line="360"/>
+        <w:rPr>
+          <w:lang w:val="bg-BG" w:eastAsia="en-US" w:bidi="ar-SA"/>
+        </w:rPr>
+      </w:pPr>
+      <w:r>
+        <w:rPr>
+          <w:lang w:val="bg-BG" w:eastAsia="en-US" w:bidi="ar-SA"/>
+        </w:rPr>
+        <w:t xml:space="preserve">Очилата разполагат с </w:t>
+      </w:r>
+      <w:r>
+        <w:rPr>
+          <w:lang w:val="en-US" w:eastAsia="en-US" w:bidi="ar-SA"/>
+        </w:rPr>
+        <w:t xml:space="preserve">USB-C 2.0 </w:t>
+      </w:r>
+      <w:r>
+        <w:rPr>
+          <w:lang w:val="bg-BG" w:eastAsia="en-US" w:bidi="ar-SA"/>
+        </w:rPr>
+        <w:t xml:space="preserve">порт за зареждане и предаване на данните в реално време към мобилното приложение – </w:t>
+      </w:r>
+      <w:r>
+        <w:rPr>
+          <w:lang w:val="en-US" w:eastAsia="en-US" w:bidi="ar-SA"/>
+        </w:rPr>
+        <w:t>Neon Companion [3]</w:t>
+      </w:r>
+    </w:p>
+    <w:p>
+      <w:pPr>
+        <w:pStyle w:val="Normal"/>
+        <w:bidi w:val="0"/>
+        <w:spacing w:lineRule="auto" w:line="360"/>
+        <w:rPr>
+          <w:lang w:val="en-US" w:eastAsia="en-US" w:bidi="ar-SA"/>
+        </w:rPr>
+      </w:pPr>
+      <w:r>
+        <w:rPr>
+          <w:lang w:val="en-US" w:eastAsia="en-US" w:bidi="ar-SA"/>
+        </w:rPr>
+        <w:t xml:space="preserve">Neon Companion </w:t>
+      </w:r>
+      <w:r>
+        <w:rPr>
+          <w:lang w:val="bg-BG" w:eastAsia="en-US" w:bidi="ar-SA"/>
+        </w:rPr>
+        <w:t>е мобилно приложение, което позволява да се гледа запис в по време на записването му. Като допълнително могат да се видят и позицията на очите, както и записите от камерите, които ги заснемат. След като приключи записът приложението позволява той да бъде качен във P</w:t>
+      </w:r>
+      <w:r>
+        <w:rPr>
+          <w:lang w:val="en-US" w:eastAsia="en-US" w:bidi="ar-SA"/>
+        </w:rPr>
+        <w:t>upil Cloud. [5]</w:t>
+      </w:r>
+    </w:p>
+    <w:p>
+      <w:pPr>
+        <w:pStyle w:val="Normal"/>
+        <w:bidi w:val="0"/>
+        <w:spacing w:lineRule="auto" w:line="360"/>
+        <w:rPr>
+          <w:lang w:val="en-US" w:eastAsia="en-US" w:bidi="ar-SA"/>
+        </w:rPr>
+      </w:pPr>
+      <w:r>
+        <w:rPr>
+          <w:lang w:val="bg-BG" w:eastAsia="en-US" w:bidi="ar-SA"/>
+        </w:rPr>
+        <w:t>P</w:t>
+      </w:r>
+      <w:r>
+        <w:rPr>
+          <w:lang w:val="en-US" w:eastAsia="en-US" w:bidi="ar-SA"/>
+        </w:rPr>
+        <w:t xml:space="preserve">upil Cloud </w:t>
+      </w:r>
+      <w:r>
+        <w:rPr>
+          <w:lang w:val="bg-BG" w:eastAsia="en-US" w:bidi="ar-SA"/>
+        </w:rPr>
+        <w:t xml:space="preserve">позволява запазването на записите на едно място, както и допълнителната им обработка и визуализация. </w:t>
+      </w:r>
+      <w:r>
+        <w:rPr>
+          <w:lang w:val="en-US" w:eastAsia="en-US" w:bidi="ar-SA"/>
+        </w:rPr>
+        <w:t>[5]</w:t>
       </w:r>
       <w:r>
         <w:br w:type="page"/>
@@ -3670,8 +3731,6 @@
           <w:lang w:val="bg-BG" w:eastAsia="en-US" w:bidi="ar-SA"/>
         </w:rPr>
       </w:pPr>
-      <w:bookmarkStart w:id="7" w:name="__RefHeading___Toc969_4158184810"/>
-      <w:bookmarkEnd w:id="7"/>
       <w:r>
         <w:rPr>
           <w:b/>
@@ -3681,6 +3740,92 @@
           <w:lang w:val="bg-BG" w:eastAsia="en-US" w:bidi="ar-SA"/>
         </w:rPr>
         <w:t>Софтуер за класифициране на данните</w:t>
+      </w:r>
+    </w:p>
+    <w:p>
+      <w:pPr>
+        <w:pStyle w:val="Normal"/>
+        <w:bidi w:val="0"/>
+        <w:spacing w:lineRule="auto" w:line="360"/>
+        <w:rPr>
+          <w:lang w:val="bg-BG" w:eastAsia="en-US" w:bidi="ar-SA"/>
+        </w:rPr>
+      </w:pPr>
+      <w:r>
+        <w:rPr>
+          <w:lang w:val="bg-BG" w:eastAsia="en-US" w:bidi="ar-SA"/>
+        </w:rPr>
+        <w:t xml:space="preserve">След събирането на данните, те трябва да бъдат категоризирани. </w:t>
+      </w:r>
+      <w:r>
+        <w:rPr>
+          <w:lang w:val="bg-BG" w:eastAsia="en-US" w:bidi="ar-SA"/>
+        </w:rPr>
+        <w:t>Ч</w:t>
+      </w:r>
+      <w:r>
+        <w:rPr>
+          <w:lang w:val="bg-BG" w:eastAsia="en-US" w:bidi="ar-SA"/>
+        </w:rPr>
+        <w:t xml:space="preserve">аст от данните </w:t>
+      </w:r>
+      <w:r>
+        <w:rPr>
+          <w:lang w:val="bg-BG" w:eastAsia="en-US" w:bidi="ar-SA"/>
+        </w:rPr>
+        <w:t>се очаква да бъдат</w:t>
+      </w:r>
+      <w:r>
+        <w:rPr>
+          <w:lang w:val="bg-BG" w:eastAsia="en-US" w:bidi="ar-SA"/>
+        </w:rPr>
+        <w:t xml:space="preserve"> категоризирани на ръка, а след събирането на достатъчно голям брой категоризирани данни, да се създаде модел за машинно обучение, който с достатъчно голяма точност да успява да категоризира данните от един запис, а потребителя само да поправя грешките. За целта е нужно приложение, което позволява не само лесното добавяне на събития, но и тяхното редактиране. </w:t>
+      </w:r>
+    </w:p>
+    <w:p>
+      <w:pPr>
+        <w:pStyle w:val="Normal"/>
+        <w:bidi w:val="0"/>
+        <w:spacing w:lineRule="auto" w:line="360"/>
+        <w:rPr>
+          <w:lang w:val="bg-BG" w:eastAsia="en-US" w:bidi="ar-SA"/>
+        </w:rPr>
+      </w:pPr>
+      <w:r>
+        <w:rPr>
+          <w:lang w:val="bg-BG" w:eastAsia="en-US" w:bidi="ar-SA"/>
+        </w:rPr>
+        <w:t xml:space="preserve">При търсенето на съществуващи решения, не е открито такова, което да позволява лесно модифициране на данните в нужният формат. Повечето от съществуващите решения, предлагат само платени версии, като много от тях са облачно-базирани услуги. </w:t>
+      </w:r>
+      <w:r>
+        <w:rPr>
+          <w:lang w:val="bg-BG" w:eastAsia="en-US" w:bidi="ar-SA"/>
+        </w:rPr>
+        <w:t>С цел намаляване на риска, свързан с качването на чувствителна информация (като гласовите и очните данни на участниците в експеримента) в външни облачни хранилища, както и с оглед на намаляване на разходите, е взето решение да бъде разработено</w:t>
+      </w:r>
+      <w:r>
+        <w:rPr>
+          <w:lang w:val="bg-BG" w:eastAsia="en-US" w:bidi="ar-SA"/>
+        </w:rPr>
+        <w:t xml:space="preserve"> </w:t>
+      </w:r>
+      <w:r>
+        <w:rPr>
+          <w:lang w:val="bg-BG" w:eastAsia="en-US" w:bidi="ar-SA"/>
+        </w:rPr>
+        <w:t>специализирано</w:t>
+      </w:r>
+      <w:r>
+        <w:rPr>
+          <w:lang w:val="bg-BG" w:eastAsia="en-US" w:bidi="ar-SA"/>
+        </w:rPr>
+        <w:t xml:space="preserve"> </w:t>
+      </w:r>
+      <w:r>
+        <w:rPr>
+          <w:lang w:val="bg-BG" w:eastAsia="en-US" w:bidi="ar-SA"/>
+        </w:rPr>
+        <w:t>приложение за класификация на данни.</w:t>
       </w:r>
     </w:p>
     <w:p>
@@ -3707,8 +3852,8 @@
           <w:lang w:val="bg-BG" w:eastAsia="en-US" w:bidi="ar-SA"/>
         </w:rPr>
       </w:pPr>
-      <w:bookmarkStart w:id="8" w:name="__RefHeading___Toc2735_4158184810"/>
-      <w:bookmarkEnd w:id="8"/>
+      <w:bookmarkStart w:id="7" w:name="__RefHeading___Toc2735_4158184810"/>
+      <w:bookmarkEnd w:id="7"/>
       <w:r>
         <w:rPr>
           <w:b/>
@@ -3718,6 +3863,364 @@
           <w:lang w:val="bg-BG" w:eastAsia="en-US" w:bidi="ar-SA"/>
         </w:rPr>
         <w:t>Изисквания, архитектура и организация на данните</w:t>
+      </w:r>
+    </w:p>
+    <w:p>
+      <w:pPr>
+        <w:pStyle w:val="Normal"/>
+        <w:rPr/>
+      </w:pPr>
+      <w:r>
+        <w:drawing>
+          <wp:anchor distT="0" distB="0" distL="0" distR="0" simplePos="0" relativeHeight="5" behindDoc="0" locked="0" layoutInCell="0" allowOverlap="1">
+            <wp:simplePos x="0" y="0"/>
+            <wp:positionH relativeFrom="column">
+              <wp:align>center</wp:align>
+            </wp:positionH>
+            <wp:positionV relativeFrom="paragraph">
+              <wp:posOffset>86360</wp:posOffset>
+            </wp:positionV>
+            <wp:extent cx="5939790" cy="2484755"/>
+            <wp:effectExtent l="0" t="0" r="0" b="0"/>
+            <wp:wrapTopAndBottom/>
+            <wp:docPr id="1" name="Image4"/>
+            <wp:cNvGraphicFramePr>
+              <a:graphicFrameLocks xmlns:a="http://schemas.openxmlformats.org/drawingml/2006/main" noChangeAspect="1"/>
+            </wp:cNvGraphicFramePr>
+            <a:graphic xmlns:a="http://schemas.openxmlformats.org/drawingml/2006/main">
+              <a:graphicData uri="http://schemas.openxmlformats.org/drawingml/2006/picture">
+                <pic:pic xmlns:pic="http://schemas.openxmlformats.org/drawingml/2006/picture">
+                  <pic:nvPicPr>
+                    <pic:cNvPr id="1" name="Image4"/>
+                    <pic:cNvPicPr>
+                      <a:picLocks noChangeAspect="1" noChangeArrowheads="1"/>
+                    </pic:cNvPicPr>
+                  </pic:nvPicPr>
+                  <pic:blipFill>
+                    <a:blip r:embed="rId2"/>
+                    <a:stretch>
+                      <a:fillRect/>
+                    </a:stretch>
+                  </pic:blipFill>
+                  <pic:spPr bwMode="auto">
+                    <a:xfrm>
+                      <a:off x="0" y="0"/>
+                      <a:ext cx="5939790" cy="2484755"/>
+                    </a:xfrm>
+                    <a:prstGeom prst="rect">
+                      <a:avLst/>
+                    </a:prstGeom>
+                    <a:noFill/>
+                  </pic:spPr>
+                </pic:pic>
+              </a:graphicData>
+            </a:graphic>
+          </wp:anchor>
+        </w:drawing>
+      </w:r>
+      <w:r>
+        <w:rPr/>
+        <w:tab/>
+      </w:r>
+    </w:p>
+    <w:p>
+      <w:pPr>
+        <w:pStyle w:val="Figure"/>
+        <w:ind w:hanging="0" w:left="0"/>
+        <w:jc w:val="center"/>
+        <w:rPr>
+          <w:lang w:val="bg-BG"/>
+        </w:rPr>
+      </w:pPr>
+      <w:r>
+        <w:rPr>
+          <w:lang w:val="bg-BG"/>
+        </w:rPr>
+        <w:t>Фигура 1.1. Функционални изисквания</w:t>
+      </w:r>
+    </w:p>
+    <w:p>
+      <w:pPr>
+        <w:pStyle w:val="Normal"/>
+        <w:rPr/>
+      </w:pPr>
+      <w:r>
+        <w:rPr/>
+      </w:r>
+    </w:p>
+    <w:p>
+      <w:pPr>
+        <w:pStyle w:val="Normal"/>
+        <w:rPr/>
+      </w:pPr>
+      <w:r>
+        <w:rPr/>
+      </w:r>
+    </w:p>
+    <w:p>
+      <w:pPr>
+        <w:pStyle w:val="Normal"/>
+        <w:rPr/>
+      </w:pPr>
+      <w:r>
+        <w:rPr/>
+      </w:r>
+    </w:p>
+    <w:p>
+      <w:pPr>
+        <w:pStyle w:val="Normal"/>
+        <w:rPr/>
+      </w:pPr>
+      <w:r>
+        <w:rPr/>
+      </w:r>
+    </w:p>
+    <w:p>
+      <w:pPr>
+        <w:pStyle w:val="Normal"/>
+        <w:rPr/>
+      </w:pPr>
+      <w:r>
+        <w:rPr/>
+      </w:r>
+    </w:p>
+    <w:p>
+      <w:pPr>
+        <w:pStyle w:val="Normal"/>
+        <w:rPr/>
+      </w:pPr>
+      <w:r>
+        <w:rPr/>
+        <w:drawing>
+          <wp:anchor distT="0" distB="0" distL="0" distR="0" simplePos="0" relativeHeight="6" behindDoc="0" locked="0" layoutInCell="0" allowOverlap="1">
+            <wp:simplePos x="0" y="0"/>
+            <wp:positionH relativeFrom="column">
+              <wp:posOffset>0</wp:posOffset>
+            </wp:positionH>
+            <wp:positionV relativeFrom="paragraph">
+              <wp:posOffset>-91440</wp:posOffset>
+            </wp:positionV>
+            <wp:extent cx="5939790" cy="2454275"/>
+            <wp:effectExtent l="0" t="0" r="0" b="0"/>
+            <wp:wrapTopAndBottom/>
+            <wp:docPr id="2" name="Image5"/>
+            <wp:cNvGraphicFramePr>
+              <a:graphicFrameLocks xmlns:a="http://schemas.openxmlformats.org/drawingml/2006/main" noChangeAspect="1"/>
+            </wp:cNvGraphicFramePr>
+            <a:graphic xmlns:a="http://schemas.openxmlformats.org/drawingml/2006/main">
+              <a:graphicData uri="http://schemas.openxmlformats.org/drawingml/2006/picture">
+                <pic:pic xmlns:pic="http://schemas.openxmlformats.org/drawingml/2006/picture">
+                  <pic:nvPicPr>
+                    <pic:cNvPr id="2" name="Image5"/>
+                    <pic:cNvPicPr>
+                      <a:picLocks noChangeAspect="1" noChangeArrowheads="1"/>
+                    </pic:cNvPicPr>
+                  </pic:nvPicPr>
+                  <pic:blipFill>
+                    <a:blip r:embed="rId3"/>
+                    <a:stretch>
+                      <a:fillRect/>
+                    </a:stretch>
+                  </pic:blipFill>
+                  <pic:spPr bwMode="auto">
+                    <a:xfrm>
+                      <a:off x="0" y="0"/>
+                      <a:ext cx="5939790" cy="2454275"/>
+                    </a:xfrm>
+                    <a:prstGeom prst="rect">
+                      <a:avLst/>
+                    </a:prstGeom>
+                    <a:noFill/>
+                  </pic:spPr>
+                </pic:pic>
+              </a:graphicData>
+            </a:graphic>
+          </wp:anchor>
+        </w:drawing>
+      </w:r>
+    </w:p>
+    <w:p>
+      <w:pPr>
+        <w:pStyle w:val="Figure"/>
+        <w:ind w:hanging="0" w:left="0"/>
+        <w:jc w:val="center"/>
+        <w:rPr>
+          <w:lang w:val="bg-BG"/>
+        </w:rPr>
+      </w:pPr>
+      <w:r>
+        <w:rPr>
+          <w:lang w:val="bg-BG"/>
+        </w:rPr>
+        <w:t>Фигура 1.2. Функционални изисквания</w:t>
+      </w:r>
+    </w:p>
+    <w:p>
+      <w:pPr>
+        <w:pStyle w:val="Figure"/>
+        <w:ind w:hanging="0" w:left="0"/>
+        <w:jc w:val="center"/>
+        <w:rPr>
+          <w:lang w:val="bg-BG"/>
+        </w:rPr>
+      </w:pPr>
+      <w:r>
+        <w:rPr>
+          <w:lang w:val="bg-BG"/>
+        </w:rPr>
+      </w:r>
+    </w:p>
+    <w:p>
+      <w:pPr>
+        <w:pStyle w:val="Figure"/>
+        <w:jc w:val="center"/>
+        <w:rPr>
+          <w:lang w:val="bg-BG"/>
+        </w:rPr>
+      </w:pPr>
+      <w:r>
+        <w:drawing>
+          <wp:anchor distT="0" distB="0" distL="0" distR="0" simplePos="0" relativeHeight="7" behindDoc="0" locked="0" layoutInCell="0" allowOverlap="1">
+            <wp:simplePos x="0" y="0"/>
+            <wp:positionH relativeFrom="column">
+              <wp:align>center</wp:align>
+            </wp:positionH>
+            <wp:positionV relativeFrom="paragraph">
+              <wp:posOffset>635</wp:posOffset>
+            </wp:positionV>
+            <wp:extent cx="5939790" cy="2470785"/>
+            <wp:effectExtent l="0" t="0" r="0" b="0"/>
+            <wp:wrapSquare wrapText="largest"/>
+            <wp:docPr id="3" name="Image6"/>
+            <wp:cNvGraphicFramePr>
+              <a:graphicFrameLocks xmlns:a="http://schemas.openxmlformats.org/drawingml/2006/main" noChangeAspect="1"/>
+            </wp:cNvGraphicFramePr>
+            <a:graphic xmlns:a="http://schemas.openxmlformats.org/drawingml/2006/main">
+              <a:graphicData uri="http://schemas.openxmlformats.org/drawingml/2006/picture">
+                <pic:pic xmlns:pic="http://schemas.openxmlformats.org/drawingml/2006/picture">
+                  <pic:nvPicPr>
+                    <pic:cNvPr id="3" name="Image6"/>
+                    <pic:cNvPicPr>
+                      <a:picLocks noChangeAspect="1" noChangeArrowheads="1"/>
+                    </pic:cNvPicPr>
+                  </pic:nvPicPr>
+                  <pic:blipFill>
+                    <a:blip r:embed="rId4"/>
+                    <a:stretch>
+                      <a:fillRect/>
+                    </a:stretch>
+                  </pic:blipFill>
+                  <pic:spPr bwMode="auto">
+                    <a:xfrm>
+                      <a:off x="0" y="0"/>
+                      <a:ext cx="5939790" cy="2470785"/>
+                    </a:xfrm>
+                    <a:prstGeom prst="rect">
+                      <a:avLst/>
+                    </a:prstGeom>
+                    <a:noFill/>
+                  </pic:spPr>
+                </pic:pic>
+              </a:graphicData>
+            </a:graphic>
+          </wp:anchor>
+        </w:drawing>
+      </w:r>
+      <w:r>
+        <w:rPr>
+          <w:lang w:val="bg-BG"/>
+        </w:rPr>
+        <w:br/>
+        <w:t>Фигура 1.3. Функционални изисквания</w:t>
+      </w:r>
+    </w:p>
+    <w:p>
+      <w:pPr>
+        <w:pStyle w:val="Figure"/>
+        <w:jc w:val="center"/>
+        <w:rPr>
+          <w:lang w:val="bg-BG"/>
+        </w:rPr>
+      </w:pPr>
+      <w:r>
+        <w:rPr>
+          <w:lang w:val="bg-BG"/>
+        </w:rPr>
+      </w:r>
+    </w:p>
+    <w:p>
+      <w:pPr>
+        <w:pStyle w:val="Figure"/>
+        <w:jc w:val="center"/>
+        <w:rPr>
+          <w:lang w:val="bg-BG"/>
+        </w:rPr>
+      </w:pPr>
+      <w:r>
+        <w:rPr>
+          <w:lang w:val="bg-BG"/>
+        </w:rPr>
+        <w:drawing>
+          <wp:anchor distT="0" distB="0" distL="0" distR="0" simplePos="0" relativeHeight="8" behindDoc="0" locked="0" layoutInCell="0" allowOverlap="1">
+            <wp:simplePos x="0" y="0"/>
+            <wp:positionH relativeFrom="column">
+              <wp:align>center</wp:align>
+            </wp:positionH>
+            <wp:positionV relativeFrom="paragraph">
+              <wp:posOffset>635</wp:posOffset>
+            </wp:positionV>
+            <wp:extent cx="5939790" cy="2483485"/>
+            <wp:effectExtent l="0" t="0" r="0" b="0"/>
+            <wp:wrapSquare wrapText="largest"/>
+            <wp:docPr id="4" name="Image7"/>
+            <wp:cNvGraphicFramePr>
+              <a:graphicFrameLocks xmlns:a="http://schemas.openxmlformats.org/drawingml/2006/main" noChangeAspect="1"/>
+            </wp:cNvGraphicFramePr>
+            <a:graphic xmlns:a="http://schemas.openxmlformats.org/drawingml/2006/main">
+              <a:graphicData uri="http://schemas.openxmlformats.org/drawingml/2006/picture">
+                <pic:pic xmlns:pic="http://schemas.openxmlformats.org/drawingml/2006/picture">
+                  <pic:nvPicPr>
+                    <pic:cNvPr id="4" name="Image7"/>
+                    <pic:cNvPicPr>
+                      <a:picLocks noChangeAspect="1" noChangeArrowheads="1"/>
+                    </pic:cNvPicPr>
+                  </pic:nvPicPr>
+                  <pic:blipFill>
+                    <a:blip r:embed="rId5"/>
+                    <a:stretch>
+                      <a:fillRect/>
+                    </a:stretch>
+                  </pic:blipFill>
+                  <pic:spPr bwMode="auto">
+                    <a:xfrm>
+                      <a:off x="0" y="0"/>
+                      <a:ext cx="5939790" cy="2483485"/>
+                    </a:xfrm>
+                    <a:prstGeom prst="rect">
+                      <a:avLst/>
+                    </a:prstGeom>
+                    <a:noFill/>
+                  </pic:spPr>
+                </pic:pic>
+              </a:graphicData>
+            </a:graphic>
+          </wp:anchor>
+        </w:drawing>
+      </w:r>
+    </w:p>
+    <w:p>
+      <w:pPr>
+        <w:pStyle w:val="Figure"/>
+        <w:jc w:val="center"/>
+        <w:rPr>
+          <w:lang w:val="bg-BG"/>
+        </w:rPr>
+      </w:pPr>
+      <w:r>
+        <w:rPr>
+          <w:lang w:val="bg-BG"/>
+        </w:rPr>
+        <w:t>Фигура 1.4. Функционални изисквания</w:t>
       </w:r>
     </w:p>
     <w:p>
@@ -3744,8 +4247,8 @@
           <w:lang w:val="bg-BG" w:eastAsia="en-US" w:bidi="ar-SA"/>
         </w:rPr>
       </w:pPr>
-      <w:bookmarkStart w:id="9" w:name="__RefHeading___Toc2737_4158184810"/>
-      <w:bookmarkEnd w:id="9"/>
+      <w:bookmarkStart w:id="8" w:name="__RefHeading___Toc2737_4158184810"/>
+      <w:bookmarkEnd w:id="8"/>
       <w:r>
         <w:rPr>
           <w:b/>
@@ -3781,8 +4284,8 @@
           <w:lang w:val="bg-BG" w:eastAsia="en-US" w:bidi="ar-SA"/>
         </w:rPr>
       </w:pPr>
-      <w:bookmarkStart w:id="10" w:name="__RefHeading___Toc2739_4158184810"/>
-      <w:bookmarkEnd w:id="10"/>
+      <w:bookmarkStart w:id="9" w:name="__RefHeading___Toc2739_4158184810"/>
+      <w:bookmarkEnd w:id="9"/>
       <w:r>
         <w:rPr>
           <w:b/>
@@ -3818,8 +4321,8 @@
           <w:lang w:val="bg-BG" w:eastAsia="en-US" w:bidi="ar-SA"/>
         </w:rPr>
       </w:pPr>
-      <w:bookmarkStart w:id="11" w:name="__RefHeading___Toc2741_4158184810"/>
-      <w:bookmarkEnd w:id="11"/>
+      <w:bookmarkStart w:id="10" w:name="__RefHeading___Toc2741_4158184810"/>
+      <w:bookmarkEnd w:id="10"/>
       <w:r>
         <w:rPr>
           <w:b/>
@@ -3855,8 +4358,8 @@
           <w:lang w:val="bg-BG" w:eastAsia="en-US" w:bidi="ar-SA"/>
         </w:rPr>
       </w:pPr>
-      <w:bookmarkStart w:id="12" w:name="__RefHeading___Toc2743_4158184810"/>
-      <w:bookmarkEnd w:id="12"/>
+      <w:bookmarkStart w:id="11" w:name="__RefHeading___Toc2743_4158184810"/>
+      <w:bookmarkEnd w:id="11"/>
       <w:r>
         <w:rPr>
           <w:b/>
@@ -3892,8 +4395,8 @@
           <w:lang w:val="bg-BG" w:eastAsia="en-US" w:bidi="ar-SA"/>
         </w:rPr>
       </w:pPr>
-      <w:bookmarkStart w:id="13" w:name="__RefHeading___Toc2745_4158184810"/>
-      <w:bookmarkEnd w:id="13"/>
+      <w:bookmarkStart w:id="12" w:name="__RefHeading___Toc2745_4158184810"/>
+      <w:bookmarkEnd w:id="12"/>
       <w:r>
         <w:rPr>
           <w:b/>
@@ -3961,8 +4464,8 @@
           <w:lang w:val="bg-BG" w:eastAsia="en-US" w:bidi="ar-SA"/>
         </w:rPr>
       </w:pPr>
-      <w:bookmarkStart w:id="14" w:name="__RefHeading___Toc10516_4158184810"/>
-      <w:bookmarkEnd w:id="14"/>
+      <w:bookmarkStart w:id="13" w:name="__RefHeading___Toc10516_4158184810"/>
+      <w:bookmarkEnd w:id="13"/>
       <w:r>
         <w:rPr>
           <w:b/>
@@ -3971,7 +4474,7 @@
           <w:szCs w:val="32"/>
           <w:lang w:val="bg-BG" w:eastAsia="en-US" w:bidi="ar-SA"/>
         </w:rPr>
-        <w:t>Архитектура на системата и отдалечен достъп</w:t>
+        <w:t>Среда за разработка и отдалечен достъп</w:t>
       </w:r>
     </w:p>
     <w:p>
@@ -4001,19 +4504,7 @@
         <w:rPr>
           <w:lang w:val="bg-BG"/>
         </w:rPr>
-        <w:t>Избор</w:t>
-      </w:r>
-      <w:r>
-        <w:rPr>
-          <w:lang w:val="bg-BG"/>
-        </w:rPr>
-        <w:t>ът</w:t>
-      </w:r>
-      <w:r>
-        <w:rPr>
-          <w:lang w:val="bg-BG"/>
-        </w:rPr>
-        <w:t xml:space="preserve"> да се инсталира локална инстанция на </w:t>
+        <w:t xml:space="preserve">Изборът да се инсталира локална инстанция на </w:t>
       </w:r>
       <w:r>
         <w:rPr>
@@ -4044,13 +4535,7 @@
         <w:rPr>
           <w:lang w:val="en-US"/>
         </w:rPr>
-        <w:t>Docker</w:t>
-      </w:r>
-      <w:r>
-        <w:rPr>
-          <w:lang w:val="en-US"/>
-        </w:rPr>
-        <w:t>.</w:t>
+        <w:t>Docker.</w:t>
       </w:r>
       <w:r>
         <w:rPr>
@@ -4126,8 +4611,8 @@
           <w:lang w:val="bg-BG"/>
         </w:rPr>
       </w:pPr>
-      <w:bookmarkStart w:id="15" w:name="__RefHeading___Toc2865_1987151165"/>
-      <w:bookmarkEnd w:id="15"/>
+      <w:bookmarkStart w:id="14" w:name="__RefHeading___Toc2865_1987151165"/>
+      <w:bookmarkEnd w:id="14"/>
       <w:r>
         <w:rPr>
           <w:b/>
@@ -4204,7 +4689,9 @@
       <w:pPr>
         <w:pStyle w:val="Normal"/>
         <w:spacing w:lineRule="auto" w:line="360"/>
-        <w:rPr/>
+        <w:rPr>
+          <w:lang w:val="bg-BG" w:eastAsia="en-US" w:bidi="ar-SA"/>
+        </w:rPr>
       </w:pPr>
       <w:r>
         <w:rPr>
@@ -4217,7 +4704,9 @@
       <w:pPr>
         <w:pStyle w:val="Normal"/>
         <w:spacing w:lineRule="auto" w:line="360"/>
-        <w:rPr/>
+        <w:rPr>
+          <w:lang w:val="bg-BG" w:eastAsia="en-US" w:bidi="ar-SA"/>
+        </w:rPr>
       </w:pPr>
       <w:r>
         <w:rPr>
@@ -4230,7 +4719,9 @@
       <w:pPr>
         <w:pStyle w:val="Normal"/>
         <w:spacing w:lineRule="auto" w:line="360"/>
-        <w:rPr/>
+        <w:rPr>
+          <w:lang w:val="bg-BG" w:eastAsia="en-US" w:bidi="ar-SA"/>
+        </w:rPr>
       </w:pPr>
       <w:r>
         <w:rPr>
@@ -4243,7 +4734,9 @@
       <w:pPr>
         <w:pStyle w:val="Normal"/>
         <w:spacing w:lineRule="auto" w:line="360"/>
-        <w:rPr/>
+        <w:rPr>
+          <w:lang w:val="bg-BG" w:eastAsia="en-US" w:bidi="ar-SA"/>
+        </w:rPr>
       </w:pPr>
       <w:r>
         <w:rPr>
@@ -4256,7 +4749,9 @@
       <w:pPr>
         <w:pStyle w:val="Normal"/>
         <w:spacing w:lineRule="auto" w:line="360"/>
-        <w:rPr/>
+        <w:rPr>
+          <w:lang w:val="bg-BG" w:eastAsia="en-US" w:bidi="ar-SA"/>
+        </w:rPr>
       </w:pPr>
       <w:r>
         <w:rPr>
@@ -4269,7 +4764,9 @@
       <w:pPr>
         <w:pStyle w:val="Normal"/>
         <w:spacing w:lineRule="auto" w:line="360"/>
-        <w:rPr/>
+        <w:rPr>
+          <w:lang w:val="bg-BG" w:eastAsia="en-US" w:bidi="ar-SA"/>
+        </w:rPr>
       </w:pPr>
       <w:r>
         <w:rPr>
@@ -4439,7 +4936,9 @@
         <w:pStyle w:val="Normal"/>
         <w:bidi w:val="0"/>
         <w:spacing w:lineRule="auto" w:line="360"/>
-        <w:rPr/>
+        <w:rPr>
+          <w:lang w:val="bg-BG" w:eastAsia="en-US" w:bidi="ar-SA"/>
+        </w:rPr>
       </w:pPr>
       <w:r>
         <w:rPr>
@@ -4491,19 +4990,7 @@
         <w:rPr>
           <w:lang w:val="bg-BG" w:eastAsia="en-US" w:bidi="ar-SA"/>
         </w:rPr>
-        <w:t>В конкретния случай инсталираме библиотеките python3-pip и git. Флаг</w:t>
-      </w:r>
-      <w:r>
-        <w:rPr>
-          <w:lang w:val="bg-BG" w:eastAsia="en-US" w:bidi="ar-SA"/>
-        </w:rPr>
-        <w:t>ът</w:t>
-      </w:r>
-      <w:r>
-        <w:rPr>
-          <w:lang w:val="bg-BG" w:eastAsia="en-US" w:bidi="ar-SA"/>
-        </w:rPr>
-        <w:t xml:space="preserve"> -y е добавен за да се осигури автоматично потвърждение на всички заявки по време на инсталацията. Това е необходимо при изграждането на Docker образи, тъй като процесът се изпълнява автоматизирано и не позволява интерактивен потребителски вход.</w:t>
+        <w:t>В конкретния случай инсталираме библиотеките python3-pip и git. Флагът -y е добавен за да се осигури автоматично потвърждение на всички заявки по време на инсталацията. Това е необходимо при изграждането на Docker образи, тъй като процесът се изпълнява автоматизирано и не позволява интерактивен потребителски вход.</w:t>
       </w:r>
     </w:p>
     <w:p>
@@ -4619,19 +5106,7 @@
         <w:rPr>
           <w:lang w:val="bg-BG" w:eastAsia="en-US" w:bidi="ar-SA"/>
         </w:rPr>
-        <w:t>е най-разпространения</w:t>
-      </w:r>
-      <w:r>
-        <w:rPr>
-          <w:lang w:val="bg-BG" w:eastAsia="en-US" w:bidi="ar-SA"/>
-        </w:rPr>
-        <w:t>т</w:t>
-      </w:r>
-      <w:r>
-        <w:rPr>
-          <w:lang w:val="bg-BG" w:eastAsia="en-US" w:bidi="ar-SA"/>
-        </w:rPr>
-        <w:t xml:space="preserve"> и често използван мениджър на пакети за </w:t>
+        <w:t xml:space="preserve">е най-разпространеният и често използван мениджър на пакети за </w:t>
       </w:r>
       <w:r>
         <w:rPr>
@@ -4665,19 +5140,7 @@
         <w:rPr>
           <w:lang w:val="bg-BG" w:eastAsia="en-US" w:bidi="ar-SA"/>
         </w:rPr>
-        <w:t xml:space="preserve"> </w:t>
-      </w:r>
-      <w:r>
-        <w:rPr>
-          <w:lang w:val="bg-BG" w:eastAsia="en-US" w:bidi="ar-SA"/>
-        </w:rPr>
-        <w:t>както и други такива.</w:t>
-      </w:r>
-      <w:r>
-        <w:rPr>
-          <w:lang w:val="bg-BG" w:eastAsia="en-US" w:bidi="ar-SA"/>
-        </w:rPr>
-        <w:t xml:space="preserve"> </w:t>
+        <w:t xml:space="preserve"> както и други такива. </w:t>
       </w:r>
       <w:r>
         <w:rPr>
@@ -4745,19 +5208,7 @@
         <w:rPr>
           <w:lang w:val="bg-BG" w:eastAsia="en-US" w:bidi="ar-SA"/>
         </w:rPr>
-        <w:t>Опцията –</w:t>
-      </w:r>
-      <w:r>
-        <w:rPr>
-          <w:lang w:val="bg-BG" w:eastAsia="en-US" w:bidi="ar-SA"/>
-        </w:rPr>
-        <w:t xml:space="preserve">no-cache-dir </w:t>
-      </w:r>
-      <w:r>
-        <w:rPr>
-          <w:lang w:val="bg-BG" w:eastAsia="en-US" w:bidi="ar-SA"/>
-        </w:rPr>
-        <w:t xml:space="preserve">оказва на </w:t>
+        <w:t xml:space="preserve">Опцията –no-cache-dir оказва на </w:t>
       </w:r>
       <w:r>
         <w:rPr>
@@ -4769,13 +5220,7 @@
         <w:rPr>
           <w:lang w:val="bg-BG" w:eastAsia="en-US" w:bidi="ar-SA"/>
         </w:rPr>
-        <w:t xml:space="preserve">че при инсталирането на дадените библиотеки, не биват да бъдат съхранявани никакви </w:t>
-      </w:r>
-      <w:r>
-        <w:rPr>
-          <w:lang w:val="bg-BG" w:eastAsia="en-US" w:bidi="ar-SA"/>
-        </w:rPr>
-        <w:t xml:space="preserve">кеш. </w:t>
+        <w:t xml:space="preserve">че при инсталирането на дадените библиотеки, не биват да бъдат съхранявани никакви кеш. </w:t>
       </w:r>
       <w:r>
         <w:rPr>
@@ -4834,19 +5279,7 @@
         <w:rPr>
           <w:lang w:val="bg-BG" w:eastAsia="en-US" w:bidi="ar-SA"/>
         </w:rPr>
-        <w:t xml:space="preserve"> дефинира командата по подразбиране, която се изпълнява при стартиране на контейнера. </w:t>
-      </w:r>
-      <w:r>
-        <w:rPr>
-          <w:lang w:val="bg-BG" w:eastAsia="en-US" w:bidi="ar-SA"/>
-        </w:rPr>
-        <w:t>[2]</w:t>
-      </w:r>
-      <w:r>
-        <w:rPr>
-          <w:lang w:val="bg-BG" w:eastAsia="en-US" w:bidi="ar-SA"/>
-        </w:rPr>
-        <w:t xml:space="preserve"> В конкретния случай се стартира JupyterLab сървър, който се свързва към всички мрежови интерфейси в контейнера (</w:t>
+        <w:t xml:space="preserve"> дефинира командата по подразбиране, която се изпълнява при стартиране на контейнера. [2] В конкретния случай се стартира JupyterLab сървър, който се свързва към всички мрежови интерфейси в контейнера (</w:t>
       </w:r>
       <w:r>
         <w:rPr>
@@ -5003,25 +5436,7 @@
         <w:rPr>
           <w:lang w:val="bg-BG"/>
         </w:rPr>
-        <w:t xml:space="preserve">е използван, за да </w:t>
-      </w:r>
-      <w:r>
-        <w:rPr>
-          <w:lang w:val="bg-BG"/>
-        </w:rPr>
-        <w:t xml:space="preserve">се </w:t>
-      </w:r>
-      <w:r>
-        <w:rPr>
-          <w:lang w:val="bg-BG"/>
-        </w:rPr>
-        <w:t xml:space="preserve">гарантира възпроизводимост на средата за изпълнение. </w:t>
-      </w:r>
-      <w:r>
-        <w:rPr>
-          <w:lang w:val="bg-BG"/>
-        </w:rPr>
-        <w:t>Това е така, защото в противен случай всички допълнителни команди, освен името на образът, който искаме да използваме, трябва да бъдат писани по отделно всеки път, когато контейнерът бива създаван.</w:t>
+        <w:t>е използван, за да се гарантира възпроизводимост на средата за изпълнение. Това е така, защото в противен случай всички допълнителни команди, освен името на образът, който искаме да използваме, трябва да бъдат писани по отделно всеки път, когато контейнерът бива създаван.</w:t>
       </w:r>
     </w:p>
     <w:p>
@@ -5043,19 +5458,7 @@
         <w:rPr>
           <w:lang w:val="en-US"/>
         </w:rPr>
-        <w:t>Y</w:t>
-      </w:r>
-      <w:r>
-        <w:rPr>
-          <w:lang w:val="en-US"/>
-        </w:rPr>
-        <w:t>AM</w:t>
-      </w:r>
-      <w:r>
-        <w:rPr>
-          <w:lang w:val="en-US"/>
-        </w:rPr>
-        <w:t xml:space="preserve">L </w:t>
+        <w:t xml:space="preserve">YAML </w:t>
       </w:r>
       <w:r>
         <w:rPr>
@@ -5458,13 +5861,7 @@
         <w:rPr>
           <w:lang w:val="bg-BG"/>
         </w:rPr>
-        <w:t xml:space="preserve">Елемента </w:t>
-      </w:r>
-      <w:r>
-        <w:rPr>
-          <w:lang w:val="bg-BG"/>
-        </w:rPr>
-        <w:t xml:space="preserve">services представлява набор от конфигурации за контейнерни услуги, като всяка услуга дефинира начин за създаване на един или повече контейнери. </w:t>
+        <w:t xml:space="preserve">Елемента services представлява набор от конфигурации за контейнерни услуги, като всяка услуга дефинира начин за създаване на един или повече контейнери. </w:t>
       </w:r>
       <w:r>
         <w:rPr>
@@ -5510,19 +5907,7 @@
         <w:rPr>
           <w:lang w:val="bg-BG"/>
         </w:rPr>
-        <w:t xml:space="preserve">Елемента </w:t>
-      </w:r>
-      <w:r>
-        <w:rPr>
-          <w:lang w:val="bg-BG"/>
-        </w:rPr>
-        <w:t xml:space="preserve">image </w:t>
-      </w:r>
-      <w:r>
-        <w:rPr>
-          <w:lang w:val="bg-BG"/>
-        </w:rPr>
-        <w:t xml:space="preserve">указва кой образ ще бъде използван за създаване на услугата. </w:t>
+        <w:t xml:space="preserve">Елемента image указва кой образ ще бъде използван за създаване на услугата. </w:t>
       </w:r>
       <w:r>
         <w:rPr>
@@ -5534,19 +5919,7 @@
         <w:rPr>
           <w:lang w:val="bg-BG"/>
         </w:rPr>
-        <w:t xml:space="preserve">В този случай се използва </w:t>
-      </w:r>
-      <w:r>
-        <w:rPr>
-          <w:lang w:val="bg-BG"/>
-        </w:rPr>
-        <w:t xml:space="preserve">fastai-jupyter-lab, </w:t>
-      </w:r>
-      <w:r>
-        <w:rPr>
-          <w:lang w:val="bg-BG"/>
-        </w:rPr>
-        <w:t>като това е името на образът, който бе създаден преди това</w:t>
+        <w:t>В този случай се използва fastai-jupyter-lab, като това е името на образът, който бе създаден преди това</w:t>
       </w:r>
     </w:p>
     <w:p>
@@ -5563,19 +5936,7 @@
         <w:rPr>
           <w:lang w:val="bg-BG"/>
         </w:rPr>
-        <w:t xml:space="preserve">Елемента </w:t>
-      </w:r>
-      <w:r>
-        <w:rPr>
-          <w:lang w:val="bg-BG"/>
-        </w:rPr>
-        <w:t xml:space="preserve">container_name </w:t>
-      </w:r>
-      <w:r>
-        <w:rPr>
-          <w:lang w:val="bg-BG"/>
-        </w:rPr>
-        <w:t xml:space="preserve">задава името на контейнера. </w:t>
+        <w:t xml:space="preserve">Елемента container_name задава името на контейнера. </w:t>
       </w:r>
       <w:r>
         <w:rPr>
@@ -5587,13 +5948,7 @@
         <w:rPr>
           <w:lang w:val="bg-BG"/>
         </w:rPr>
-        <w:t xml:space="preserve">Тук контейнера е същият като образа – </w:t>
-      </w:r>
-      <w:r>
-        <w:rPr>
-          <w:lang w:val="bg-BG"/>
-        </w:rPr>
-        <w:t>fastai-jupyter-lab.</w:t>
+        <w:t>Тук контейнера е същият като образа – fastai-jupyter-lab.</w:t>
       </w:r>
     </w:p>
     <w:p>
@@ -5651,13 +6006,7 @@
         <w:rPr>
           <w:lang w:val="bg-BG"/>
         </w:rPr>
-        <w:t xml:space="preserve">Елемента </w:t>
-      </w:r>
-      <w:r>
-        <w:rPr>
-          <w:lang w:val="bg-BG"/>
-        </w:rPr>
-        <w:t xml:space="preserve">volumes се използват за свързване (mount) на директории от хост системата към файловата система на контейнера, което позволява споделяне и запазване на данни между тях. </w:t>
+        <w:t xml:space="preserve">Елемента volumes се използват за свързване (mount) на директории от хост системата към файловата система на контейнера, което позволява споделяне и запазване на данни между тях. </w:t>
       </w:r>
       <w:r>
         <w:rPr>
@@ -5669,55 +6018,7 @@
         <w:rPr>
           <w:lang w:val="bg-BG"/>
         </w:rPr>
-        <w:t xml:space="preserve">В конкретния случай, можем да видим че се свързват 2 директории – директорията </w:t>
-      </w:r>
-      <w:r>
-        <w:rPr>
-          <w:lang w:val="bg-BG"/>
-        </w:rPr>
-        <w:t xml:space="preserve">../notebooks </w:t>
-      </w:r>
-      <w:r>
-        <w:rPr>
-          <w:lang w:val="bg-BG"/>
-        </w:rPr>
-        <w:t xml:space="preserve">на хост машината с директорията </w:t>
-      </w:r>
-      <w:r>
-        <w:rPr>
-          <w:lang w:val="bg-BG"/>
-        </w:rPr>
-        <w:t xml:space="preserve">/workspace/notebooks </w:t>
-      </w:r>
-      <w:r>
-        <w:rPr>
-          <w:lang w:val="bg-BG"/>
-        </w:rPr>
-        <w:t xml:space="preserve">на контейнера, и  директорията </w:t>
-      </w:r>
-      <w:r>
-        <w:rPr>
-          <w:lang w:val="bg-BG"/>
-        </w:rPr>
-        <w:t xml:space="preserve">../data </w:t>
-      </w:r>
-      <w:r>
-        <w:rPr>
-          <w:lang w:val="bg-BG"/>
-        </w:rPr>
-        <w:t xml:space="preserve">на хост машината с директорията </w:t>
-      </w:r>
-      <w:r>
-        <w:rPr>
-          <w:lang w:val="bg-BG"/>
-        </w:rPr>
-        <w:t xml:space="preserve">/workspace/data </w:t>
-      </w:r>
-      <w:r>
-        <w:rPr>
-          <w:lang w:val="bg-BG"/>
-        </w:rPr>
-        <w:t>на контейнера.</w:t>
+        <w:t>В конкретния случай, можем да видим че се свързват 2 директории – директорията ../notebooks на хост машината с директорията /workspace/notebooks на контейнера, и  директорията ../data на хост машината с директорията /workspace/data на контейнера.</w:t>
       </w:r>
     </w:p>
     <w:p>
@@ -5804,19 +6105,7 @@
         <w:rPr>
           <w:lang w:val="bg-BG"/>
         </w:rPr>
-        <w:t xml:space="preserve">Елемента reservations </w:t>
-      </w:r>
-      <w:r>
-        <w:rPr>
-          <w:lang w:val="bg-BG"/>
-        </w:rPr>
-        <w:t>у</w:t>
-      </w:r>
-      <w:r>
-        <w:rPr>
-          <w:lang w:val="bg-BG"/>
-        </w:rPr>
-        <w:t xml:space="preserve">казва на системата, че последваните дефинирани ресурси трябва да бъдат предоставени на контейнера, ако това не е възможно, контейнера няма да бъде създаден. </w:t>
+        <w:t xml:space="preserve">Елемента reservations указва на системата, че последваните дефинирани ресурси трябва да бъдат предоставени на контейнера, ако това не е възможно, контейнера няма да бъде създаден. </w:t>
       </w:r>
       <w:r>
         <w:rPr>
@@ -5839,19 +6128,7 @@
         <w:rPr>
           <w:lang w:val="bg-BG"/>
         </w:rPr>
-        <w:t xml:space="preserve">Елемента </w:t>
-      </w:r>
-      <w:r>
-        <w:rPr>
-          <w:lang w:val="bg-BG"/>
-        </w:rPr>
-        <w:t xml:space="preserve">devices </w:t>
-      </w:r>
-      <w:r>
-        <w:rPr>
-          <w:lang w:val="bg-BG"/>
-        </w:rPr>
-        <w:t xml:space="preserve">резервира определено хардуерно устройство. </w:t>
+        <w:t xml:space="preserve">Елемента devices резервира определено хардуерно устройство. </w:t>
       </w:r>
       <w:r>
         <w:rPr>
@@ -5874,19 +6151,7 @@
         <w:rPr>
           <w:lang w:val="bg-BG"/>
         </w:rPr>
-        <w:t xml:space="preserve">Елемента </w:t>
-      </w:r>
-      <w:r>
-        <w:rPr>
-          <w:lang w:val="bg-BG"/>
-        </w:rPr>
-        <w:t xml:space="preserve">capabilities </w:t>
-      </w:r>
-      <w:r>
-        <w:rPr>
-          <w:lang w:val="bg-BG"/>
-        </w:rPr>
-        <w:t xml:space="preserve">определя кое устройство точно да бъде резервирано. </w:t>
+        <w:t xml:space="preserve">Елемента capabilities определя кое устройство точно да бъде резервирано. </w:t>
       </w:r>
       <w:r>
         <w:rPr>
@@ -5981,13 +6246,14 @@
         <w:spacing w:lineRule="auto" w:line="360"/>
         <w:ind w:hanging="0" w:left="0"/>
         <w:rPr>
-          <w:lang w:val="en-US"/>
-        </w:rPr>
-      </w:pPr>
-      <w:r>
-        <w:rPr>
-          <w:lang w:val="en-US"/>
-        </w:rPr>
+          <w:lang w:val="bg-BG"/>
+        </w:rPr>
+      </w:pPr>
+      <w:r>
+        <w:rPr>
+          <w:lang w:val="bg-BG"/>
+        </w:rPr>
+        <w:t xml:space="preserve">Тъй като средата за разработка трябва да бъде достъпвана отдалечено, </w:t>
       </w:r>
       <w:r>
         <w:br w:type="page"/>
@@ -6013,8 +6279,8 @@
           <w:lang w:val="bg-BG" w:eastAsia="en-US" w:bidi="ar-SA"/>
         </w:rPr>
       </w:pPr>
-      <w:bookmarkStart w:id="16" w:name="__RefHeading___Toc5688_4158184810"/>
-      <w:bookmarkEnd w:id="16"/>
+      <w:bookmarkStart w:id="15" w:name="__RefHeading___Toc5688_4158184810"/>
+      <w:bookmarkEnd w:id="15"/>
       <w:r>
         <w:rPr>
           <w:b/>
@@ -6050,8 +6316,8 @@
           <w:lang w:val="bg-BG" w:eastAsia="en-US" w:bidi="ar-SA"/>
         </w:rPr>
       </w:pPr>
-      <w:bookmarkStart w:id="17" w:name="__RefHeading___Toc967_4158184810"/>
-      <w:bookmarkEnd w:id="17"/>
+      <w:bookmarkStart w:id="16" w:name="__RefHeading___Toc967_4158184810"/>
+      <w:bookmarkEnd w:id="16"/>
       <w:r>
         <w:rPr>
           <w:b/>
@@ -6087,8 +6353,8 @@
           <w:lang w:val="bg-BG" w:eastAsia="en-US" w:bidi="ar-SA"/>
         </w:rPr>
       </w:pPr>
-      <w:bookmarkStart w:id="18" w:name="__RefHeading___Toc5690_4158184810"/>
-      <w:bookmarkEnd w:id="18"/>
+      <w:bookmarkStart w:id="17" w:name="__RefHeading___Toc5690_4158184810"/>
+      <w:bookmarkEnd w:id="17"/>
       <w:r>
         <w:rPr>
           <w:b/>
@@ -6124,8 +6390,8 @@
           <w:lang w:val="bg-BG" w:eastAsia="en-US" w:bidi="ar-SA"/>
         </w:rPr>
       </w:pPr>
-      <w:bookmarkStart w:id="19" w:name="__RefHeading___Toc5692_4158184810"/>
-      <w:bookmarkEnd w:id="19"/>
+      <w:bookmarkStart w:id="18" w:name="__RefHeading___Toc5692_4158184810"/>
+      <w:bookmarkEnd w:id="18"/>
       <w:r>
         <w:rPr>
           <w:b/>
@@ -6193,8 +6459,8 @@
           <w:lang w:val="bg-BG" w:eastAsia="en-US" w:bidi="ar-SA"/>
         </w:rPr>
       </w:pPr>
-      <w:bookmarkStart w:id="20" w:name="__RefHeading___Toc10518_4158184810"/>
-      <w:bookmarkEnd w:id="20"/>
+      <w:bookmarkStart w:id="19" w:name="__RefHeading___Toc10518_4158184810"/>
+      <w:bookmarkEnd w:id="19"/>
       <w:r>
         <w:rPr>
           <w:b/>
@@ -6269,8 +6535,8 @@
           <w:lang w:val="bg-BG" w:eastAsia="en-US" w:bidi="ar-SA"/>
         </w:rPr>
       </w:pPr>
-      <w:bookmarkStart w:id="21" w:name="__RefHeading___Toc10520_4158184810"/>
-      <w:bookmarkEnd w:id="21"/>
+      <w:bookmarkStart w:id="20" w:name="__RefHeading___Toc10520_4158184810"/>
+      <w:bookmarkEnd w:id="20"/>
       <w:r>
         <w:rPr>
           <w:b/>
@@ -6338,8 +6604,8 @@
           <w:lang w:val="bg-BG" w:eastAsia="en-US" w:bidi="ar-SA"/>
         </w:rPr>
       </w:pPr>
-      <w:bookmarkStart w:id="22" w:name="__RefHeading___Toc5694_4158184810"/>
-      <w:bookmarkEnd w:id="22"/>
+      <w:bookmarkStart w:id="21" w:name="__RefHeading___Toc5694_4158184810"/>
+      <w:bookmarkEnd w:id="21"/>
       <w:r>
         <w:rPr>
           <w:b/>
@@ -6407,8 +6673,8 @@
           <w:lang w:val="bg-BG" w:eastAsia="en-US" w:bidi="ar-SA"/>
         </w:rPr>
       </w:pPr>
-      <w:bookmarkStart w:id="23" w:name="__RefHeading___Toc5696_4158184810"/>
-      <w:bookmarkEnd w:id="23"/>
+      <w:bookmarkStart w:id="22" w:name="__RefHeading___Toc5696_4158184810"/>
+      <w:bookmarkEnd w:id="22"/>
       <w:r>
         <w:rPr>
           <w:b/>
@@ -6476,8 +6742,8 @@
           <w:lang w:val="bg-BG" w:eastAsia="en-US" w:bidi="ar-SA"/>
         </w:rPr>
       </w:pPr>
-      <w:bookmarkStart w:id="24" w:name="__RefHeading___Toc2749_4158184810"/>
-      <w:bookmarkEnd w:id="24"/>
+      <w:bookmarkStart w:id="23" w:name="__RefHeading___Toc2749_4158184810"/>
+      <w:bookmarkEnd w:id="23"/>
       <w:r>
         <w:rPr>
           <w:b/>
@@ -6523,7 +6789,7 @@
         </w:rPr>
         <w:t xml:space="preserve">[1] </w:t>
       </w:r>
-      <w:hyperlink r:id="rId2">
+      <w:hyperlink r:id="rId6">
         <w:r>
           <w:rPr>
             <w:rStyle w:val="Hyperlink"/>
@@ -6546,7 +6812,7 @@
         </w:rPr>
         <w:t xml:space="preserve">[2] </w:t>
       </w:r>
-      <w:hyperlink r:id="rId3">
+      <w:hyperlink r:id="rId7">
         <w:r>
           <w:rPr>
             <w:rStyle w:val="Hyperlink"/>
@@ -6560,6 +6826,75 @@
       <w:pPr>
         <w:pStyle w:val="Normal"/>
         <w:rPr>
+          <w:lang w:val="en-US"/>
+        </w:rPr>
+      </w:pPr>
+      <w:r>
+        <w:rPr>
+          <w:lang w:val="en-US"/>
+        </w:rPr>
+        <w:t xml:space="preserve">[3] </w:t>
+      </w:r>
+      <w:hyperlink r:id="rId8">
+        <w:r>
+          <w:rPr>
+            <w:rStyle w:val="Hyperlink"/>
+            <w:lang w:val="en-US"/>
+          </w:rPr>
+          <w:t>https://pupil-labs.com/products/neon/specs</w:t>
+        </w:r>
+      </w:hyperlink>
+    </w:p>
+    <w:p>
+      <w:pPr>
+        <w:pStyle w:val="Normal"/>
+        <w:rPr>
+          <w:lang w:val="en-US"/>
+        </w:rPr>
+      </w:pPr>
+      <w:r>
+        <w:rPr>
+          <w:lang w:val="en-US"/>
+        </w:rPr>
+        <w:t xml:space="preserve">[4] </w:t>
+      </w:r>
+      <w:hyperlink r:id="rId9">
+        <w:r>
+          <w:rPr>
+            <w:rStyle w:val="Hyperlink"/>
+            <w:lang w:val="en-US"/>
+          </w:rPr>
+          <w:t>https://pupil-labs.com/products/neon/neonnet</w:t>
+        </w:r>
+      </w:hyperlink>
+    </w:p>
+    <w:p>
+      <w:pPr>
+        <w:pStyle w:val="Normal"/>
+        <w:rPr>
+          <w:lang w:val="en-US"/>
+        </w:rPr>
+      </w:pPr>
+      <w:r>
+        <w:rPr>
+          <w:lang w:val="en-US"/>
+        </w:rPr>
+        <w:t xml:space="preserve">[5] </w:t>
+      </w:r>
+      <w:hyperlink r:id="rId10">
+        <w:r>
+          <w:rPr>
+            <w:rStyle w:val="Hyperlink"/>
+            <w:lang w:val="en-US"/>
+          </w:rPr>
+          <w:t>https://pupil-labs.com/products/neon/software</w:t>
+        </w:r>
+      </w:hyperlink>
+    </w:p>
+    <w:p>
+      <w:pPr>
+        <w:pStyle w:val="Normal"/>
+        <w:rPr>
           <w:lang w:val="en-US" w:eastAsia="en-US" w:bidi="ar-SA"/>
         </w:rPr>
       </w:pPr>
@@ -6572,15 +6907,16 @@
     <w:p>
       <w:pPr>
         <w:pStyle w:val="Normal"/>
-        <w:rPr>
-          <w:lang w:val="bg-BG" w:eastAsia="en-US" w:bidi="ar-SA"/>
-        </w:rPr>
-      </w:pPr>
-      <w:r>
-        <w:rPr>
-          <w:lang w:val="bg-BG" w:eastAsia="en-US" w:bidi="ar-SA"/>
-        </w:rPr>
-        <w:t xml:space="preserve">7. Архитектура на системата и отдалечен достъп </w:t>
+        <w:bidi w:val="0"/>
+        <w:rPr>
+          <w:lang w:val="bg-BG" w:eastAsia="en-US" w:bidi="ar-SA"/>
+        </w:rPr>
+      </w:pPr>
+      <w:r>
+        <w:rPr>
+          <w:lang w:val="bg-BG" w:eastAsia="en-US" w:bidi="ar-SA"/>
+        </w:rPr>
+        <w:t xml:space="preserve">7. Среда за разработка и отдалечен достъп </w:t>
       </w:r>
     </w:p>
     <w:p>
@@ -6592,7 +6928,7 @@
         <w:rPr/>
         <w:t xml:space="preserve">[1] </w:t>
       </w:r>
-      <w:hyperlink r:id="rId4">
+      <w:hyperlink r:id="rId11">
         <w:r>
           <w:rPr>
             <w:rStyle w:val="Hyperlink"/>
@@ -6610,7 +6946,7 @@
         <w:rPr/>
         <w:t xml:space="preserve">[2] </w:t>
       </w:r>
-      <w:hyperlink r:id="rId5">
+      <w:hyperlink r:id="rId12">
         <w:r>
           <w:rPr>
             <w:rStyle w:val="Hyperlink"/>
@@ -6628,7 +6964,7 @@
         <w:rPr/>
         <w:t xml:space="preserve">[3] </w:t>
       </w:r>
-      <w:hyperlink r:id="rId6">
+      <w:hyperlink r:id="rId13">
         <w:r>
           <w:rPr>
             <w:rStyle w:val="Hyperlink"/>
@@ -6646,7 +6982,7 @@
         <w:rPr/>
         <w:t xml:space="preserve">[4] </w:t>
       </w:r>
-      <w:hyperlink r:id="rId7">
+      <w:hyperlink r:id="rId14">
         <w:r>
           <w:rPr>
             <w:rStyle w:val="Hyperlink"/>
@@ -6774,7 +7110,7 @@
         </w:rPr>
         <w:t xml:space="preserve">[8] </w:t>
       </w:r>
-      <w:hyperlink r:id="rId8">
+      <w:hyperlink r:id="rId15">
         <w:r>
           <w:rPr>
             <w:rStyle w:val="Hyperlink"/>
@@ -6842,7 +7178,7 @@
         </w:rPr>
         <w:t xml:space="preserve">[10] </w:t>
       </w:r>
-      <w:hyperlink r:id="rId9">
+      <w:hyperlink r:id="rId16">
         <w:r>
           <w:rPr>
             <w:rStyle w:val="Hyperlink"/>
@@ -6910,7 +7246,7 @@
         </w:rPr>
         <w:t xml:space="preserve">[12] </w:t>
       </w:r>
-      <w:hyperlink r:id="rId10">
+      <w:hyperlink r:id="rId17">
         <w:r>
           <w:rPr>
             <w:rStyle w:val="Hyperlink"/>
@@ -6933,7 +7269,7 @@
         </w:rPr>
         <w:t xml:space="preserve">[13] </w:t>
       </w:r>
-      <w:hyperlink r:id="rId11">
+      <w:hyperlink r:id="rId18">
         <w:r>
           <w:rPr>
             <w:rStyle w:val="Hyperlink"/>
@@ -7107,8 +7443,8 @@
           <w:lang w:val="bg-BG" w:eastAsia="en-US" w:bidi="ar-SA"/>
         </w:rPr>
       </w:pPr>
-      <w:bookmarkStart w:id="25" w:name="__RefHeading___Toc971_4158184810"/>
-      <w:bookmarkEnd w:id="25"/>
+      <w:bookmarkStart w:id="24" w:name="__RefHeading___Toc971_4158184810"/>
+      <w:bookmarkEnd w:id="24"/>
       <w:r>
         <w:rPr>
           <w:b/>
@@ -7118,6 +7454,266 @@
           <w:lang w:val="bg-BG" w:eastAsia="en-US" w:bidi="ar-SA"/>
         </w:rPr>
         <w:t>Приложения</w:t>
+      </w:r>
+    </w:p>
+    <w:p>
+      <w:pPr>
+        <w:pStyle w:val="Normal"/>
+        <w:numPr>
+          <w:ilvl w:val="0"/>
+          <w:numId w:val="0"/>
+        </w:numPr>
+        <w:bidi w:val="0"/>
+        <w:ind w:hanging="0" w:left="0"/>
+        <w:rPr>
+          <w:lang w:val="bg-BG" w:eastAsia="en-US" w:bidi="ar-SA"/>
+        </w:rPr>
+      </w:pPr>
+      <w:r>
+        <w:rPr>
+          <w:lang w:val="bg-BG" w:eastAsia="en-US" w:bidi="ar-SA"/>
+        </w:rPr>
+        <w:t>ПРИЛОЖЕНИЕ А</w:t>
+        <w:br/>
+        <w:t>Декларация за информирано съгласие</w:t>
+      </w:r>
+    </w:p>
+    <w:p>
+      <w:pPr>
+        <w:pStyle w:val="Normal"/>
+        <w:bidi w:val="0"/>
+        <w:ind w:hanging="0" w:left="0"/>
+        <w:rPr>
+          <w:lang w:val="bg-BG" w:eastAsia="en-US" w:bidi="ar-SA"/>
+        </w:rPr>
+      </w:pPr>
+      <w:r>
+        <w:rPr>
+          <w:lang w:val="bg-BG" w:eastAsia="en-US" w:bidi="ar-SA"/>
+        </w:rPr>
+        <w:drawing>
+          <wp:anchor distT="0" distB="0" distL="0" distR="0" simplePos="0" relativeHeight="2" behindDoc="0" locked="0" layoutInCell="0" allowOverlap="1">
+            <wp:simplePos x="0" y="0"/>
+            <wp:positionH relativeFrom="column">
+              <wp:posOffset>-99060</wp:posOffset>
+            </wp:positionH>
+            <wp:positionV relativeFrom="paragraph">
+              <wp:posOffset>12700</wp:posOffset>
+            </wp:positionV>
+            <wp:extent cx="5939790" cy="8385175"/>
+            <wp:effectExtent l="0" t="0" r="0" b="0"/>
+            <wp:wrapTopAndBottom/>
+            <wp:docPr id="5" name="Image1"/>
+            <wp:cNvGraphicFramePr>
+              <a:graphicFrameLocks xmlns:a="http://schemas.openxmlformats.org/drawingml/2006/main" noChangeAspect="1"/>
+            </wp:cNvGraphicFramePr>
+            <a:graphic xmlns:a="http://schemas.openxmlformats.org/drawingml/2006/main">
+              <a:graphicData uri="http://schemas.openxmlformats.org/drawingml/2006/picture">
+                <pic:pic xmlns:pic="http://schemas.openxmlformats.org/drawingml/2006/picture">
+                  <pic:nvPicPr>
+                    <pic:cNvPr id="5" name="Image1"/>
+                    <pic:cNvPicPr>
+                      <a:picLocks noChangeAspect="1" noChangeArrowheads="1"/>
+                    </pic:cNvPicPr>
+                  </pic:nvPicPr>
+                  <pic:blipFill>
+                    <a:blip r:embed="rId19"/>
+                    <a:stretch>
+                      <a:fillRect/>
+                    </a:stretch>
+                  </pic:blipFill>
+                  <pic:spPr bwMode="auto">
+                    <a:xfrm>
+                      <a:off x="0" y="0"/>
+                      <a:ext cx="5939790" cy="8385175"/>
+                    </a:xfrm>
+                    <a:prstGeom prst="rect">
+                      <a:avLst/>
+                    </a:prstGeom>
+                    <a:noFill/>
+                  </pic:spPr>
+                </pic:pic>
+              </a:graphicData>
+            </a:graphic>
+          </wp:anchor>
+        </w:drawing>
+      </w:r>
+      <w:r>
+        <w:br w:type="page"/>
+      </w:r>
+    </w:p>
+    <w:p>
+      <w:pPr>
+        <w:pStyle w:val="Normal"/>
+        <w:bidi w:val="0"/>
+        <w:ind w:hanging="0" w:left="0"/>
+        <w:rPr>
+          <w:lang w:val="bg-BG" w:eastAsia="en-US" w:bidi="ar-SA"/>
+        </w:rPr>
+      </w:pPr>
+      <w:r>
+        <w:rPr>
+          <w:lang w:val="bg-BG" w:eastAsia="en-US" w:bidi="ar-SA"/>
+        </w:rPr>
+        <w:drawing>
+          <wp:anchor distT="0" distB="0" distL="0" distR="0" simplePos="0" relativeHeight="3" behindDoc="0" locked="0" layoutInCell="0" allowOverlap="1">
+            <wp:simplePos x="0" y="0"/>
+            <wp:positionH relativeFrom="column">
+              <wp:posOffset>-129540</wp:posOffset>
+            </wp:positionH>
+            <wp:positionV relativeFrom="paragraph">
+              <wp:posOffset>-226695</wp:posOffset>
+            </wp:positionV>
+            <wp:extent cx="5939790" cy="8954135"/>
+            <wp:effectExtent l="0" t="0" r="0" b="0"/>
+            <wp:wrapTopAndBottom/>
+            <wp:docPr id="6" name="Image2"/>
+            <wp:cNvGraphicFramePr>
+              <a:graphicFrameLocks xmlns:a="http://schemas.openxmlformats.org/drawingml/2006/main" noChangeAspect="1"/>
+            </wp:cNvGraphicFramePr>
+            <a:graphic xmlns:a="http://schemas.openxmlformats.org/drawingml/2006/main">
+              <a:graphicData uri="http://schemas.openxmlformats.org/drawingml/2006/picture">
+                <pic:pic xmlns:pic="http://schemas.openxmlformats.org/drawingml/2006/picture">
+                  <pic:nvPicPr>
+                    <pic:cNvPr id="6" name="Image2"/>
+                    <pic:cNvPicPr>
+                      <a:picLocks noChangeAspect="1" noChangeArrowheads="1"/>
+                    </pic:cNvPicPr>
+                  </pic:nvPicPr>
+                  <pic:blipFill>
+                    <a:blip r:embed="rId20"/>
+                    <a:stretch>
+                      <a:fillRect/>
+                    </a:stretch>
+                  </pic:blipFill>
+                  <pic:spPr bwMode="auto">
+                    <a:xfrm>
+                      <a:off x="0" y="0"/>
+                      <a:ext cx="5939790" cy="8954135"/>
+                    </a:xfrm>
+                    <a:prstGeom prst="rect">
+                      <a:avLst/>
+                    </a:prstGeom>
+                    <a:noFill/>
+                  </pic:spPr>
+                </pic:pic>
+              </a:graphicData>
+            </a:graphic>
+          </wp:anchor>
+        </w:drawing>
+      </w:r>
+      <w:r>
+        <w:br w:type="page"/>
+      </w:r>
+    </w:p>
+    <w:p>
+      <w:pPr>
+        <w:pStyle w:val="Normal"/>
+        <w:bidi w:val="0"/>
+        <w:ind w:hanging="0" w:left="0"/>
+        <w:rPr>
+          <w:lang w:val="bg-BG" w:eastAsia="en-US" w:bidi="ar-SA"/>
+        </w:rPr>
+      </w:pPr>
+      <w:r>
+        <w:rPr>
+          <w:lang w:val="bg-BG" w:eastAsia="en-US" w:bidi="ar-SA"/>
+        </w:rPr>
+        <w:drawing>
+          <wp:anchor distT="0" distB="0" distL="0" distR="0" simplePos="0" relativeHeight="4" behindDoc="0" locked="0" layoutInCell="0" allowOverlap="1">
+            <wp:simplePos x="0" y="0"/>
+            <wp:positionH relativeFrom="column">
+              <wp:align>center</wp:align>
+            </wp:positionH>
+            <wp:positionV relativeFrom="paragraph">
+              <wp:posOffset>635</wp:posOffset>
+            </wp:positionV>
+            <wp:extent cx="5939790" cy="9130030"/>
+            <wp:effectExtent l="0" t="0" r="0" b="0"/>
+            <wp:wrapTopAndBottom/>
+            <wp:docPr id="7" name="Image3"/>
+            <wp:cNvGraphicFramePr>
+              <a:graphicFrameLocks xmlns:a="http://schemas.openxmlformats.org/drawingml/2006/main" noChangeAspect="1"/>
+            </wp:cNvGraphicFramePr>
+            <a:graphic xmlns:a="http://schemas.openxmlformats.org/drawingml/2006/main">
+              <a:graphicData uri="http://schemas.openxmlformats.org/drawingml/2006/picture">
+                <pic:pic xmlns:pic="http://schemas.openxmlformats.org/drawingml/2006/picture">
+                  <pic:nvPicPr>
+                    <pic:cNvPr id="7" name="Image3"/>
+                    <pic:cNvPicPr>
+                      <a:picLocks noChangeAspect="1" noChangeArrowheads="1"/>
+                    </pic:cNvPicPr>
+                  </pic:nvPicPr>
+                  <pic:blipFill>
+                    <a:blip r:embed="rId21"/>
+                    <a:stretch>
+                      <a:fillRect/>
+                    </a:stretch>
+                  </pic:blipFill>
+                  <pic:spPr bwMode="auto">
+                    <a:xfrm>
+                      <a:off x="0" y="0"/>
+                      <a:ext cx="5939790" cy="9130030"/>
+                    </a:xfrm>
+                    <a:prstGeom prst="rect">
+                      <a:avLst/>
+                    </a:prstGeom>
+                    <a:noFill/>
+                  </pic:spPr>
+                </pic:pic>
+              </a:graphicData>
+            </a:graphic>
+          </wp:anchor>
+        </w:drawing>
+      </w:r>
+      <w:r>
+        <w:br w:type="page"/>
+      </w:r>
+    </w:p>
+    <w:p>
+      <w:pPr>
+        <w:pStyle w:val="Normal"/>
+        <w:bidi w:val="0"/>
+        <w:ind w:hanging="0" w:left="0"/>
+        <w:rPr>
+          <w:lang w:val="bg-BG" w:eastAsia="en-US" w:bidi="ar-SA"/>
+        </w:rPr>
+      </w:pPr>
+      <w:r>
+        <w:rPr>
+          <w:lang w:val="bg-BG" w:eastAsia="en-US" w:bidi="ar-SA"/>
+        </w:rPr>
+      </w:r>
+    </w:p>
+    <w:p>
+      <w:pPr>
+        <w:pStyle w:val="Normal"/>
+        <w:bidi w:val="0"/>
+        <w:ind w:hanging="0" w:left="0"/>
+        <w:rPr>
+          <w:lang w:val="bg-BG" w:eastAsia="en-US" w:bidi="ar-SA"/>
+        </w:rPr>
+      </w:pPr>
+      <w:r>
+        <w:rPr>
+          <w:lang w:val="bg-BG" w:eastAsia="en-US" w:bidi="ar-SA"/>
+        </w:rPr>
+      </w:r>
+    </w:p>
+    <w:p>
+      <w:pPr>
+        <w:pStyle w:val="Normal"/>
+        <w:bidi w:val="0"/>
+        <w:spacing w:before="0" w:after="120"/>
+        <w:ind w:hanging="0" w:left="0"/>
+        <w:rPr>
+          <w:lang w:val="bg-BG" w:eastAsia="en-US" w:bidi="ar-SA"/>
+        </w:rPr>
+      </w:pPr>
+      <w:r>
+        <w:rPr>
+          <w:lang w:val="bg-BG" w:eastAsia="en-US" w:bidi="ar-SA"/>
+        </w:rPr>
       </w:r>
     </w:p>
     <w:sectPr>
@@ -7140,7 +7736,7 @@
       <w:start w:val="1"/>
       <w:numFmt w:val="none"/>
       <w:suff w:val="nothing"/>
-      <w:lvlText w:val=""/>
+      <w:lvlText w:val="%1"/>
       <w:lvlJc w:val="left"/>
       <w:pPr>
         <w:tabs>
@@ -7153,7 +7749,7 @@
       <w:start w:val="1"/>
       <w:numFmt w:val="none"/>
       <w:suff w:val="nothing"/>
-      <w:lvlText w:val=""/>
+      <w:lvlText w:val="%2"/>
       <w:lvlJc w:val="left"/>
       <w:pPr>
         <w:tabs>
@@ -7166,7 +7762,7 @@
       <w:start w:val="1"/>
       <w:numFmt w:val="none"/>
       <w:suff w:val="nothing"/>
-      <w:lvlText w:val=""/>
+      <w:lvlText w:val="%3"/>
       <w:lvlJc w:val="left"/>
       <w:pPr>
         <w:tabs>
@@ -7179,7 +7775,7 @@
       <w:start w:val="1"/>
       <w:numFmt w:val="none"/>
       <w:suff w:val="nothing"/>
-      <w:lvlText w:val=""/>
+      <w:lvlText w:val="%4"/>
       <w:lvlJc w:val="left"/>
       <w:pPr>
         <w:tabs>
@@ -7192,7 +7788,7 @@
       <w:start w:val="1"/>
       <w:numFmt w:val="none"/>
       <w:suff w:val="nothing"/>
-      <w:lvlText w:val=""/>
+      <w:lvlText w:val="%5"/>
       <w:lvlJc w:val="left"/>
       <w:pPr>
         <w:tabs>
@@ -7205,7 +7801,7 @@
       <w:start w:val="1"/>
       <w:numFmt w:val="none"/>
       <w:suff w:val="nothing"/>
-      <w:lvlText w:val=""/>
+      <w:lvlText w:val="%6"/>
       <w:lvlJc w:val="left"/>
       <w:pPr>
         <w:tabs>
@@ -7218,7 +7814,7 @@
       <w:start w:val="1"/>
       <w:numFmt w:val="none"/>
       <w:suff w:val="nothing"/>
-      <w:lvlText w:val=""/>
+      <w:lvlText w:val="%7"/>
       <w:lvlJc w:val="left"/>
       <w:pPr>
         <w:tabs>
@@ -7231,7 +7827,7 @@
       <w:start w:val="1"/>
       <w:numFmt w:val="none"/>
       <w:suff w:val="nothing"/>
-      <w:lvlText w:val=""/>
+      <w:lvlText w:val="%8"/>
       <w:lvlJc w:val="left"/>
       <w:pPr>
         <w:tabs>
@@ -7244,7 +7840,7 @@
       <w:start w:val="1"/>
       <w:numFmt w:val="none"/>
       <w:suff w:val="nothing"/>
-      <w:lvlText w:val=""/>
+      <w:lvlText w:val="%9"/>
       <w:lvlJc w:val="left"/>
       <w:pPr>
         <w:tabs>
@@ -8212,7 +8808,9 @@
     <w:pPr>
       <w:widowControl/>
       <w:suppressAutoHyphens w:val="true"/>
+      <w:kinsoku w:val="true"/>
       <w:overflowPunct w:val="false"/>
+      <w:autoSpaceDE w:val="true"/>
       <w:bidi w:val="0"/>
       <w:spacing w:lineRule="auto" w:line="240" w:before="0" w:after="120"/>
       <w:ind w:firstLine="567"/>
@@ -8835,6 +9433,36 @@
     </w:pPr>
     <w:rPr/>
   </w:style>
+  <w:style w:type="paragraph" w:styleId="TableContents">
+    <w:name w:val="Table Contents"/>
+    <w:basedOn w:val="Normal"/>
+    <w:qFormat/>
+    <w:pPr>
+      <w:widowControl w:val="false"/>
+      <w:suppressLineNumbers/>
+    </w:pPr>
+    <w:rPr/>
+  </w:style>
+  <w:style w:type="paragraph" w:styleId="UserIndex2">
+    <w:name w:val="User Index 2"/>
+    <w:basedOn w:val="Index"/>
+    <w:qFormat/>
+    <w:pPr>
+      <w:tabs>
+        <w:tab w:val="clear" w:pos="720"/>
+        <w:tab w:val="right" w:pos="9071" w:leader="dot"/>
+      </w:tabs>
+      <w:ind w:hanging="0" w:left="283"/>
+    </w:pPr>
+    <w:rPr/>
+  </w:style>
+  <w:style w:type="paragraph" w:styleId="Figure">
+    <w:name w:val="Figure"/>
+    <w:basedOn w:val="Caption"/>
+    <w:qFormat/>
+    <w:pPr/>
+    <w:rPr/>
+  </w:style>
   <w:style w:type="numbering" w:styleId="NoList">
     <w:name w:val="No List"/>
     <w:qFormat/>

</xml_diff>

<commit_message>
Working on diploma documentation.
</commit_message>
<xml_diff>
--- a/Zapiska_Georgi_Chaparov.docx
+++ b/Zapiska_Georgi_Chaparov.docx
@@ -1563,63 +1563,6 @@
           <w:sz w:val="28"/>
           <w:lang w:val="bg-BG" w:eastAsia="en-US" w:bidi="ar-SA"/>
         </w:rPr>
-      </w:r>
-    </w:p>
-    <w:p>
-      <w:pPr>
-        <w:pStyle w:val="Normal"/>
-        <w:numPr>
-          <w:ilvl w:val="0"/>
-          <w:numId w:val="9"/>
-        </w:numPr>
-        <w:spacing w:before="0" w:after="0"/>
-        <w:jc w:val="both"/>
-        <w:rPr>
-          <w:lang w:val="bg-BG" w:eastAsia="en-US" w:bidi="ar-SA"/>
-        </w:rPr>
-      </w:pPr>
-      <w:r>
-        <w:rPr>
-          <w:sz w:val="28"/>
-          <w:lang w:val="bg-BG" w:eastAsia="en-US" w:bidi="ar-SA"/>
-        </w:rPr>
-        <w:t>Тема:</w:t>
-      </w:r>
-      <w:r>
-        <w:rPr>
-          <w:lang w:val="bg-BG" w:eastAsia="en-US" w:bidi="ar-SA"/>
-        </w:rPr>
-        <w:t xml:space="preserve"> </w:t>
-      </w:r>
-    </w:p>
-    <w:p>
-      <w:pPr>
-        <w:pStyle w:val="ListParagraph"/>
-        <w:ind w:hanging="0" w:left="283"/>
-        <w:jc w:val="both"/>
-        <w:rPr>
-          <w:lang w:val="bg-BG" w:eastAsia="en-US" w:bidi="ar-SA"/>
-        </w:rPr>
-      </w:pPr>
-      <w:r>
-        <w:rPr>
-          <w:szCs w:val="24"/>
-          <w:lang w:val="bg-BG" w:eastAsia="en-US" w:bidi="ar-SA"/>
-        </w:rPr>
-        <w:t>„</w:t>
-      </w:r>
-      <w:r>
-        <w:rPr>
-          <w:lang w:val="bg-BG" w:eastAsia="en-US" w:bidi="ar-SA"/>
-        </w:rPr>
-        <w:t>Класификация на фазите на ръчен монтаж чрез мултимодални сигнали от проследяване на движенията на очите и главата</w:t>
-      </w:r>
-      <w:r>
-        <w:rPr>
-          <w:szCs w:val="24"/>
-          <w:lang w:val="bg-BG" w:eastAsia="en-US" w:bidi="ar-SA"/>
-        </w:rPr>
-        <w:t>“</w:t>
       </w:r>
     </w:p>
     <w:p>
@@ -1632,23 +1575,27 @@
         <w:spacing w:before="0" w:after="0"/>
         <w:jc w:val="both"/>
         <w:rPr>
-          <w:sz w:val="28"/>
-          <w:lang w:val="bg-BG" w:eastAsia="en-US" w:bidi="ar-SA"/>
-        </w:rPr>
-      </w:pPr>
-      <w:r>
-        <w:rPr>
-          <w:sz w:val="28"/>
-          <w:lang w:val="bg-BG" w:eastAsia="en-US" w:bidi="ar-SA"/>
-        </w:rPr>
-        <w:t>Изходни данни:</w:t>
-      </w:r>
-    </w:p>
-    <w:p>
-      <w:pPr>
-        <w:pStyle w:val="Normal"/>
-        <w:spacing w:before="0" w:after="0"/>
-        <w:ind w:hanging="0"/>
+          <w:lang w:val="bg-BG" w:eastAsia="en-US" w:bidi="ar-SA"/>
+        </w:rPr>
+      </w:pPr>
+      <w:r>
+        <w:rPr>
+          <w:sz w:val="28"/>
+          <w:lang w:val="bg-BG" w:eastAsia="en-US" w:bidi="ar-SA"/>
+        </w:rPr>
+        <w:t>Тема:</w:t>
+      </w:r>
+      <w:r>
+        <w:rPr>
+          <w:lang w:val="bg-BG" w:eastAsia="en-US" w:bidi="ar-SA"/>
+        </w:rPr>
+        <w:t xml:space="preserve"> </w:t>
+      </w:r>
+    </w:p>
+    <w:p>
+      <w:pPr>
+        <w:pStyle w:val="ListParagraph"/>
+        <w:ind w:hanging="0" w:left="283"/>
         <w:jc w:val="both"/>
         <w:rPr>
           <w:lang w:val="bg-BG" w:eastAsia="en-US" w:bidi="ar-SA"/>
@@ -1656,9 +1603,23 @@
       </w:pPr>
       <w:r>
         <w:rPr>
-          <w:lang w:val="bg-BG" w:eastAsia="en-US" w:bidi="ar-SA"/>
-        </w:rPr>
-        <w:t>Приложение, поддържащо Windows и Debian Linux, език за програмиране - Python</w:t>
+          <w:szCs w:val="24"/>
+          <w:lang w:val="bg-BG" w:eastAsia="en-US" w:bidi="ar-SA"/>
+        </w:rPr>
+        <w:t>„</w:t>
+      </w:r>
+      <w:r>
+        <w:rPr>
+          <w:lang w:val="bg-BG" w:eastAsia="en-US" w:bidi="ar-SA"/>
+        </w:rPr>
+        <w:t>Класификация на фазите на ръчен монтаж чрез мултимодални сигнали от проследяване на движенията на очите и главата</w:t>
+      </w:r>
+      <w:r>
+        <w:rPr>
+          <w:szCs w:val="24"/>
+          <w:lang w:val="bg-BG" w:eastAsia="en-US" w:bidi="ar-SA"/>
+        </w:rPr>
+        <w:t>“</w:t>
       </w:r>
     </w:p>
     <w:p>
@@ -1680,7 +1641,248 @@
           <w:sz w:val="28"/>
           <w:lang w:val="bg-BG" w:eastAsia="en-US" w:bidi="ar-SA"/>
         </w:rPr>
+        <w:t>Изходни данни:</w:t>
+      </w:r>
+    </w:p>
+    <w:p>
+      <w:pPr>
+        <w:pStyle w:val="Normal"/>
+        <w:spacing w:before="0" w:after="0"/>
+        <w:ind w:hanging="0"/>
+        <w:jc w:val="both"/>
+        <w:rPr>
+          <w:lang w:val="bg-BG" w:eastAsia="en-US" w:bidi="ar-SA"/>
+        </w:rPr>
+      </w:pPr>
+      <w:r>
+        <w:rPr>
+          <w:lang w:val="bg-BG" w:eastAsia="en-US" w:bidi="ar-SA"/>
+        </w:rPr>
+        <w:t>Приложение, поддържащо Windows и Debian Linux, език за програмиране - Python</w:t>
+      </w:r>
+    </w:p>
+    <w:p>
+      <w:pPr>
+        <w:pStyle w:val="Normal"/>
+        <w:numPr>
+          <w:ilvl w:val="0"/>
+          <w:numId w:val="12"/>
+        </w:numPr>
+        <w:spacing w:before="0" w:after="0"/>
+        <w:jc w:val="both"/>
+        <w:rPr>
+          <w:sz w:val="28"/>
+          <w:lang w:val="bg-BG" w:eastAsia="en-US" w:bidi="ar-SA"/>
+        </w:rPr>
+      </w:pPr>
+      <w:r>
+        <w:rPr>
+          <w:sz w:val="28"/>
+          <w:lang w:val="bg-BG" w:eastAsia="en-US" w:bidi="ar-SA"/>
+        </w:rPr>
         <w:t>Съдържание на обяснителната записка:</w:t>
+      </w:r>
+    </w:p>
+    <w:p>
+      <w:pPr>
+        <w:pStyle w:val="Normal"/>
+        <w:numPr>
+          <w:ilvl w:val="0"/>
+          <w:numId w:val="1"/>
+        </w:numPr>
+        <w:spacing w:before="0" w:after="0"/>
+        <w:jc w:val="both"/>
+        <w:rPr>
+          <w:lang w:val="bg-BG" w:eastAsia="en-US" w:bidi="ar-SA"/>
+        </w:rPr>
+      </w:pPr>
+      <w:r>
+        <w:rPr>
+          <w:lang w:val="bg-BG" w:eastAsia="en-US" w:bidi="ar-SA"/>
+        </w:rPr>
+        <w:t>Анотация</w:t>
+      </w:r>
+    </w:p>
+    <w:p>
+      <w:pPr>
+        <w:pStyle w:val="Normal"/>
+        <w:numPr>
+          <w:ilvl w:val="0"/>
+          <w:numId w:val="1"/>
+        </w:numPr>
+        <w:spacing w:before="0" w:after="0"/>
+        <w:jc w:val="both"/>
+        <w:rPr>
+          <w:lang w:val="bg-BG" w:eastAsia="en-US" w:bidi="ar-SA"/>
+        </w:rPr>
+      </w:pPr>
+      <w:r>
+        <w:rPr>
+          <w:lang w:val="bg-BG" w:eastAsia="en-US" w:bidi="ar-SA"/>
+        </w:rPr>
+        <w:t>Увод</w:t>
+      </w:r>
+    </w:p>
+    <w:p>
+      <w:pPr>
+        <w:pStyle w:val="Normal"/>
+        <w:numPr>
+          <w:ilvl w:val="0"/>
+          <w:numId w:val="1"/>
+        </w:numPr>
+        <w:spacing w:before="0" w:after="0"/>
+        <w:jc w:val="both"/>
+        <w:rPr>
+          <w:lang w:val="bg-BG" w:eastAsia="en-US" w:bidi="ar-SA"/>
+        </w:rPr>
+      </w:pPr>
+      <w:r>
+        <w:rPr>
+          <w:lang w:val="bg-BG" w:eastAsia="en-US" w:bidi="ar-SA"/>
+        </w:rPr>
+        <w:t>Обзор на съществуващите решения. Изводи. Цел и задачи.</w:t>
+      </w:r>
+    </w:p>
+    <w:p>
+      <w:pPr>
+        <w:pStyle w:val="Normal"/>
+        <w:numPr>
+          <w:ilvl w:val="0"/>
+          <w:numId w:val="1"/>
+        </w:numPr>
+        <w:spacing w:before="0" w:after="0"/>
+        <w:jc w:val="both"/>
+        <w:rPr>
+          <w:lang w:val="bg-BG" w:eastAsia="en-US" w:bidi="ar-SA"/>
+        </w:rPr>
+      </w:pPr>
+      <w:r>
+        <w:rPr>
+          <w:lang w:val="bg-BG" w:eastAsia="en-US" w:bidi="ar-SA"/>
+        </w:rPr>
+        <w:t>.............................................................</w:t>
+      </w:r>
+    </w:p>
+    <w:p>
+      <w:pPr>
+        <w:pStyle w:val="Normal"/>
+        <w:numPr>
+          <w:ilvl w:val="0"/>
+          <w:numId w:val="1"/>
+        </w:numPr>
+        <w:spacing w:before="0" w:after="0"/>
+        <w:jc w:val="both"/>
+        <w:rPr>
+          <w:lang w:val="bg-BG" w:eastAsia="en-US" w:bidi="ar-SA"/>
+        </w:rPr>
+      </w:pPr>
+      <w:r>
+        <w:rPr>
+          <w:lang w:val="bg-BG" w:eastAsia="en-US" w:bidi="ar-SA"/>
+        </w:rPr>
+        <w:t>.............................................................</w:t>
+      </w:r>
+    </w:p>
+    <w:p>
+      <w:pPr>
+        <w:pStyle w:val="Normal"/>
+        <w:numPr>
+          <w:ilvl w:val="0"/>
+          <w:numId w:val="1"/>
+        </w:numPr>
+        <w:spacing w:before="0" w:after="0"/>
+        <w:jc w:val="both"/>
+        <w:rPr>
+          <w:lang w:val="bg-BG" w:eastAsia="en-US" w:bidi="ar-SA"/>
+        </w:rPr>
+      </w:pPr>
+      <w:r>
+        <w:rPr>
+          <w:lang w:val="bg-BG" w:eastAsia="en-US" w:bidi="ar-SA"/>
+        </w:rPr>
+        <w:t>.............................................................</w:t>
+      </w:r>
+    </w:p>
+    <w:p>
+      <w:pPr>
+        <w:pStyle w:val="Normal"/>
+        <w:numPr>
+          <w:ilvl w:val="0"/>
+          <w:numId w:val="1"/>
+        </w:numPr>
+        <w:spacing w:before="0" w:after="0"/>
+        <w:jc w:val="both"/>
+        <w:rPr>
+          <w:lang w:val="bg-BG" w:eastAsia="en-US" w:bidi="ar-SA"/>
+        </w:rPr>
+      </w:pPr>
+      <w:r>
+        <w:rPr>
+          <w:lang w:val="bg-BG" w:eastAsia="en-US" w:bidi="ar-SA"/>
+        </w:rPr>
+        <w:t>Основни резултати. Изводи и препоръки.</w:t>
+      </w:r>
+    </w:p>
+    <w:p>
+      <w:pPr>
+        <w:pStyle w:val="Normal"/>
+        <w:numPr>
+          <w:ilvl w:val="0"/>
+          <w:numId w:val="1"/>
+        </w:numPr>
+        <w:spacing w:before="0" w:after="0"/>
+        <w:jc w:val="both"/>
+        <w:rPr>
+          <w:lang w:val="bg-BG" w:eastAsia="en-US" w:bidi="ar-SA"/>
+        </w:rPr>
+      </w:pPr>
+      <w:r>
+        <w:rPr>
+          <w:lang w:val="bg-BG" w:eastAsia="en-US" w:bidi="ar-SA"/>
+        </w:rPr>
+        <w:t>Използвана литература</w:t>
+      </w:r>
+    </w:p>
+    <w:p>
+      <w:pPr>
+        <w:pStyle w:val="Normal"/>
+        <w:numPr>
+          <w:ilvl w:val="0"/>
+          <w:numId w:val="1"/>
+        </w:numPr>
+        <w:spacing w:before="0" w:after="0"/>
+        <w:jc w:val="both"/>
+        <w:rPr>
+          <w:lang w:val="bg-BG" w:eastAsia="en-US" w:bidi="ar-SA"/>
+        </w:rPr>
+      </w:pPr>
+      <w:r>
+        <w:rPr>
+          <w:lang w:val="bg-BG" w:eastAsia="en-US" w:bidi="ar-SA"/>
+        </w:rPr>
+        <w:t>Приложения</w:t>
+      </w:r>
+    </w:p>
+    <w:p>
+      <w:pPr>
+        <w:pStyle w:val="Normal"/>
+        <w:numPr>
+          <w:ilvl w:val="0"/>
+          <w:numId w:val="13"/>
+        </w:numPr>
+        <w:spacing w:before="0" w:after="0"/>
+        <w:jc w:val="both"/>
+        <w:rPr>
+          <w:sz w:val="28"/>
+          <w:lang w:val="bg-BG" w:eastAsia="en-US" w:bidi="ar-SA"/>
+        </w:rPr>
+      </w:pPr>
+      <w:r>
+        <w:rPr>
+          <w:sz w:val="28"/>
+          <w:lang w:val="bg-BG" w:eastAsia="en-US" w:bidi="ar-SA"/>
+        </w:rPr>
+        <w:t>Съдържание на графичната част:</w:t>
       </w:r>
     </w:p>
     <w:p>
@@ -1700,7 +1902,7 @@
         <w:rPr>
           <w:lang w:val="bg-BG" w:eastAsia="en-US" w:bidi="ar-SA"/>
         </w:rPr>
-        <w:t>Анотация</w:t>
+        <w:t>.............................................................</w:t>
       </w:r>
     </w:p>
     <w:p>
@@ -1709,208 +1911,6 @@
         <w:numPr>
           <w:ilvl w:val="0"/>
           <w:numId w:val="2"/>
-        </w:numPr>
-        <w:spacing w:before="0" w:after="0"/>
-        <w:jc w:val="both"/>
-        <w:rPr>
-          <w:lang w:val="bg-BG" w:eastAsia="en-US" w:bidi="ar-SA"/>
-        </w:rPr>
-      </w:pPr>
-      <w:r>
-        <w:rPr>
-          <w:lang w:val="bg-BG" w:eastAsia="en-US" w:bidi="ar-SA"/>
-        </w:rPr>
-        <w:t>Увод</w:t>
-      </w:r>
-    </w:p>
-    <w:p>
-      <w:pPr>
-        <w:pStyle w:val="Normal"/>
-        <w:numPr>
-          <w:ilvl w:val="0"/>
-          <w:numId w:val="2"/>
-        </w:numPr>
-        <w:spacing w:before="0" w:after="0"/>
-        <w:jc w:val="both"/>
-        <w:rPr>
-          <w:lang w:val="bg-BG" w:eastAsia="en-US" w:bidi="ar-SA"/>
-        </w:rPr>
-      </w:pPr>
-      <w:r>
-        <w:rPr>
-          <w:lang w:val="bg-BG" w:eastAsia="en-US" w:bidi="ar-SA"/>
-        </w:rPr>
-        <w:t>Обзор на съществуващите решения. Изводи. Цел и задачи.</w:t>
-      </w:r>
-    </w:p>
-    <w:p>
-      <w:pPr>
-        <w:pStyle w:val="Normal"/>
-        <w:numPr>
-          <w:ilvl w:val="0"/>
-          <w:numId w:val="2"/>
-        </w:numPr>
-        <w:spacing w:before="0" w:after="0"/>
-        <w:jc w:val="both"/>
-        <w:rPr>
-          <w:lang w:val="bg-BG" w:eastAsia="en-US" w:bidi="ar-SA"/>
-        </w:rPr>
-      </w:pPr>
-      <w:r>
-        <w:rPr>
-          <w:lang w:val="bg-BG" w:eastAsia="en-US" w:bidi="ar-SA"/>
-        </w:rPr>
-        <w:t>.............................................................</w:t>
-      </w:r>
-    </w:p>
-    <w:p>
-      <w:pPr>
-        <w:pStyle w:val="Normal"/>
-        <w:numPr>
-          <w:ilvl w:val="0"/>
-          <w:numId w:val="2"/>
-        </w:numPr>
-        <w:spacing w:before="0" w:after="0"/>
-        <w:jc w:val="both"/>
-        <w:rPr>
-          <w:lang w:val="bg-BG" w:eastAsia="en-US" w:bidi="ar-SA"/>
-        </w:rPr>
-      </w:pPr>
-      <w:r>
-        <w:rPr>
-          <w:lang w:val="bg-BG" w:eastAsia="en-US" w:bidi="ar-SA"/>
-        </w:rPr>
-        <w:t>.............................................................</w:t>
-      </w:r>
-    </w:p>
-    <w:p>
-      <w:pPr>
-        <w:pStyle w:val="Normal"/>
-        <w:numPr>
-          <w:ilvl w:val="0"/>
-          <w:numId w:val="2"/>
-        </w:numPr>
-        <w:spacing w:before="0" w:after="0"/>
-        <w:jc w:val="both"/>
-        <w:rPr>
-          <w:lang w:val="bg-BG" w:eastAsia="en-US" w:bidi="ar-SA"/>
-        </w:rPr>
-      </w:pPr>
-      <w:r>
-        <w:rPr>
-          <w:lang w:val="bg-BG" w:eastAsia="en-US" w:bidi="ar-SA"/>
-        </w:rPr>
-        <w:t>.............................................................</w:t>
-      </w:r>
-    </w:p>
-    <w:p>
-      <w:pPr>
-        <w:pStyle w:val="Normal"/>
-        <w:numPr>
-          <w:ilvl w:val="0"/>
-          <w:numId w:val="2"/>
-        </w:numPr>
-        <w:spacing w:before="0" w:after="0"/>
-        <w:jc w:val="both"/>
-        <w:rPr>
-          <w:lang w:val="bg-BG" w:eastAsia="en-US" w:bidi="ar-SA"/>
-        </w:rPr>
-      </w:pPr>
-      <w:r>
-        <w:rPr>
-          <w:lang w:val="bg-BG" w:eastAsia="en-US" w:bidi="ar-SA"/>
-        </w:rPr>
-        <w:t>Основни резултати. Изводи и препоръки.</w:t>
-      </w:r>
-    </w:p>
-    <w:p>
-      <w:pPr>
-        <w:pStyle w:val="Normal"/>
-        <w:numPr>
-          <w:ilvl w:val="0"/>
-          <w:numId w:val="2"/>
-        </w:numPr>
-        <w:spacing w:before="0" w:after="0"/>
-        <w:jc w:val="both"/>
-        <w:rPr>
-          <w:lang w:val="bg-BG" w:eastAsia="en-US" w:bidi="ar-SA"/>
-        </w:rPr>
-      </w:pPr>
-      <w:r>
-        <w:rPr>
-          <w:lang w:val="bg-BG" w:eastAsia="en-US" w:bidi="ar-SA"/>
-        </w:rPr>
-        <w:t>Използвана литература</w:t>
-      </w:r>
-    </w:p>
-    <w:p>
-      <w:pPr>
-        <w:pStyle w:val="Normal"/>
-        <w:numPr>
-          <w:ilvl w:val="0"/>
-          <w:numId w:val="2"/>
-        </w:numPr>
-        <w:spacing w:before="0" w:after="0"/>
-        <w:jc w:val="both"/>
-        <w:rPr>
-          <w:lang w:val="bg-BG" w:eastAsia="en-US" w:bidi="ar-SA"/>
-        </w:rPr>
-      </w:pPr>
-      <w:r>
-        <w:rPr>
-          <w:lang w:val="bg-BG" w:eastAsia="en-US" w:bidi="ar-SA"/>
-        </w:rPr>
-        <w:t>Приложения</w:t>
-      </w:r>
-    </w:p>
-    <w:p>
-      <w:pPr>
-        <w:pStyle w:val="Normal"/>
-        <w:numPr>
-          <w:ilvl w:val="0"/>
-          <w:numId w:val="8"/>
-        </w:numPr>
-        <w:spacing w:before="0" w:after="0"/>
-        <w:jc w:val="both"/>
-        <w:rPr>
-          <w:sz w:val="28"/>
-          <w:lang w:val="bg-BG" w:eastAsia="en-US" w:bidi="ar-SA"/>
-        </w:rPr>
-      </w:pPr>
-      <w:r>
-        <w:rPr>
-          <w:sz w:val="28"/>
-          <w:lang w:val="bg-BG" w:eastAsia="en-US" w:bidi="ar-SA"/>
-        </w:rPr>
-        <w:t>Съдържание на графичната част:</w:t>
-      </w:r>
-    </w:p>
-    <w:p>
-      <w:pPr>
-        <w:pStyle w:val="Normal"/>
-        <w:numPr>
-          <w:ilvl w:val="0"/>
-          <w:numId w:val="3"/>
-        </w:numPr>
-        <w:spacing w:before="0" w:after="0"/>
-        <w:jc w:val="both"/>
-        <w:rPr>
-          <w:lang w:val="bg-BG" w:eastAsia="en-US" w:bidi="ar-SA"/>
-        </w:rPr>
-      </w:pPr>
-      <w:r>
-        <w:rPr>
-          <w:lang w:val="bg-BG" w:eastAsia="en-US" w:bidi="ar-SA"/>
-        </w:rPr>
-        <w:t>.............................................................</w:t>
-      </w:r>
-    </w:p>
-    <w:p>
-      <w:pPr>
-        <w:pStyle w:val="Normal"/>
-        <w:numPr>
-          <w:ilvl w:val="0"/>
-          <w:numId w:val="3"/>
         </w:numPr>
         <w:spacing w:before="0" w:after="0"/>
         <w:jc w:val="both"/>
@@ -2529,7 +2529,7 @@
     <w:p>
       <w:pPr>
         <w:pStyle w:val="Normal"/>
-        <w:overflowPunct w:val="true"/>
+        <w:overflowPunct w:val="false"/>
         <w:spacing w:lineRule="auto" w:line="278" w:before="0" w:after="160"/>
         <w:ind w:hanging="0"/>
         <w:rPr>
@@ -2563,7 +2563,7 @@
     <w:p>
       <w:pPr>
         <w:pStyle w:val="Normal"/>
-        <w:overflowPunct w:val="true"/>
+        <w:overflowPunct w:val="false"/>
         <w:spacing w:lineRule="auto" w:line="278" w:before="0" w:after="160"/>
         <w:ind w:hanging="0"/>
         <w:rPr>
@@ -2597,7 +2597,7 @@
     <w:p>
       <w:pPr>
         <w:pStyle w:val="Normal"/>
-        <w:overflowPunct w:val="true"/>
+        <w:overflowPunct w:val="false"/>
         <w:spacing w:lineRule="auto" w:line="278" w:before="0" w:after="160"/>
         <w:ind w:hanging="0"/>
         <w:rPr>
@@ -2631,7 +2631,7 @@
     <w:p>
       <w:pPr>
         <w:pStyle w:val="Normal"/>
-        <w:overflowPunct w:val="true"/>
+        <w:overflowPunct w:val="false"/>
         <w:spacing w:lineRule="auto" w:line="278" w:before="0" w:after="160"/>
         <w:ind w:hanging="0"/>
         <w:rPr>
@@ -2661,9 +2661,9 @@
         <w:keepLines/>
         <w:numPr>
           <w:ilvl w:val="0"/>
-          <w:numId w:val="4"/>
+          <w:numId w:val="3"/>
         </w:numPr>
-        <w:overflowPunct w:val="true"/>
+        <w:overflowPunct w:val="false"/>
         <w:spacing w:lineRule="auto" w:line="276" w:before="0" w:after="0"/>
         <w:ind w:hanging="357" w:left="357"/>
         <w:contextualSpacing/>
@@ -2903,7 +2903,7 @@
     <w:p>
       <w:pPr>
         <w:pStyle w:val="Normal"/>
-        <w:overflowPunct w:val="true"/>
+        <w:overflowPunct w:val="false"/>
         <w:spacing w:lineRule="auto" w:line="360" w:before="0" w:after="160"/>
         <w:ind w:hanging="0"/>
         <w:rPr>
@@ -2928,9 +2928,9 @@
         <w:keepLines/>
         <w:numPr>
           <w:ilvl w:val="0"/>
-          <w:numId w:val="4"/>
+          <w:numId w:val="3"/>
         </w:numPr>
-        <w:overflowPunct w:val="true"/>
+        <w:overflowPunct w:val="false"/>
         <w:spacing w:lineRule="auto" w:line="276" w:before="0" w:after="0"/>
         <w:ind w:hanging="357" w:left="357"/>
         <w:contextualSpacing/>
@@ -2967,7 +2967,7 @@
           <w:numId w:val="0"/>
         </w:numPr>
         <w:suppressAutoHyphens w:val="true"/>
-        <w:overflowPunct w:val="true"/>
+        <w:overflowPunct w:val="false"/>
         <w:spacing w:lineRule="auto" w:line="276" w:before="0" w:after="0"/>
         <w:ind w:hanging="357" w:left="357"/>
         <w:contextualSpacing/>
@@ -2999,9 +2999,9 @@
         <w:pStyle w:val="ListParagraph"/>
         <w:numPr>
           <w:ilvl w:val="0"/>
-          <w:numId w:val="4"/>
+          <w:numId w:val="3"/>
         </w:numPr>
-        <w:overflowPunct w:val="true"/>
+        <w:overflowPunct w:val="false"/>
         <w:spacing w:lineRule="auto" w:line="276" w:before="0" w:after="0"/>
         <w:ind w:hanging="357" w:left="357"/>
         <w:contextualSpacing/>
@@ -3036,7 +3036,7 @@
           <w:numId w:val="0"/>
         </w:numPr>
         <w:suppressAutoHyphens w:val="true"/>
-        <w:overflowPunct w:val="true"/>
+        <w:overflowPunct w:val="false"/>
         <w:spacing w:lineRule="auto" w:line="276" w:before="0" w:after="0"/>
         <w:ind w:hanging="357" w:left="357"/>
         <w:contextualSpacing/>
@@ -3068,9 +3068,9 @@
         <w:pStyle w:val="ListParagraph"/>
         <w:numPr>
           <w:ilvl w:val="0"/>
-          <w:numId w:val="4"/>
+          <w:numId w:val="3"/>
         </w:numPr>
-        <w:overflowPunct w:val="true"/>
+        <w:overflowPunct w:val="false"/>
         <w:spacing w:lineRule="auto" w:line="276" w:before="0" w:after="0"/>
         <w:ind w:hanging="357" w:left="357"/>
         <w:contextualSpacing/>
@@ -3105,7 +3105,7 @@
           <w:numId w:val="0"/>
         </w:numPr>
         <w:suppressAutoHyphens w:val="true"/>
-        <w:overflowPunct w:val="true"/>
+        <w:overflowPunct w:val="false"/>
         <w:spacing w:lineRule="auto" w:line="276" w:before="0" w:after="0"/>
         <w:ind w:hanging="357" w:left="357"/>
         <w:contextualSpacing/>
@@ -3137,9 +3137,9 @@
         <w:pStyle w:val="ListParagraph"/>
         <w:numPr>
           <w:ilvl w:val="0"/>
-          <w:numId w:val="4"/>
+          <w:numId w:val="3"/>
         </w:numPr>
-        <w:overflowPunct w:val="true"/>
+        <w:overflowPunct w:val="false"/>
         <w:spacing w:lineRule="auto" w:line="276" w:before="0" w:after="0"/>
         <w:ind w:hanging="357" w:left="357"/>
         <w:contextualSpacing/>
@@ -3230,31 +3230,7 @@
         <w:rPr>
           <w:lang w:val="bg-BG"/>
         </w:rPr>
-        <w:t xml:space="preserve">Преди началото на експеримента всеки участник заедно с организатора на експеримента трябва да се </w:t>
-      </w:r>
-      <w:r>
-        <w:rPr>
-          <w:lang w:val="bg-BG"/>
-        </w:rPr>
-        <w:t>подпишат</w:t>
-      </w:r>
-      <w:r>
-        <w:rPr>
-          <w:lang w:val="bg-BG"/>
-        </w:rPr>
-        <w:t xml:space="preserve"> на </w:t>
-      </w:r>
-      <w:r>
-        <w:rPr>
-          <w:lang w:val="bg-BG"/>
-        </w:rPr>
-        <w:t>договор, идентичен с Приложение А</w:t>
-      </w:r>
-      <w:r>
-        <w:rPr>
-          <w:lang w:val="bg-BG"/>
-        </w:rPr>
-        <w:t xml:space="preserve">. Договорът се изготвя и подписва в два еднообразни екземпляра – по един за всяка от страните. </w:t>
+        <w:t xml:space="preserve">Преди началото на експеримента всеки участник заедно с организатора на експеримента трябва да се подпишат на договор, идентичен с Приложение А. Договорът се изготвя и подписва в два еднообразни екземпляра – по един за всяка от страните. </w:t>
       </w:r>
     </w:p>
     <w:p>
@@ -3350,7 +3326,7 @@
         <w:pStyle w:val="ListParagraph"/>
         <w:numPr>
           <w:ilvl w:val="1"/>
-          <w:numId w:val="4"/>
+          <w:numId w:val="3"/>
         </w:numPr>
         <w:rPr>
           <w:b/>
@@ -3716,9 +3692,9 @@
         <w:pStyle w:val="ListParagraph"/>
         <w:numPr>
           <w:ilvl w:val="0"/>
-          <w:numId w:val="4"/>
+          <w:numId w:val="3"/>
         </w:numPr>
-        <w:overflowPunct w:val="true"/>
+        <w:overflowPunct w:val="false"/>
         <w:spacing w:lineRule="auto" w:line="276" w:before="0" w:after="0"/>
         <w:ind w:hanging="357" w:left="357"/>
         <w:contextualSpacing/>
@@ -3755,31 +3731,7 @@
         <w:rPr>
           <w:lang w:val="bg-BG" w:eastAsia="en-US" w:bidi="ar-SA"/>
         </w:rPr>
-        <w:t xml:space="preserve">След събирането на данните, те трябва да бъдат категоризирани. </w:t>
-      </w:r>
-      <w:r>
-        <w:rPr>
-          <w:lang w:val="bg-BG" w:eastAsia="en-US" w:bidi="ar-SA"/>
-        </w:rPr>
-        <w:t>Ч</w:t>
-      </w:r>
-      <w:r>
-        <w:rPr>
-          <w:lang w:val="bg-BG" w:eastAsia="en-US" w:bidi="ar-SA"/>
-        </w:rPr>
-        <w:t xml:space="preserve">аст от данните </w:t>
-      </w:r>
-      <w:r>
-        <w:rPr>
-          <w:lang w:val="bg-BG" w:eastAsia="en-US" w:bidi="ar-SA"/>
-        </w:rPr>
-        <w:t>се очаква да бъдат</w:t>
-      </w:r>
-      <w:r>
-        <w:rPr>
-          <w:lang w:val="bg-BG" w:eastAsia="en-US" w:bidi="ar-SA"/>
-        </w:rPr>
-        <w:t xml:space="preserve"> категоризирани на ръка, а след събирането на достатъчно голям брой категоризирани данни, да се създаде модел за машинно обучение, който с достатъчно голяма точност да успява да категоризира данните от един запис, а потребителя само да поправя грешките. За целта е нужно приложение, което позволява не само лесното добавяне на събития, но и тяхното редактиране. </w:t>
+        <w:t xml:space="preserve">След събирането на данните, те трябва да бъдат категоризирани. Част от данните се очаква да бъдат категоризирани на ръка, а след събирането на достатъчно голям брой категоризирани данни, да се създаде модел за машинно обучение, който с достатъчно голяма точност да успява да категоризира данните от един запис, а потребителя само да поправя грешките. За целта е нужно приложение, което позволява не само лесното добавяне на събития, но и тяхното редактиране. </w:t>
       </w:r>
     </w:p>
     <w:p>
@@ -3795,37 +3747,7 @@
         <w:rPr>
           <w:lang w:val="bg-BG" w:eastAsia="en-US" w:bidi="ar-SA"/>
         </w:rPr>
-        <w:t xml:space="preserve">При търсенето на съществуващи решения, не е открито такова, което да позволява лесно модифициране на данните в нужният формат. Повечето от съществуващите решения, предлагат само платени версии, като много от тях са облачно-базирани услуги. </w:t>
-      </w:r>
-      <w:r>
-        <w:rPr>
-          <w:lang w:val="bg-BG" w:eastAsia="en-US" w:bidi="ar-SA"/>
-        </w:rPr>
-        <w:t>С цел намаляване на риска, свързан с качването на чувствителна информация (като гласовите и очните данни на участниците в експеримента) в външни облачни хранилища, както и с оглед на намаляване на разходите, е взето решение да бъде разработено</w:t>
-      </w:r>
-      <w:r>
-        <w:rPr>
-          <w:lang w:val="bg-BG" w:eastAsia="en-US" w:bidi="ar-SA"/>
-        </w:rPr>
-        <w:t xml:space="preserve"> </w:t>
-      </w:r>
-      <w:r>
-        <w:rPr>
-          <w:lang w:val="bg-BG" w:eastAsia="en-US" w:bidi="ar-SA"/>
-        </w:rPr>
-        <w:t>специализирано</w:t>
-      </w:r>
-      <w:r>
-        <w:rPr>
-          <w:lang w:val="bg-BG" w:eastAsia="en-US" w:bidi="ar-SA"/>
-        </w:rPr>
-        <w:t xml:space="preserve"> </w:t>
-      </w:r>
-      <w:r>
-        <w:rPr>
-          <w:lang w:val="bg-BG" w:eastAsia="en-US" w:bidi="ar-SA"/>
-        </w:rPr>
-        <w:t>приложение за класификация на данни.</w:t>
+        <w:t>При търсенето на съществуващи решения, не е открито такова, което да позволява лесно модифициране на данните в нужният формат. Повечето от съществуващите решения, предлагат само платени версии, като много от тях са облачно-базирани услуги. С цел намаляване на риска, свързан с качването на чувствителна информация (като гласовите и очните данни на участниците в експеримента) в външни облачни хранилища, както и с оглед на намаляване на разходите, е взето решение да бъде разработено специализирано приложение за класификация на данни.</w:t>
       </w:r>
     </w:p>
     <w:p>
@@ -3834,10 +3756,10 @@
         <w:widowControl/>
         <w:numPr>
           <w:ilvl w:val="1"/>
-          <w:numId w:val="4"/>
+          <w:numId w:val="3"/>
         </w:numPr>
         <w:suppressAutoHyphens w:val="true"/>
-        <w:overflowPunct w:val="true"/>
+        <w:overflowPunct w:val="false"/>
         <w:bidi w:val="0"/>
         <w:spacing w:lineRule="auto" w:line="276" w:before="0" w:after="0"/>
         <w:ind w:hanging="340" w:left="1077" w:right="0"/>
@@ -3868,11 +3790,26 @@
     <w:p>
       <w:pPr>
         <w:pStyle w:val="Normal"/>
+        <w:spacing w:lineRule="auto" w:line="360"/>
+        <w:rPr>
+          <w:lang w:val="bg-BG"/>
+        </w:rPr>
+      </w:pPr>
+      <w:r>
+        <w:rPr>
+          <w:lang w:val="bg-BG"/>
+        </w:rPr>
+        <w:t>Тъй като целта на разработваното приложение е ясна и точна, а то не е главната цел на този проект, функционалните изисквания са малко и кратки.</w:t>
+      </w:r>
+    </w:p>
+    <w:p>
+      <w:pPr>
+        <w:pStyle w:val="Normal"/>
         <w:rPr/>
       </w:pPr>
       <w:r>
         <w:drawing>
-          <wp:anchor distT="0" distB="0" distL="0" distR="0" simplePos="0" relativeHeight="5" behindDoc="0" locked="0" layoutInCell="0" allowOverlap="1">
+          <wp:anchor behindDoc="0" distT="0" distB="0" distL="0" distR="0" simplePos="0" locked="0" layoutInCell="0" allowOverlap="1" relativeHeight="5">
             <wp:simplePos x="0" y="0"/>
             <wp:positionH relativeFrom="column">
               <wp:align>center</wp:align>
@@ -3883,7 +3820,7 @@
             <wp:extent cx="5939790" cy="2484755"/>
             <wp:effectExtent l="0" t="0" r="0" b="0"/>
             <wp:wrapTopAndBottom/>
-            <wp:docPr id="1" name="Image4"/>
+            <wp:docPr id="1" name="Image4" descr=""/>
             <wp:cNvGraphicFramePr>
               <a:graphicFrameLocks xmlns:a="http://schemas.openxmlformats.org/drawingml/2006/main" noChangeAspect="1"/>
             </wp:cNvGraphicFramePr>
@@ -3891,7 +3828,7 @@
               <a:graphicData uri="http://schemas.openxmlformats.org/drawingml/2006/picture">
                 <pic:pic xmlns:pic="http://schemas.openxmlformats.org/drawingml/2006/picture">
                   <pic:nvPicPr>
-                    <pic:cNvPr id="1" name="Image4"/>
+                    <pic:cNvPr id="1" name="Image4" descr=""/>
                     <pic:cNvPicPr>
                       <a:picLocks noChangeAspect="1" noChangeArrowheads="1"/>
                     </pic:cNvPicPr>
@@ -3955,44 +3892,8 @@
       </w:pPr>
       <w:r>
         <w:rPr/>
-      </w:r>
-    </w:p>
-    <w:p>
-      <w:pPr>
-        <w:pStyle w:val="Normal"/>
-        <w:rPr/>
-      </w:pPr>
-      <w:r>
-        <w:rPr/>
-      </w:r>
-    </w:p>
-    <w:p>
-      <w:pPr>
-        <w:pStyle w:val="Normal"/>
-        <w:rPr/>
-      </w:pPr>
-      <w:r>
-        <w:rPr/>
-      </w:r>
-    </w:p>
-    <w:p>
-      <w:pPr>
-        <w:pStyle w:val="Normal"/>
-        <w:rPr/>
-      </w:pPr>
-      <w:r>
-        <w:rPr/>
-      </w:r>
-    </w:p>
-    <w:p>
-      <w:pPr>
-        <w:pStyle w:val="Normal"/>
-        <w:rPr/>
-      </w:pPr>
-      <w:r>
-        <w:rPr/>
         <w:drawing>
-          <wp:anchor distT="0" distB="0" distL="0" distR="0" simplePos="0" relativeHeight="6" behindDoc="0" locked="0" layoutInCell="0" allowOverlap="1">
+          <wp:anchor behindDoc="0" distT="0" distB="0" distL="0" distR="0" simplePos="0" locked="0" layoutInCell="0" allowOverlap="1" relativeHeight="6">
             <wp:simplePos x="0" y="0"/>
             <wp:positionH relativeFrom="column">
               <wp:posOffset>0</wp:posOffset>
@@ -4003,7 +3904,7 @@
             <wp:extent cx="5939790" cy="2454275"/>
             <wp:effectExtent l="0" t="0" r="0" b="0"/>
             <wp:wrapTopAndBottom/>
-            <wp:docPr id="2" name="Image5"/>
+            <wp:docPr id="2" name="Image5" descr=""/>
             <wp:cNvGraphicFramePr>
               <a:graphicFrameLocks xmlns:a="http://schemas.openxmlformats.org/drawingml/2006/main" noChangeAspect="1"/>
             </wp:cNvGraphicFramePr>
@@ -4011,7 +3912,7 @@
               <a:graphicData uri="http://schemas.openxmlformats.org/drawingml/2006/picture">
                 <pic:pic xmlns:pic="http://schemas.openxmlformats.org/drawingml/2006/picture">
                   <pic:nvPicPr>
-                    <pic:cNvPr id="2" name="Image5"/>
+                    <pic:cNvPr id="2" name="Image5" descr=""/>
                     <pic:cNvPicPr>
                       <a:picLocks noChangeAspect="1" noChangeArrowheads="1"/>
                     </pic:cNvPicPr>
@@ -4080,7 +3981,7 @@
       </w:pPr>
       <w:r>
         <w:drawing>
-          <wp:anchor distT="0" distB="0" distL="0" distR="0" simplePos="0" relativeHeight="7" behindDoc="0" locked="0" layoutInCell="0" allowOverlap="1">
+          <wp:anchor behindDoc="0" distT="0" distB="0" distL="0" distR="0" simplePos="0" locked="0" layoutInCell="0" allowOverlap="1" relativeHeight="7">
             <wp:simplePos x="0" y="0"/>
             <wp:positionH relativeFrom="column">
               <wp:align>center</wp:align>
@@ -4091,7 +3992,7 @@
             <wp:extent cx="5939790" cy="2470785"/>
             <wp:effectExtent l="0" t="0" r="0" b="0"/>
             <wp:wrapSquare wrapText="largest"/>
-            <wp:docPr id="3" name="Image6"/>
+            <wp:docPr id="3" name="Image6" descr=""/>
             <wp:cNvGraphicFramePr>
               <a:graphicFrameLocks xmlns:a="http://schemas.openxmlformats.org/drawingml/2006/main" noChangeAspect="1"/>
             </wp:cNvGraphicFramePr>
@@ -4099,7 +4000,7 @@
               <a:graphicData uri="http://schemas.openxmlformats.org/drawingml/2006/picture">
                 <pic:pic xmlns:pic="http://schemas.openxmlformats.org/drawingml/2006/picture">
                   <pic:nvPicPr>
-                    <pic:cNvPr id="3" name="Image6"/>
+                    <pic:cNvPr id="3" name="Image6" descr=""/>
                     <pic:cNvPicPr>
                       <a:picLocks noChangeAspect="1" noChangeArrowheads="1"/>
                     </pic:cNvPicPr>
@@ -4161,7 +4062,7 @@
           <w:lang w:val="bg-BG"/>
         </w:rPr>
         <w:drawing>
-          <wp:anchor distT="0" distB="0" distL="0" distR="0" simplePos="0" relativeHeight="8" behindDoc="0" locked="0" layoutInCell="0" allowOverlap="1">
+          <wp:anchor behindDoc="0" distT="0" distB="0" distL="0" distR="0" simplePos="0" locked="0" layoutInCell="0" allowOverlap="1" relativeHeight="8">
             <wp:simplePos x="0" y="0"/>
             <wp:positionH relativeFrom="column">
               <wp:align>center</wp:align>
@@ -4172,7 +4073,7 @@
             <wp:extent cx="5939790" cy="2483485"/>
             <wp:effectExtent l="0" t="0" r="0" b="0"/>
             <wp:wrapSquare wrapText="largest"/>
-            <wp:docPr id="4" name="Image7"/>
+            <wp:docPr id="4" name="Image7" descr=""/>
             <wp:cNvGraphicFramePr>
               <a:graphicFrameLocks xmlns:a="http://schemas.openxmlformats.org/drawingml/2006/main" noChangeAspect="1"/>
             </wp:cNvGraphicFramePr>
@@ -4180,7 +4081,7 @@
               <a:graphicData uri="http://schemas.openxmlformats.org/drawingml/2006/picture">
                 <pic:pic xmlns:pic="http://schemas.openxmlformats.org/drawingml/2006/picture">
                   <pic:nvPicPr>
-                    <pic:cNvPr id="4" name="Image7"/>
+                    <pic:cNvPr id="4" name="Image7" descr=""/>
                     <pic:cNvPicPr>
                       <a:picLocks noChangeAspect="1" noChangeArrowheads="1"/>
                     </pic:cNvPicPr>
@@ -4225,14 +4126,23 @@
     </w:p>
     <w:p>
       <w:pPr>
+        <w:pStyle w:val="Normal"/>
+        <w:rPr/>
+      </w:pPr>
+      <w:r>
+        <w:rPr/>
+      </w:r>
+    </w:p>
+    <w:p>
+      <w:pPr>
         <w:pStyle w:val="ListParagraph"/>
         <w:widowControl/>
         <w:numPr>
           <w:ilvl w:val="1"/>
-          <w:numId w:val="4"/>
+          <w:numId w:val="3"/>
         </w:numPr>
         <w:suppressAutoHyphens w:val="true"/>
-        <w:overflowPunct w:val="true"/>
+        <w:overflowPunct w:val="false"/>
         <w:bidi w:val="0"/>
         <w:spacing w:lineRule="auto" w:line="276" w:before="0" w:after="0"/>
         <w:ind w:hanging="340" w:left="1077" w:right="0"/>
@@ -4262,14 +4172,86 @@
     </w:p>
     <w:p>
       <w:pPr>
+        <w:pStyle w:val="Normal"/>
+        <w:numPr>
+          <w:ilvl w:val="0"/>
+          <w:numId w:val="8"/>
+        </w:numPr>
+        <w:spacing w:lineRule="auto" w:line="360"/>
+        <w:rPr/>
+      </w:pPr>
+      <w:r>
+        <w:rPr>
+          <w:lang w:val="bg-BG"/>
+        </w:rPr>
+        <w:t xml:space="preserve">Избран е езикът за програмиране </w:t>
+      </w:r>
+      <w:r>
+        <w:rPr>
+          <w:lang w:val="en-US"/>
+        </w:rPr>
+        <w:t xml:space="preserve">Python, </w:t>
+      </w:r>
+      <w:r>
+        <w:rPr>
+          <w:lang w:val="bg-BG"/>
+        </w:rPr>
+        <w:t>поради наличието на множество библиотеки за графичен потребителски интерфейс, които позволяват бързото прототипиране и разработка.</w:t>
+      </w:r>
+    </w:p>
+    <w:p>
+      <w:pPr>
+        <w:pStyle w:val="Normal"/>
+        <w:numPr>
+          <w:ilvl w:val="0"/>
+          <w:numId w:val="8"/>
+        </w:numPr>
+        <w:spacing w:lineRule="auto" w:line="360"/>
+        <w:rPr>
+          <w:lang w:val="bg-BG"/>
+        </w:rPr>
+      </w:pPr>
+      <w:r>
+        <w:rPr>
+          <w:lang w:val="bg-BG"/>
+        </w:rPr>
+        <w:t xml:space="preserve">Като среда за програмиране е избран текстовия редактор </w:t>
+      </w:r>
+      <w:r>
+        <w:rPr>
+          <w:lang w:val="en-US"/>
+        </w:rPr>
+        <w:t xml:space="preserve">Visual Studio Code. </w:t>
+      </w:r>
+      <w:r>
+        <w:rPr>
+          <w:lang w:val="bg-BG"/>
+        </w:rPr>
+        <w:t xml:space="preserve">Това е така, тъй като поддръжката на множество модули, позволява огромна гъвкавост на големината и функционалностите на </w:t>
+      </w:r>
+      <w:r>
+        <w:rPr>
+          <w:lang w:val="en-US"/>
+        </w:rPr>
+        <w:t xml:space="preserve">Visual Studio Code, </w:t>
+      </w:r>
+      <w:r>
+        <w:rPr>
+          <w:lang w:val="bg-BG"/>
+        </w:rPr>
+        <w:t>а това от своя страна гарантира наличието на дадена функционалност, на текстовия редактор, в момента в който тя е нужна.</w:t>
+      </w:r>
+    </w:p>
+    <w:p>
+      <w:pPr>
         <w:pStyle w:val="ListParagraph"/>
         <w:widowControl/>
         <w:numPr>
           <w:ilvl w:val="1"/>
-          <w:numId w:val="4"/>
+          <w:numId w:val="3"/>
         </w:numPr>
         <w:suppressAutoHyphens w:val="true"/>
-        <w:overflowPunct w:val="true"/>
+        <w:overflowPunct w:val="false"/>
         <w:bidi w:val="0"/>
         <w:spacing w:lineRule="auto" w:line="276" w:before="0" w:after="0"/>
         <w:ind w:hanging="340" w:left="1077" w:right="0"/>
@@ -4303,10 +4285,10 @@
         <w:widowControl/>
         <w:numPr>
           <w:ilvl w:val="2"/>
-          <w:numId w:val="4"/>
+          <w:numId w:val="3"/>
         </w:numPr>
         <w:suppressAutoHyphens w:val="true"/>
-        <w:overflowPunct w:val="true"/>
+        <w:overflowPunct w:val="false"/>
         <w:bidi w:val="0"/>
         <w:spacing w:lineRule="auto" w:line="276" w:before="0" w:after="0"/>
         <w:ind w:hanging="340" w:left="1474" w:right="0"/>
@@ -4340,10 +4322,10 @@
         <w:widowControl/>
         <w:numPr>
           <w:ilvl w:val="2"/>
-          <w:numId w:val="4"/>
+          <w:numId w:val="3"/>
         </w:numPr>
         <w:suppressAutoHyphens w:val="true"/>
-        <w:overflowPunct w:val="true"/>
+        <w:overflowPunct w:val="false"/>
         <w:bidi w:val="0"/>
         <w:spacing w:lineRule="auto" w:line="276" w:before="0" w:after="0"/>
         <w:ind w:hanging="0" w:left="1134" w:right="0"/>
@@ -4377,10 +4359,10 @@
         <w:widowControl/>
         <w:numPr>
           <w:ilvl w:val="1"/>
-          <w:numId w:val="4"/>
+          <w:numId w:val="3"/>
         </w:numPr>
         <w:suppressAutoHyphens w:val="true"/>
-        <w:overflowPunct w:val="true"/>
+        <w:overflowPunct w:val="false"/>
         <w:bidi w:val="0"/>
         <w:spacing w:lineRule="auto" w:line="276" w:before="0" w:after="0"/>
         <w:ind w:hanging="0" w:left="737" w:right="0"/>
@@ -4417,7 +4399,7 @@
           <w:numId w:val="0"/>
         </w:numPr>
         <w:suppressAutoHyphens w:val="true"/>
-        <w:overflowPunct w:val="true"/>
+        <w:overflowPunct w:val="false"/>
         <w:spacing w:lineRule="auto" w:line="276" w:before="0" w:after="0"/>
         <w:ind w:hanging="357" w:left="357"/>
         <w:contextualSpacing/>
@@ -4449,9 +4431,9 @@
         <w:pStyle w:val="ListParagraph"/>
         <w:numPr>
           <w:ilvl w:val="0"/>
-          <w:numId w:val="4"/>
+          <w:numId w:val="3"/>
         </w:numPr>
-        <w:overflowPunct w:val="true"/>
+        <w:overflowPunct w:val="false"/>
         <w:spacing w:lineRule="auto" w:line="276" w:before="0" w:after="0"/>
         <w:ind w:hanging="357" w:left="357"/>
         <w:contextualSpacing/>
@@ -4593,10 +4575,10 @@
         <w:widowControl/>
         <w:numPr>
           <w:ilvl w:val="1"/>
-          <w:numId w:val="4"/>
+          <w:numId w:val="3"/>
         </w:numPr>
         <w:suppressAutoHyphens w:val="true"/>
-        <w:overflowPunct w:val="true"/>
+        <w:overflowPunct w:val="false"/>
         <w:bidi w:val="0"/>
         <w:spacing w:lineRule="auto" w:line="276" w:before="0" w:after="0"/>
         <w:ind w:hanging="340" w:left="1077" w:right="0"/>
@@ -5344,7 +5326,7 @@
         <w:pStyle w:val="ListParagraph"/>
         <w:numPr>
           <w:ilvl w:val="1"/>
-          <w:numId w:val="4"/>
+          <w:numId w:val="3"/>
         </w:numPr>
         <w:rPr>
           <w:b/>
@@ -5850,9 +5832,13 @@
     <w:p>
       <w:pPr>
         <w:pStyle w:val="Normal"/>
+        <w:widowControl/>
+        <w:suppressAutoHyphens w:val="true"/>
+        <w:overflowPunct w:val="true"/>
         <w:bidi w:val="0"/>
-        <w:spacing w:lineRule="auto" w:line="360"/>
-        <w:ind w:hanging="0" w:left="0"/>
+        <w:spacing w:lineRule="auto" w:line="360" w:before="0" w:after="120"/>
+        <w:ind w:firstLine="567" w:left="0" w:right="0"/>
+        <w:jc w:val="left"/>
         <w:rPr>
           <w:lang w:val="bg-BG"/>
         </w:rPr>
@@ -5879,9 +5865,13 @@
     <w:p>
       <w:pPr>
         <w:pStyle w:val="Normal"/>
+        <w:widowControl/>
+        <w:suppressAutoHyphens w:val="true"/>
+        <w:overflowPunct w:val="true"/>
         <w:bidi w:val="0"/>
-        <w:spacing w:lineRule="auto" w:line="360"/>
-        <w:ind w:hanging="0" w:left="0"/>
+        <w:spacing w:lineRule="auto" w:line="360" w:before="0" w:after="120"/>
+        <w:ind w:firstLine="567" w:left="0" w:right="0"/>
+        <w:jc w:val="left"/>
         <w:rPr>
           <w:lang w:val="bg-BG"/>
         </w:rPr>
@@ -5896,9 +5886,13 @@
     <w:p>
       <w:pPr>
         <w:pStyle w:val="Normal"/>
+        <w:widowControl/>
+        <w:suppressAutoHyphens w:val="true"/>
+        <w:overflowPunct w:val="true"/>
         <w:bidi w:val="0"/>
-        <w:spacing w:lineRule="auto" w:line="360"/>
-        <w:ind w:hanging="0" w:left="0"/>
+        <w:spacing w:lineRule="auto" w:line="360" w:before="0" w:after="120"/>
+        <w:ind w:firstLine="567" w:left="0" w:right="0"/>
+        <w:jc w:val="left"/>
         <w:rPr>
           <w:lang w:val="bg-BG"/>
         </w:rPr>
@@ -5925,9 +5919,13 @@
     <w:p>
       <w:pPr>
         <w:pStyle w:val="Normal"/>
+        <w:widowControl/>
+        <w:suppressAutoHyphens w:val="true"/>
+        <w:overflowPunct w:val="true"/>
         <w:bidi w:val="0"/>
-        <w:spacing w:lineRule="auto" w:line="360"/>
-        <w:ind w:hanging="0" w:left="0"/>
+        <w:spacing w:lineRule="auto" w:line="360" w:before="0" w:after="120"/>
+        <w:ind w:firstLine="567" w:left="0" w:right="0"/>
+        <w:jc w:val="left"/>
         <w:rPr>
           <w:lang w:val="bg-BG"/>
         </w:rPr>
@@ -5954,9 +5952,13 @@
     <w:p>
       <w:pPr>
         <w:pStyle w:val="Normal"/>
+        <w:widowControl/>
+        <w:suppressAutoHyphens w:val="true"/>
+        <w:overflowPunct w:val="true"/>
         <w:bidi w:val="0"/>
-        <w:spacing w:lineRule="auto" w:line="360"/>
-        <w:ind w:hanging="0" w:left="0"/>
+        <w:spacing w:lineRule="auto" w:line="360" w:before="0" w:after="120"/>
+        <w:ind w:firstLine="567" w:left="0" w:right="0"/>
+        <w:jc w:val="left"/>
         <w:rPr>
           <w:lang w:val="bg-BG"/>
         </w:rPr>
@@ -5995,9 +5997,13 @@
     <w:p>
       <w:pPr>
         <w:pStyle w:val="Normal"/>
+        <w:widowControl/>
+        <w:suppressAutoHyphens w:val="true"/>
+        <w:overflowPunct w:val="true"/>
         <w:bidi w:val="0"/>
-        <w:spacing w:lineRule="auto" w:line="360"/>
-        <w:ind w:hanging="0" w:left="0"/>
+        <w:spacing w:lineRule="auto" w:line="360" w:before="0" w:after="120"/>
+        <w:ind w:firstLine="567" w:left="0" w:right="0"/>
+        <w:jc w:val="left"/>
         <w:rPr>
           <w:lang w:val="bg-BG"/>
         </w:rPr>
@@ -6024,9 +6030,13 @@
     <w:p>
       <w:pPr>
         <w:pStyle w:val="Normal"/>
+        <w:widowControl/>
+        <w:suppressAutoHyphens w:val="true"/>
+        <w:overflowPunct w:val="true"/>
         <w:bidi w:val="0"/>
-        <w:spacing w:lineRule="auto" w:line="360"/>
-        <w:ind w:hanging="0" w:left="0"/>
+        <w:spacing w:lineRule="auto" w:line="360" w:before="0" w:after="120"/>
+        <w:ind w:firstLine="567" w:left="0" w:right="0"/>
+        <w:jc w:val="left"/>
         <w:rPr>
           <w:lang w:val="bg-BG"/>
         </w:rPr>
@@ -6059,9 +6069,13 @@
     <w:p>
       <w:pPr>
         <w:pStyle w:val="Normal"/>
+        <w:widowControl/>
+        <w:suppressAutoHyphens w:val="true"/>
+        <w:overflowPunct w:val="true"/>
         <w:bidi w:val="0"/>
-        <w:spacing w:lineRule="auto" w:line="360"/>
-        <w:ind w:hanging="0" w:left="0"/>
+        <w:spacing w:lineRule="auto" w:line="360" w:before="0" w:after="120"/>
+        <w:ind w:firstLine="567" w:left="0" w:right="0"/>
+        <w:jc w:val="left"/>
         <w:rPr>
           <w:lang w:val="bg-BG"/>
         </w:rPr>
@@ -6094,9 +6108,13 @@
     <w:p>
       <w:pPr>
         <w:pStyle w:val="Normal"/>
+        <w:widowControl/>
+        <w:suppressAutoHyphens w:val="true"/>
+        <w:overflowPunct w:val="true"/>
         <w:bidi w:val="0"/>
-        <w:spacing w:lineRule="auto" w:line="360"/>
-        <w:ind w:hanging="0" w:left="0"/>
+        <w:spacing w:lineRule="auto" w:line="360" w:before="0" w:after="120"/>
+        <w:ind w:firstLine="567" w:left="0" w:right="0"/>
+        <w:jc w:val="left"/>
         <w:rPr>
           <w:lang w:val="bg-BG"/>
         </w:rPr>
@@ -6117,9 +6135,13 @@
     <w:p>
       <w:pPr>
         <w:pStyle w:val="Normal"/>
+        <w:widowControl/>
+        <w:suppressAutoHyphens w:val="true"/>
+        <w:overflowPunct w:val="true"/>
         <w:bidi w:val="0"/>
-        <w:spacing w:lineRule="auto" w:line="360"/>
-        <w:ind w:hanging="0" w:left="0"/>
+        <w:spacing w:lineRule="auto" w:line="360" w:before="0" w:after="120"/>
+        <w:ind w:firstLine="567" w:left="0" w:right="0"/>
+        <w:jc w:val="left"/>
         <w:rPr>
           <w:lang w:val="bg-BG"/>
         </w:rPr>
@@ -6140,9 +6162,13 @@
     <w:p>
       <w:pPr>
         <w:pStyle w:val="Normal"/>
+        <w:widowControl/>
+        <w:suppressAutoHyphens w:val="true"/>
+        <w:overflowPunct w:val="true"/>
         <w:bidi w:val="0"/>
-        <w:spacing w:lineRule="auto" w:line="360"/>
-        <w:ind w:hanging="0" w:left="0"/>
+        <w:spacing w:lineRule="auto" w:line="360" w:before="0" w:after="120"/>
+        <w:ind w:firstLine="567" w:left="0" w:right="0"/>
+        <w:jc w:val="left"/>
         <w:rPr>
           <w:lang w:val="bg-BG"/>
         </w:rPr>
@@ -6163,9 +6189,13 @@
     <w:p>
       <w:pPr>
         <w:pStyle w:val="Normal"/>
+        <w:widowControl/>
+        <w:suppressAutoHyphens w:val="true"/>
+        <w:overflowPunct w:val="true"/>
         <w:bidi w:val="0"/>
-        <w:spacing w:lineRule="auto" w:line="360"/>
-        <w:ind w:hanging="0" w:left="0"/>
+        <w:spacing w:lineRule="auto" w:line="360" w:before="0" w:after="120"/>
+        <w:ind w:firstLine="567" w:left="0" w:right="0"/>
+        <w:jc w:val="left"/>
         <w:rPr>
           <w:lang w:val="bg-BG"/>
         </w:rPr>
@@ -6200,7 +6230,7 @@
         <w:pStyle w:val="ListParagraph"/>
         <w:numPr>
           <w:ilvl w:val="1"/>
-          <w:numId w:val="4"/>
+          <w:numId w:val="3"/>
         </w:numPr>
         <w:rPr>
           <w:b/>
@@ -6242,11 +6272,15 @@
     <w:p>
       <w:pPr>
         <w:pStyle w:val="Normal"/>
+        <w:widowControl/>
+        <w:suppressAutoHyphens w:val="true"/>
+        <w:overflowPunct w:val="true"/>
         <w:bidi w:val="0"/>
-        <w:spacing w:lineRule="auto" w:line="360"/>
-        <w:ind w:hanging="0" w:left="0"/>
-        <w:rPr>
-          <w:lang w:val="bg-BG"/>
+        <w:spacing w:lineRule="auto" w:line="360" w:before="0" w:after="120"/>
+        <w:ind w:firstLine="567" w:left="0" w:right="0"/>
+        <w:jc w:val="left"/>
+        <w:rPr>
+          <w:lang w:val="en-US"/>
         </w:rPr>
       </w:pPr>
       <w:r>
@@ -6264,9 +6298,9 @@
         <w:pStyle w:val="ListParagraph"/>
         <w:numPr>
           <w:ilvl w:val="0"/>
-          <w:numId w:val="4"/>
+          <w:numId w:val="3"/>
         </w:numPr>
-        <w:overflowPunct w:val="true"/>
+        <w:overflowPunct w:val="false"/>
         <w:spacing w:lineRule="auto" w:line="276" w:before="0" w:after="0"/>
         <w:ind w:hanging="357" w:left="357"/>
         <w:contextualSpacing/>
@@ -6298,10 +6332,10 @@
         <w:widowControl/>
         <w:numPr>
           <w:ilvl w:val="1"/>
-          <w:numId w:val="4"/>
+          <w:numId w:val="3"/>
         </w:numPr>
         <w:suppressAutoHyphens w:val="true"/>
-        <w:overflowPunct w:val="true"/>
+        <w:overflowPunct w:val="false"/>
         <w:bidi w:val="0"/>
         <w:spacing w:lineRule="auto" w:line="276" w:before="0" w:after="0"/>
         <w:ind w:hanging="340" w:left="1077" w:right="0"/>
@@ -6316,8 +6350,6 @@
           <w:lang w:val="bg-BG" w:eastAsia="en-US" w:bidi="ar-SA"/>
         </w:rPr>
       </w:pPr>
-      <w:bookmarkStart w:id="16" w:name="__RefHeading___Toc967_4158184810"/>
-      <w:bookmarkEnd w:id="16"/>
       <w:r>
         <w:rPr>
           <w:b/>
@@ -6326,7 +6358,348 @@
           <w:szCs w:val="32"/>
           <w:lang w:val="bg-BG" w:eastAsia="en-US" w:bidi="ar-SA"/>
         </w:rPr>
-        <w:t>Предварителна обработка на данните</w:t>
+        <w:t>Входни данни</w:t>
+      </w:r>
+    </w:p>
+    <w:p>
+      <w:pPr>
+        <w:pStyle w:val="Normal"/>
+        <w:widowControl/>
+        <w:suppressAutoHyphens w:val="true"/>
+        <w:overflowPunct w:val="true"/>
+        <w:bidi w:val="0"/>
+        <w:spacing w:lineRule="auto" w:line="360" w:before="0" w:after="120"/>
+        <w:ind w:firstLine="567" w:left="0" w:right="0"/>
+        <w:jc w:val="left"/>
+        <w:rPr>
+          <w:lang w:val="bg-BG"/>
+        </w:rPr>
+      </w:pPr>
+      <w:r>
+        <w:rPr>
+          <w:lang w:val="bg-BG"/>
+        </w:rPr>
+        <w:t xml:space="preserve">След класифицирането на данните с помощта на разработеното приложение за тази цел, за всеки един участник в експеримента, са налички следните полезни файлове: „3d_eye_states.csv“, „blinks.csv“, „fixations.csv“, „gaze.csv“, „imu.csv“, „labels.csv“ </w:t>
+      </w:r>
+      <w:r>
+        <w:rPr>
+          <w:lang w:val="bg-BG"/>
+        </w:rPr>
+        <w:t>и</w:t>
+      </w:r>
+      <w:r>
+        <w:rPr>
+          <w:lang w:val="bg-BG"/>
+        </w:rPr>
+        <w:t xml:space="preserve"> „saccades.csv“.</w:t>
+      </w:r>
+    </w:p>
+    <w:p>
+      <w:pPr>
+        <w:pStyle w:val="Normal"/>
+        <w:widowControl/>
+        <w:suppressAutoHyphens w:val="true"/>
+        <w:overflowPunct w:val="true"/>
+        <w:bidi w:val="0"/>
+        <w:spacing w:lineRule="auto" w:line="360" w:before="0" w:after="120"/>
+        <w:jc w:val="left"/>
+        <w:rPr>
+          <w:lang w:val="bg-BG"/>
+        </w:rPr>
+      </w:pPr>
+      <w:r>
+        <w:rPr>
+          <w:lang w:val="bg-BG"/>
+        </w:rPr>
+        <w:t>Това са файлове с формат .</w:t>
+      </w:r>
+      <w:r>
+        <w:rPr>
+          <w:lang w:val="en-US"/>
+        </w:rPr>
+        <w:t xml:space="preserve">csv. </w:t>
+      </w:r>
+      <w:r>
+        <w:rPr>
+          <w:lang w:val="bg-BG"/>
+        </w:rPr>
+        <w:t xml:space="preserve">Този формат се използва за </w:t>
+      </w:r>
+      <w:r>
+        <w:rPr>
+          <w:lang w:val="bg-BG"/>
+        </w:rPr>
+        <w:t xml:space="preserve">запазване на данни в прав текст, които представляват раблица. Това става като всеки нов ред във файлът се третита като отделен ред в таблицата, а стойностите на даденият ред се разделят със запетая. Всяка стойност определя отделна колона в таблицата. Стойностите на първият ред от файла се третират като заглавията на съответната колона. </w:t>
+      </w:r>
+      <w:r>
+        <w:rPr>
+          <w:lang w:val="en-US"/>
+        </w:rPr>
+        <w:t>[1]</w:t>
+      </w:r>
+    </w:p>
+    <w:p>
+      <w:pPr>
+        <w:pStyle w:val="Normal"/>
+        <w:widowControl/>
+        <w:suppressAutoHyphens w:val="true"/>
+        <w:overflowPunct w:val="true"/>
+        <w:bidi w:val="0"/>
+        <w:spacing w:lineRule="auto" w:line="360" w:before="0" w:after="120"/>
+        <w:jc w:val="left"/>
+        <w:rPr>
+          <w:lang w:val="bg-BG"/>
+        </w:rPr>
+      </w:pPr>
+      <w:r>
+        <w:rPr>
+          <w:lang w:val="bg-BG"/>
+        </w:rPr>
+        <w:t xml:space="preserve">Всеки един от файловете съдържа колоната „recording id“, която служи за идентификация на дадения запис, а стойността й е уникална и всички записи. Колоната се използва многократно при организирането и предварителната обработка на данните, както е описано </w:t>
+      </w:r>
+      <w:r>
+        <w:rPr>
+          <w:lang w:val="bg-BG"/>
+        </w:rPr>
+        <w:t>в следващата подточка</w:t>
+      </w:r>
+      <w:r>
+        <w:rPr>
+          <w:lang w:val="bg-BG"/>
+        </w:rPr>
+        <w:t>.</w:t>
+      </w:r>
+    </w:p>
+    <w:p>
+      <w:pPr>
+        <w:pStyle w:val="Normal"/>
+        <w:widowControl/>
+        <w:suppressAutoHyphens w:val="true"/>
+        <w:overflowPunct w:val="true"/>
+        <w:bidi w:val="0"/>
+        <w:spacing w:lineRule="auto" w:line="360" w:before="0" w:after="120"/>
+        <w:jc w:val="left"/>
+        <w:rPr>
+          <w:lang w:val="bg-BG"/>
+        </w:rPr>
+      </w:pPr>
+      <w:r>
+        <w:rPr>
+          <w:lang w:val="bg-BG"/>
+        </w:rPr>
+        <w:t>Файловете „</w:t>
+      </w:r>
+      <w:r>
+        <w:rPr>
+          <w:lang w:val="bg-BG"/>
+        </w:rPr>
+        <w:t>3d_eye_states.csv</w:t>
+      </w:r>
+      <w:r>
+        <w:rPr>
+          <w:lang w:val="bg-BG"/>
+        </w:rPr>
+        <w:t>“, „</w:t>
+      </w:r>
+      <w:r>
+        <w:rPr>
+          <w:lang w:val="bg-BG"/>
+        </w:rPr>
+        <w:t>gaze.csv</w:t>
+      </w:r>
+      <w:r>
+        <w:rPr>
+          <w:lang w:val="bg-BG"/>
+        </w:rPr>
+        <w:t>“ и „</w:t>
+      </w:r>
+      <w:r>
+        <w:rPr>
+          <w:lang w:val="bg-BG"/>
+        </w:rPr>
+        <w:t>imu.csv</w:t>
+      </w:r>
+      <w:r>
+        <w:rPr>
+          <w:lang w:val="bg-BG"/>
+        </w:rPr>
+        <w:t xml:space="preserve">“ споделят една и съща колона, а именно „timestamp [ns]“. Тази колкона показва в коя наносекунда е направено даденото измерване. </w:t>
+      </w:r>
+    </w:p>
+    <w:p>
+      <w:pPr>
+        <w:pStyle w:val="Normal"/>
+        <w:widowControl/>
+        <w:suppressAutoHyphens w:val="true"/>
+        <w:overflowPunct w:val="true"/>
+        <w:bidi w:val="0"/>
+        <w:spacing w:lineRule="auto" w:line="360" w:before="0" w:after="120"/>
+        <w:jc w:val="left"/>
+        <w:rPr>
+          <w:lang w:val="bg-BG"/>
+        </w:rPr>
+      </w:pPr>
+      <w:r>
+        <w:rPr>
+          <w:lang w:val="bg-BG"/>
+        </w:rPr>
+        <w:t>Файловете „</w:t>
+      </w:r>
+      <w:r>
+        <w:rPr>
+          <w:lang w:val="bg-BG"/>
+        </w:rPr>
+        <w:t>fixations.csv</w:t>
+      </w:r>
+      <w:r>
+        <w:rPr>
+          <w:lang w:val="bg-BG"/>
+        </w:rPr>
+        <w:t>“, „</w:t>
+      </w:r>
+      <w:r>
+        <w:rPr>
+          <w:lang w:val="bg-BG"/>
+        </w:rPr>
+        <w:t>saccades.csv</w:t>
+      </w:r>
+      <w:r>
+        <w:rPr>
+          <w:lang w:val="bg-BG"/>
+        </w:rPr>
+        <w:t>“ и „</w:t>
+      </w:r>
+      <w:r>
+        <w:rPr>
+          <w:lang w:val="bg-BG"/>
+        </w:rPr>
+        <w:t>blinks.csv</w:t>
+      </w:r>
+      <w:r>
+        <w:rPr>
+          <w:lang w:val="bg-BG"/>
+        </w:rPr>
+        <w:t xml:space="preserve">“ споделят </w:t>
+      </w:r>
+      <w:r>
+        <w:rPr>
+          <w:lang w:val="bg-BG"/>
+        </w:rPr>
+        <w:t>три</w:t>
+      </w:r>
+      <w:r>
+        <w:rPr>
+          <w:lang w:val="bg-BG"/>
+        </w:rPr>
+        <w:t xml:space="preserve"> едни и същи колони, а именно „start timestamp [ns]“, “end timestamp [ns]“ </w:t>
+      </w:r>
+      <w:r>
+        <w:rPr>
+          <w:lang w:val="bg-BG"/>
+        </w:rPr>
+        <w:t>и „duration [ms]“</w:t>
+      </w:r>
+      <w:r>
+        <w:rPr>
+          <w:lang w:val="bg-BG"/>
+        </w:rPr>
+        <w:t xml:space="preserve"> . </w:t>
+      </w:r>
+      <w:r>
+        <w:rPr>
+          <w:lang w:val="bg-BG"/>
+        </w:rPr>
+        <w:t>Първите две оказват в коя наносекунда е настъпило началото и краят на даденото събитие, а третото – колко милисекунди е продължило даденото даденото събитие. Всеки един от тези файлове и ма и колона, която показва идентифициращият номер на деденото събитие. Името ина тази колона е префикс от името на дадения файли, и думата „</w:t>
+      </w:r>
+      <w:r>
+        <w:rPr>
+          <w:lang w:val="en-US"/>
+        </w:rPr>
+        <w:t xml:space="preserve">id” </w:t>
+      </w:r>
+      <w:r>
+        <w:rPr>
+          <w:lang w:val="bg-BG"/>
+        </w:rPr>
+        <w:t>с място между тях.</w:t>
+      </w:r>
+    </w:p>
+    <w:p>
+      <w:pPr>
+        <w:pStyle w:val="Normal"/>
+        <w:widowControl/>
+        <w:suppressAutoHyphens w:val="true"/>
+        <w:overflowPunct w:val="true"/>
+        <w:bidi w:val="0"/>
+        <w:spacing w:lineRule="auto" w:line="360" w:before="0" w:after="120"/>
+        <w:jc w:val="left"/>
+        <w:rPr>
+          <w:lang w:val="bg-BG"/>
+        </w:rPr>
+      </w:pPr>
+      <w:r>
+        <w:rPr>
+          <w:lang w:val="bg-BG"/>
+        </w:rPr>
+        <w:t>Файлът „</w:t>
+      </w:r>
+      <w:r>
+        <w:rPr>
+          <w:lang w:val="bg-BG"/>
+        </w:rPr>
+        <w:t>labels.csv</w:t>
+      </w:r>
+      <w:r>
+        <w:rPr>
+          <w:lang w:val="bg-BG"/>
+        </w:rPr>
+        <w:t>“ също има две колони, показващи началото и краят на събитието, но мерната единица е милисекунди. Имената им са съответно „start timestamp [ms]“ и „end timestamp [ms]“.</w:t>
+      </w:r>
+    </w:p>
+    <w:p>
+      <w:pPr>
+        <w:pStyle w:val="Normal"/>
+        <w:widowControl/>
+        <w:suppressAutoHyphens w:val="true"/>
+        <w:overflowPunct w:val="true"/>
+        <w:bidi w:val="0"/>
+        <w:spacing w:lineRule="auto" w:line="360" w:before="0" w:after="120"/>
+        <w:jc w:val="left"/>
+        <w:rPr>
+          <w:lang w:val="bg-BG"/>
+        </w:rPr>
+      </w:pPr>
+      <w:r>
+        <w:rPr>
+          <w:lang w:val="bg-BG"/>
+        </w:rPr>
+        <w:t>Всички останали колони, в отделните файлове са:</w:t>
+      </w:r>
+    </w:p>
+    <w:p>
+      <w:pPr>
+        <w:pStyle w:val="Normal"/>
+        <w:widowControl/>
+        <w:suppressAutoHyphens w:val="true"/>
+        <w:overflowPunct w:val="true"/>
+        <w:bidi w:val="0"/>
+        <w:spacing w:lineRule="auto" w:line="360" w:before="0" w:after="120"/>
+        <w:jc w:val="left"/>
+        <w:rPr>
+          <w:lang w:val="bg-BG"/>
+        </w:rPr>
+      </w:pPr>
+      <w:r>
+        <w:rPr>
+          <w:lang w:val="bg-BG"/>
+        </w:rPr>
+        <w:t xml:space="preserve">3d_eye_states.csv – </w:t>
+      </w:r>
+      <w:r>
+        <w:rPr>
+          <w:lang w:val="bg-BG"/>
+        </w:rPr>
+        <w:t xml:space="preserve">Съдържа </w:t>
       </w:r>
     </w:p>
     <w:p>
@@ -6335,10 +6708,10 @@
         <w:widowControl/>
         <w:numPr>
           <w:ilvl w:val="1"/>
-          <w:numId w:val="4"/>
+          <w:numId w:val="3"/>
         </w:numPr>
         <w:suppressAutoHyphens w:val="true"/>
-        <w:overflowPunct w:val="true"/>
+        <w:overflowPunct w:val="false"/>
         <w:bidi w:val="0"/>
         <w:spacing w:lineRule="auto" w:line="276" w:before="0" w:after="0"/>
         <w:ind w:hanging="340" w:left="1077" w:right="0"/>
@@ -6353,8 +6726,8 @@
           <w:lang w:val="bg-BG" w:eastAsia="en-US" w:bidi="ar-SA"/>
         </w:rPr>
       </w:pPr>
-      <w:bookmarkStart w:id="17" w:name="__RefHeading___Toc5690_4158184810"/>
-      <w:bookmarkEnd w:id="17"/>
+      <w:bookmarkStart w:id="16" w:name="__RefHeading___Toc967_4158184810"/>
+      <w:bookmarkEnd w:id="16"/>
       <w:r>
         <w:rPr>
           <w:b/>
@@ -6363,7 +6736,24 @@
           <w:szCs w:val="32"/>
           <w:lang w:val="bg-BG" w:eastAsia="en-US" w:bidi="ar-SA"/>
         </w:rPr>
-        <w:t>Избор на модел за машинно обучение</w:t>
+        <w:t>Предварителна обработка на данните</w:t>
+      </w:r>
+    </w:p>
+    <w:p>
+      <w:pPr>
+        <w:pStyle w:val="Normal"/>
+        <w:widowControl/>
+        <w:suppressAutoHyphens w:val="true"/>
+        <w:overflowPunct w:val="true"/>
+        <w:bidi w:val="0"/>
+        <w:spacing w:lineRule="auto" w:line="360" w:before="0" w:after="120"/>
+        <w:ind w:firstLine="567" w:left="0" w:right="0"/>
+        <w:jc w:val="left"/>
+        <w:rPr/>
+      </w:pPr>
+      <w:r>
+        <w:rPr/>
+        <w:tab/>
       </w:r>
     </w:p>
     <w:p>
@@ -6372,10 +6762,47 @@
         <w:widowControl/>
         <w:numPr>
           <w:ilvl w:val="1"/>
-          <w:numId w:val="4"/>
+          <w:numId w:val="3"/>
         </w:numPr>
         <w:suppressAutoHyphens w:val="true"/>
-        <w:overflowPunct w:val="true"/>
+        <w:overflowPunct w:val="false"/>
+        <w:bidi w:val="0"/>
+        <w:spacing w:lineRule="auto" w:line="276" w:before="0" w:after="0"/>
+        <w:ind w:hanging="340" w:left="1077" w:right="0"/>
+        <w:contextualSpacing/>
+        <w:jc w:val="left"/>
+        <w:outlineLvl w:val="0"/>
+        <w:rPr>
+          <w:b/>
+          <w:bCs/>
+          <w:sz w:val="32"/>
+          <w:szCs w:val="28"/>
+          <w:lang w:val="bg-BG" w:eastAsia="en-US" w:bidi="ar-SA"/>
+        </w:rPr>
+      </w:pPr>
+      <w:bookmarkStart w:id="17" w:name="__RefHeading___Toc5690_4158184810"/>
+      <w:bookmarkEnd w:id="17"/>
+      <w:r>
+        <w:rPr>
+          <w:b/>
+          <w:bCs/>
+          <w:sz w:val="32"/>
+          <w:szCs w:val="32"/>
+          <w:lang w:val="bg-BG" w:eastAsia="en-US" w:bidi="ar-SA"/>
+        </w:rPr>
+        <w:t>Избор на модел за машинно обучение</w:t>
+      </w:r>
+    </w:p>
+    <w:p>
+      <w:pPr>
+        <w:pStyle w:val="ListParagraph"/>
+        <w:widowControl/>
+        <w:numPr>
+          <w:ilvl w:val="1"/>
+          <w:numId w:val="3"/>
+        </w:numPr>
+        <w:suppressAutoHyphens w:val="true"/>
+        <w:overflowPunct w:val="false"/>
         <w:bidi w:val="0"/>
         <w:spacing w:lineRule="auto" w:line="276" w:before="0" w:after="0"/>
         <w:ind w:hanging="340" w:left="1077" w:right="0"/>
@@ -6412,7 +6839,7 @@
           <w:numId w:val="0"/>
         </w:numPr>
         <w:suppressAutoHyphens w:val="true"/>
-        <w:overflowPunct w:val="true"/>
+        <w:overflowPunct w:val="false"/>
         <w:spacing w:lineRule="auto" w:line="276" w:before="0" w:after="0"/>
         <w:ind w:hanging="357" w:left="357"/>
         <w:contextualSpacing/>
@@ -6444,9 +6871,9 @@
         <w:pStyle w:val="ListParagraph"/>
         <w:numPr>
           <w:ilvl w:val="0"/>
-          <w:numId w:val="4"/>
+          <w:numId w:val="3"/>
         </w:numPr>
-        <w:overflowPunct w:val="true"/>
+        <w:overflowPunct w:val="false"/>
         <w:spacing w:lineRule="auto" w:line="276" w:before="0" w:after="0"/>
         <w:ind w:hanging="357" w:left="357"/>
         <w:contextualSpacing/>
@@ -6520,9 +6947,9 @@
         <w:pStyle w:val="ListParagraph"/>
         <w:numPr>
           <w:ilvl w:val="0"/>
-          <w:numId w:val="4"/>
+          <w:numId w:val="3"/>
         </w:numPr>
-        <w:overflowPunct w:val="true"/>
+        <w:overflowPunct w:val="false"/>
         <w:spacing w:lineRule="auto" w:line="276" w:before="0" w:after="0"/>
         <w:ind w:hanging="357" w:left="357"/>
         <w:contextualSpacing/>
@@ -6557,7 +6984,7 @@
           <w:numId w:val="0"/>
         </w:numPr>
         <w:suppressAutoHyphens w:val="true"/>
-        <w:overflowPunct w:val="true"/>
+        <w:overflowPunct w:val="false"/>
         <w:spacing w:lineRule="auto" w:line="276" w:before="0" w:after="0"/>
         <w:ind w:hanging="357" w:left="357"/>
         <w:contextualSpacing/>
@@ -6589,9 +7016,9 @@
         <w:pStyle w:val="ListParagraph"/>
         <w:numPr>
           <w:ilvl w:val="0"/>
-          <w:numId w:val="4"/>
+          <w:numId w:val="3"/>
         </w:numPr>
-        <w:overflowPunct w:val="true"/>
+        <w:overflowPunct w:val="false"/>
         <w:spacing w:lineRule="auto" w:line="276" w:before="0" w:after="0"/>
         <w:ind w:hanging="357" w:left="357"/>
         <w:contextualSpacing/>
@@ -6626,7 +7053,7 @@
           <w:numId w:val="0"/>
         </w:numPr>
         <w:suppressAutoHyphens w:val="true"/>
-        <w:overflowPunct w:val="true"/>
+        <w:overflowPunct w:val="false"/>
         <w:spacing w:lineRule="auto" w:line="276" w:before="0" w:after="0"/>
         <w:ind w:hanging="357" w:left="357"/>
         <w:contextualSpacing/>
@@ -6658,9 +7085,9 @@
         <w:pStyle w:val="ListParagraph"/>
         <w:numPr>
           <w:ilvl w:val="0"/>
-          <w:numId w:val="4"/>
+          <w:numId w:val="3"/>
         </w:numPr>
-        <w:overflowPunct w:val="true"/>
+        <w:overflowPunct w:val="false"/>
         <w:spacing w:lineRule="auto" w:line="276" w:before="0" w:after="0"/>
         <w:ind w:hanging="357" w:left="357"/>
         <w:contextualSpacing/>
@@ -6695,7 +7122,7 @@
           <w:numId w:val="0"/>
         </w:numPr>
         <w:suppressAutoHyphens w:val="true"/>
-        <w:overflowPunct w:val="true"/>
+        <w:overflowPunct w:val="false"/>
         <w:spacing w:lineRule="auto" w:line="276" w:before="0" w:after="0"/>
         <w:ind w:hanging="357" w:left="357"/>
         <w:contextualSpacing/>
@@ -6727,9 +7154,9 @@
         <w:pStyle w:val="ListParagraph"/>
         <w:numPr>
           <w:ilvl w:val="0"/>
-          <w:numId w:val="4"/>
+          <w:numId w:val="3"/>
         </w:numPr>
-        <w:overflowPunct w:val="true"/>
+        <w:overflowPunct w:val="false"/>
         <w:spacing w:lineRule="auto" w:line="276" w:before="0" w:after="0"/>
         <w:ind w:hanging="357" w:left="357"/>
         <w:contextualSpacing/>
@@ -7341,14 +7768,58 @@
       <w:pPr>
         <w:pStyle w:val="Normal"/>
         <w:rPr>
-          <w:lang w:val="en-US"/>
-        </w:rPr>
-      </w:pPr>
-      <w:r>
-        <w:rPr>
-          <w:lang w:val="en-US"/>
-        </w:rPr>
-      </w:r>
+          <w:lang w:val="bg-BG"/>
+        </w:rPr>
+      </w:pPr>
+      <w:r>
+        <w:rPr>
+          <w:lang w:val="bg-BG"/>
+        </w:rPr>
+        <w:t>8. Създаване и обучение на модела</w:t>
+      </w:r>
+    </w:p>
+    <w:p>
+      <w:pPr>
+        <w:pStyle w:val="Normal"/>
+        <w:rPr>
+          <w:lang w:val="bg-BG"/>
+        </w:rPr>
+      </w:pPr>
+      <w:r>
+        <w:rPr>
+          <w:lang w:val="en-US"/>
+        </w:rPr>
+        <w:t xml:space="preserve">8.1 </w:t>
+      </w:r>
+      <w:r>
+        <w:rPr>
+          <w:lang w:val="bg-BG"/>
+        </w:rPr>
+        <w:t xml:space="preserve">Предварителна обработка на данните </w:t>
+      </w:r>
+    </w:p>
+    <w:p>
+      <w:pPr>
+        <w:pStyle w:val="Normal"/>
+        <w:rPr>
+          <w:lang w:val="en-US"/>
+        </w:rPr>
+      </w:pPr>
+      <w:r>
+        <w:rPr>
+          <w:lang w:val="en-US"/>
+        </w:rPr>
+        <w:t xml:space="preserve">[1] </w:t>
+      </w:r>
+      <w:hyperlink r:id="rId19">
+        <w:r>
+          <w:rPr>
+            <w:rStyle w:val="Hyperlink"/>
+            <w:lang w:val="en-US"/>
+          </w:rPr>
+          <w:t>https://en.wikipedia.org/wiki/Comma-separated_values</w:t>
+        </w:r>
+      </w:hyperlink>
     </w:p>
     <w:p>
       <w:pPr>
@@ -7428,9 +7899,9 @@
         <w:pStyle w:val="ListParagraph"/>
         <w:numPr>
           <w:ilvl w:val="0"/>
-          <w:numId w:val="4"/>
+          <w:numId w:val="3"/>
         </w:numPr>
-        <w:overflowPunct w:val="true"/>
+        <w:overflowPunct w:val="false"/>
         <w:spacing w:lineRule="auto" w:line="276" w:before="0" w:after="0"/>
         <w:ind w:hanging="357" w:left="357"/>
         <w:contextualSpacing/>
@@ -7492,18 +7963,18 @@
           <w:lang w:val="bg-BG" w:eastAsia="en-US" w:bidi="ar-SA"/>
         </w:rPr>
         <w:drawing>
-          <wp:anchor distT="0" distB="0" distL="0" distR="0" simplePos="0" relativeHeight="2" behindDoc="0" locked="0" layoutInCell="0" allowOverlap="1">
+          <wp:anchor behindDoc="0" distT="0" distB="0" distL="0" distR="0" simplePos="0" locked="0" layoutInCell="0" allowOverlap="1" relativeHeight="2">
             <wp:simplePos x="0" y="0"/>
             <wp:positionH relativeFrom="column">
-              <wp:posOffset>-99060</wp:posOffset>
+              <wp:posOffset>-106680</wp:posOffset>
             </wp:positionH>
             <wp:positionV relativeFrom="paragraph">
-              <wp:posOffset>12700</wp:posOffset>
+              <wp:posOffset>1270</wp:posOffset>
             </wp:positionV>
             <wp:extent cx="5939790" cy="8385175"/>
             <wp:effectExtent l="0" t="0" r="0" b="0"/>
             <wp:wrapTopAndBottom/>
-            <wp:docPr id="5" name="Image1"/>
+            <wp:docPr id="5" name="Image1" descr=""/>
             <wp:cNvGraphicFramePr>
               <a:graphicFrameLocks xmlns:a="http://schemas.openxmlformats.org/drawingml/2006/main" noChangeAspect="1"/>
             </wp:cNvGraphicFramePr>
@@ -7511,13 +7982,13 @@
               <a:graphicData uri="http://schemas.openxmlformats.org/drawingml/2006/picture">
                 <pic:pic xmlns:pic="http://schemas.openxmlformats.org/drawingml/2006/picture">
                   <pic:nvPicPr>
-                    <pic:cNvPr id="5" name="Image1"/>
+                    <pic:cNvPr id="5" name="Image1" descr=""/>
                     <pic:cNvPicPr>
                       <a:picLocks noChangeAspect="1" noChangeArrowheads="1"/>
                     </pic:cNvPicPr>
                   </pic:nvPicPr>
                   <pic:blipFill>
-                    <a:blip r:embed="rId19"/>
+                    <a:blip r:embed="rId20"/>
                     <a:stretch>
                       <a:fillRect/>
                     </a:stretch>
@@ -7546,6 +8017,7 @@
       <w:pPr>
         <w:pStyle w:val="Normal"/>
         <w:bidi w:val="0"/>
+        <w:spacing w:before="0" w:after="120"/>
         <w:ind w:hanging="0" w:left="0"/>
         <w:rPr>
           <w:lang w:val="bg-BG" w:eastAsia="en-US" w:bidi="ar-SA"/>
@@ -7556,7 +8028,7 @@
           <w:lang w:val="bg-BG" w:eastAsia="en-US" w:bidi="ar-SA"/>
         </w:rPr>
         <w:drawing>
-          <wp:anchor distT="0" distB="0" distL="0" distR="0" simplePos="0" relativeHeight="3" behindDoc="0" locked="0" layoutInCell="0" allowOverlap="1">
+          <wp:anchor behindDoc="0" distT="0" distB="0" distL="0" distR="0" simplePos="0" locked="0" layoutInCell="0" allowOverlap="1" relativeHeight="3">
             <wp:simplePos x="0" y="0"/>
             <wp:positionH relativeFrom="column">
               <wp:posOffset>-129540</wp:posOffset>
@@ -7567,7 +8039,7 @@
             <wp:extent cx="5939790" cy="8954135"/>
             <wp:effectExtent l="0" t="0" r="0" b="0"/>
             <wp:wrapTopAndBottom/>
-            <wp:docPr id="6" name="Image2"/>
+            <wp:docPr id="6" name="Image2" descr=""/>
             <wp:cNvGraphicFramePr>
               <a:graphicFrameLocks xmlns:a="http://schemas.openxmlformats.org/drawingml/2006/main" noChangeAspect="1"/>
             </wp:cNvGraphicFramePr>
@@ -7575,13 +8047,13 @@
               <a:graphicData uri="http://schemas.openxmlformats.org/drawingml/2006/picture">
                 <pic:pic xmlns:pic="http://schemas.openxmlformats.org/drawingml/2006/picture">
                   <pic:nvPicPr>
-                    <pic:cNvPr id="6" name="Image2"/>
+                    <pic:cNvPr id="6" name="Image2" descr=""/>
                     <pic:cNvPicPr>
                       <a:picLocks noChangeAspect="1" noChangeArrowheads="1"/>
                     </pic:cNvPicPr>
                   </pic:nvPicPr>
                   <pic:blipFill>
-                    <a:blip r:embed="rId20"/>
+                    <a:blip r:embed="rId21"/>
                     <a:stretch>
                       <a:fillRect/>
                     </a:stretch>
@@ -7610,6 +8082,7 @@
       <w:pPr>
         <w:pStyle w:val="Normal"/>
         <w:bidi w:val="0"/>
+        <w:spacing w:before="0" w:after="120"/>
         <w:ind w:hanging="0" w:left="0"/>
         <w:rPr>
           <w:lang w:val="bg-BG" w:eastAsia="en-US" w:bidi="ar-SA"/>
@@ -7620,7 +8093,7 @@
           <w:lang w:val="bg-BG" w:eastAsia="en-US" w:bidi="ar-SA"/>
         </w:rPr>
         <w:drawing>
-          <wp:anchor distT="0" distB="0" distL="0" distR="0" simplePos="0" relativeHeight="4" behindDoc="0" locked="0" layoutInCell="0" allowOverlap="1">
+          <wp:anchor behindDoc="0" distT="0" distB="0" distL="0" distR="0" simplePos="0" locked="0" layoutInCell="0" allowOverlap="1" relativeHeight="4">
             <wp:simplePos x="0" y="0"/>
             <wp:positionH relativeFrom="column">
               <wp:align>center</wp:align>
@@ -7631,7 +8104,7 @@
             <wp:extent cx="5939790" cy="9130030"/>
             <wp:effectExtent l="0" t="0" r="0" b="0"/>
             <wp:wrapTopAndBottom/>
-            <wp:docPr id="7" name="Image3"/>
+            <wp:docPr id="7" name="Image3" descr=""/>
             <wp:cNvGraphicFramePr>
               <a:graphicFrameLocks xmlns:a="http://schemas.openxmlformats.org/drawingml/2006/main" noChangeAspect="1"/>
             </wp:cNvGraphicFramePr>
@@ -7639,13 +8112,13 @@
               <a:graphicData uri="http://schemas.openxmlformats.org/drawingml/2006/picture">
                 <pic:pic xmlns:pic="http://schemas.openxmlformats.org/drawingml/2006/picture">
                   <pic:nvPicPr>
-                    <pic:cNvPr id="7" name="Image3"/>
+                    <pic:cNvPr id="7" name="Image3" descr=""/>
                     <pic:cNvPicPr>
                       <a:picLocks noChangeAspect="1" noChangeArrowheads="1"/>
                     </pic:cNvPicPr>
                   </pic:nvPicPr>
                   <pic:blipFill>
-                    <a:blip r:embed="rId21"/>
+                    <a:blip r:embed="rId22"/>
                     <a:stretch>
                       <a:fillRect/>
                     </a:stretch>
@@ -7674,6 +8147,7 @@
       <w:pPr>
         <w:pStyle w:val="Normal"/>
         <w:bidi w:val="0"/>
+        <w:spacing w:before="0" w:after="120"/>
         <w:ind w:hanging="0" w:left="0"/>
         <w:rPr>
           <w:lang w:val="bg-BG" w:eastAsia="en-US" w:bidi="ar-SA"/>
@@ -7734,125 +8208,6 @@
   <w:abstractNum w:abstractNumId="1">
     <w:lvl w:ilvl="0">
       <w:start w:val="1"/>
-      <w:numFmt w:val="none"/>
-      <w:suff w:val="nothing"/>
-      <w:lvlText w:val="%1"/>
-      <w:lvlJc w:val="left"/>
-      <w:pPr>
-        <w:tabs>
-          <w:tab w:val="num" w:pos="0"/>
-        </w:tabs>
-        <w:ind w:left="0" w:hanging="0"/>
-      </w:pPr>
-    </w:lvl>
-    <w:lvl w:ilvl="1">
-      <w:start w:val="1"/>
-      <w:numFmt w:val="none"/>
-      <w:suff w:val="nothing"/>
-      <w:lvlText w:val="%2"/>
-      <w:lvlJc w:val="left"/>
-      <w:pPr>
-        <w:tabs>
-          <w:tab w:val="num" w:pos="0"/>
-        </w:tabs>
-        <w:ind w:left="0" w:hanging="0"/>
-      </w:pPr>
-    </w:lvl>
-    <w:lvl w:ilvl="2">
-      <w:start w:val="1"/>
-      <w:numFmt w:val="none"/>
-      <w:suff w:val="nothing"/>
-      <w:lvlText w:val="%3"/>
-      <w:lvlJc w:val="left"/>
-      <w:pPr>
-        <w:tabs>
-          <w:tab w:val="num" w:pos="0"/>
-        </w:tabs>
-        <w:ind w:left="0" w:hanging="0"/>
-      </w:pPr>
-    </w:lvl>
-    <w:lvl w:ilvl="3">
-      <w:start w:val="1"/>
-      <w:numFmt w:val="none"/>
-      <w:suff w:val="nothing"/>
-      <w:lvlText w:val="%4"/>
-      <w:lvlJc w:val="left"/>
-      <w:pPr>
-        <w:tabs>
-          <w:tab w:val="num" w:pos="0"/>
-        </w:tabs>
-        <w:ind w:left="0" w:hanging="0"/>
-      </w:pPr>
-    </w:lvl>
-    <w:lvl w:ilvl="4">
-      <w:start w:val="1"/>
-      <w:numFmt w:val="none"/>
-      <w:suff w:val="nothing"/>
-      <w:lvlText w:val="%5"/>
-      <w:lvlJc w:val="left"/>
-      <w:pPr>
-        <w:tabs>
-          <w:tab w:val="num" w:pos="0"/>
-        </w:tabs>
-        <w:ind w:left="0" w:hanging="0"/>
-      </w:pPr>
-    </w:lvl>
-    <w:lvl w:ilvl="5">
-      <w:start w:val="1"/>
-      <w:numFmt w:val="none"/>
-      <w:suff w:val="nothing"/>
-      <w:lvlText w:val="%6"/>
-      <w:lvlJc w:val="left"/>
-      <w:pPr>
-        <w:tabs>
-          <w:tab w:val="num" w:pos="0"/>
-        </w:tabs>
-        <w:ind w:left="0" w:hanging="0"/>
-      </w:pPr>
-    </w:lvl>
-    <w:lvl w:ilvl="6">
-      <w:start w:val="1"/>
-      <w:numFmt w:val="none"/>
-      <w:suff w:val="nothing"/>
-      <w:lvlText w:val="%7"/>
-      <w:lvlJc w:val="left"/>
-      <w:pPr>
-        <w:tabs>
-          <w:tab w:val="num" w:pos="0"/>
-        </w:tabs>
-        <w:ind w:left="0" w:hanging="0"/>
-      </w:pPr>
-    </w:lvl>
-    <w:lvl w:ilvl="7">
-      <w:start w:val="1"/>
-      <w:numFmt w:val="none"/>
-      <w:suff w:val="nothing"/>
-      <w:lvlText w:val="%8"/>
-      <w:lvlJc w:val="left"/>
-      <w:pPr>
-        <w:tabs>
-          <w:tab w:val="num" w:pos="0"/>
-        </w:tabs>
-        <w:ind w:left="0" w:hanging="0"/>
-      </w:pPr>
-    </w:lvl>
-    <w:lvl w:ilvl="8">
-      <w:start w:val="1"/>
-      <w:numFmt w:val="none"/>
-      <w:suff w:val="nothing"/>
-      <w:lvlText w:val="%9"/>
-      <w:lvlJc w:val="left"/>
-      <w:pPr>
-        <w:tabs>
-          <w:tab w:val="num" w:pos="0"/>
-        </w:tabs>
-        <w:ind w:left="0" w:hanging="0"/>
-      </w:pPr>
-    </w:lvl>
-  </w:abstractNum>
-  <w:abstractNum w:abstractNumId="2">
-    <w:lvl w:ilvl="0">
-      <w:start w:val="1"/>
       <w:numFmt w:val="bullet"/>
       <w:lvlText w:val=""/>
       <w:lvlJc w:val="left"/>
@@ -7971,7 +8326,7 @@
       <w:rPr/>
     </w:lvl>
   </w:abstractNum>
-  <w:abstractNum w:abstractNumId="3">
+  <w:abstractNum w:abstractNumId="2">
     <w:lvl w:ilvl="0">
       <w:start w:val="1"/>
       <w:numFmt w:val="bullet"/>
@@ -8108,7 +8463,7 @@
       </w:rPr>
     </w:lvl>
   </w:abstractNum>
-  <w:abstractNum w:abstractNumId="4">
+  <w:abstractNum w:abstractNumId="3">
     <w:lvl w:ilvl="0">
       <w:start w:val="1"/>
       <w:numFmt w:val="decimal"/>
@@ -8227,7 +8582,7 @@
       <w:rPr/>
     </w:lvl>
   </w:abstractNum>
-  <w:abstractNum w:abstractNumId="5">
+  <w:abstractNum w:abstractNumId="4">
     <w:lvl w:ilvl="0">
       <w:start w:val="3"/>
       <w:numFmt w:val="decimal"/>
@@ -8240,14 +8595,14 @@
         <w:ind w:left="283" w:hanging="283"/>
       </w:pPr>
       <w:rPr>
+        <w:dstrike w:val="false"/>
+        <w:strike w:val="false"/>
+        <w:sz w:val="28"/>
+        <w:i w:val="false"/>
+        <w:u w:val="none"/>
+        <w:b w:val="false"/>
+        <w:effect w:val="none"/>
         <w:rFonts w:ascii="Arial" w:hAnsi="Arial" w:cs="Times New Roman"/>
-        <w:b w:val="false"/>
-        <w:i w:val="false"/>
-        <w:strike w:val="false"/>
-        <w:dstrike w:val="false"/>
-        <w:sz w:val="28"/>
-        <w:u w:val="none"/>
-        <w:effect w:val="none"/>
       </w:rPr>
     </w:lvl>
     <w:lvl w:ilvl="1">
@@ -8355,7 +8710,7 @@
       <w:rPr/>
     </w:lvl>
   </w:abstractNum>
-  <w:abstractNum w:abstractNumId="6">
+  <w:abstractNum w:abstractNumId="5">
     <w:lvl w:ilvl="0">
       <w:start w:val="1"/>
       <w:numFmt w:val="decimal"/>
@@ -8368,14 +8723,14 @@
         <w:ind w:left="283" w:hanging="283"/>
       </w:pPr>
       <w:rPr>
+        <w:dstrike w:val="false"/>
+        <w:strike w:val="false"/>
+        <w:sz w:val="28"/>
+        <w:i w:val="false"/>
+        <w:u w:val="none"/>
+        <w:b w:val="false"/>
+        <w:effect w:val="none"/>
         <w:rFonts w:ascii="Arial" w:hAnsi="Arial" w:cs="Times New Roman"/>
-        <w:b w:val="false"/>
-        <w:i w:val="false"/>
-        <w:strike w:val="false"/>
-        <w:dstrike w:val="false"/>
-        <w:sz w:val="28"/>
-        <w:u w:val="none"/>
-        <w:effect w:val="none"/>
       </w:rPr>
     </w:lvl>
     <w:lvl w:ilvl="1">
@@ -8483,7 +8838,7 @@
       <w:rPr/>
     </w:lvl>
   </w:abstractNum>
-  <w:abstractNum w:abstractNumId="7">
+  <w:abstractNum w:abstractNumId="6">
     <w:lvl w:ilvl="0">
       <w:start w:val="2"/>
       <w:numFmt w:val="decimal"/>
@@ -8496,14 +8851,14 @@
         <w:ind w:left="283" w:hanging="283"/>
       </w:pPr>
       <w:rPr>
+        <w:dstrike w:val="false"/>
+        <w:strike w:val="false"/>
+        <w:sz w:val="28"/>
+        <w:i w:val="false"/>
+        <w:u w:val="none"/>
+        <w:b w:val="false"/>
+        <w:effect w:val="none"/>
         <w:rFonts w:ascii="Arial" w:hAnsi="Arial" w:cs="Times New Roman"/>
-        <w:b w:val="false"/>
-        <w:i w:val="false"/>
-        <w:strike w:val="false"/>
-        <w:dstrike w:val="false"/>
-        <w:sz w:val="28"/>
-        <w:u w:val="none"/>
-        <w:effect w:val="none"/>
       </w:rPr>
     </w:lvl>
     <w:lvl w:ilvl="1">
@@ -8611,7 +8966,7 @@
       <w:rPr/>
     </w:lvl>
   </w:abstractNum>
-  <w:abstractNum w:abstractNumId="8">
+  <w:abstractNum w:abstractNumId="7">
     <w:lvl w:ilvl="0">
       <w:start w:val="3"/>
       <w:numFmt w:val="decimal"/>
@@ -8624,14 +8979,14 @@
         <w:ind w:left="283" w:hanging="283"/>
       </w:pPr>
       <w:rPr>
+        <w:dstrike w:val="false"/>
+        <w:strike w:val="false"/>
+        <w:sz w:val="28"/>
+        <w:i w:val="false"/>
+        <w:u w:val="none"/>
+        <w:b w:val="false"/>
+        <w:effect w:val="none"/>
         <w:rFonts w:ascii="Arial" w:hAnsi="Arial" w:cs="Times New Roman"/>
-        <w:b w:val="false"/>
-        <w:i w:val="false"/>
-        <w:strike w:val="false"/>
-        <w:dstrike w:val="false"/>
-        <w:sz w:val="28"/>
-        <w:u w:val="none"/>
-        <w:effect w:val="none"/>
       </w:rPr>
     </w:lvl>
     <w:lvl w:ilvl="1">
@@ -8737,6 +9092,262 @@
         <w:ind w:left="3600" w:hanging="360"/>
       </w:pPr>
       <w:rPr/>
+    </w:lvl>
+  </w:abstractNum>
+  <w:abstractNum w:abstractNumId="8">
+    <w:lvl w:ilvl="0">
+      <w:start w:val="1"/>
+      <w:numFmt w:val="bullet"/>
+      <w:lvlText w:val=""/>
+      <w:lvlJc w:val="left"/>
+      <w:pPr>
+        <w:tabs>
+          <w:tab w:val="num" w:pos="720"/>
+        </w:tabs>
+        <w:ind w:left="720" w:hanging="360"/>
+      </w:pPr>
+      <w:rPr>
+        <w:rFonts w:ascii="Symbol" w:hAnsi="Symbol" w:cs="Symbol" w:hint="default"/>
+      </w:rPr>
+    </w:lvl>
+    <w:lvl w:ilvl="1">
+      <w:start w:val="1"/>
+      <w:numFmt w:val="bullet"/>
+      <w:lvlText w:val=""/>
+      <w:lvlJc w:val="left"/>
+      <w:pPr>
+        <w:tabs>
+          <w:tab w:val="num" w:pos="1080"/>
+        </w:tabs>
+        <w:ind w:left="1080" w:hanging="360"/>
+      </w:pPr>
+      <w:rPr>
+        <w:rFonts w:ascii="Symbol" w:hAnsi="Symbol" w:cs="Symbol" w:hint="default"/>
+      </w:rPr>
+    </w:lvl>
+    <w:lvl w:ilvl="2">
+      <w:start w:val="1"/>
+      <w:numFmt w:val="bullet"/>
+      <w:lvlText w:val=""/>
+      <w:lvlJc w:val="left"/>
+      <w:pPr>
+        <w:tabs>
+          <w:tab w:val="num" w:pos="1440"/>
+        </w:tabs>
+        <w:ind w:left="1440" w:hanging="360"/>
+      </w:pPr>
+      <w:rPr>
+        <w:rFonts w:ascii="Symbol" w:hAnsi="Symbol" w:cs="Symbol" w:hint="default"/>
+      </w:rPr>
+    </w:lvl>
+    <w:lvl w:ilvl="3">
+      <w:start w:val="1"/>
+      <w:numFmt w:val="bullet"/>
+      <w:lvlText w:val=""/>
+      <w:lvlJc w:val="left"/>
+      <w:pPr>
+        <w:tabs>
+          <w:tab w:val="num" w:pos="1800"/>
+        </w:tabs>
+        <w:ind w:left="1800" w:hanging="360"/>
+      </w:pPr>
+      <w:rPr>
+        <w:rFonts w:ascii="Symbol" w:hAnsi="Symbol" w:cs="Symbol" w:hint="default"/>
+      </w:rPr>
+    </w:lvl>
+    <w:lvl w:ilvl="4">
+      <w:start w:val="1"/>
+      <w:numFmt w:val="bullet"/>
+      <w:lvlText w:val=""/>
+      <w:lvlJc w:val="left"/>
+      <w:pPr>
+        <w:tabs>
+          <w:tab w:val="num" w:pos="2160"/>
+        </w:tabs>
+        <w:ind w:left="2160" w:hanging="360"/>
+      </w:pPr>
+      <w:rPr>
+        <w:rFonts w:ascii="Symbol" w:hAnsi="Symbol" w:cs="Symbol" w:hint="default"/>
+      </w:rPr>
+    </w:lvl>
+    <w:lvl w:ilvl="5">
+      <w:start w:val="1"/>
+      <w:numFmt w:val="bullet"/>
+      <w:lvlText w:val=""/>
+      <w:lvlJc w:val="left"/>
+      <w:pPr>
+        <w:tabs>
+          <w:tab w:val="num" w:pos="2520"/>
+        </w:tabs>
+        <w:ind w:left="2520" w:hanging="360"/>
+      </w:pPr>
+      <w:rPr>
+        <w:rFonts w:ascii="Symbol" w:hAnsi="Symbol" w:cs="Symbol" w:hint="default"/>
+      </w:rPr>
+    </w:lvl>
+    <w:lvl w:ilvl="6">
+      <w:start w:val="1"/>
+      <w:numFmt w:val="bullet"/>
+      <w:lvlText w:val=""/>
+      <w:lvlJc w:val="left"/>
+      <w:pPr>
+        <w:tabs>
+          <w:tab w:val="num" w:pos="2880"/>
+        </w:tabs>
+        <w:ind w:left="2880" w:hanging="360"/>
+      </w:pPr>
+      <w:rPr>
+        <w:rFonts w:ascii="Symbol" w:hAnsi="Symbol" w:cs="Symbol" w:hint="default"/>
+      </w:rPr>
+    </w:lvl>
+    <w:lvl w:ilvl="7">
+      <w:start w:val="1"/>
+      <w:numFmt w:val="bullet"/>
+      <w:lvlText w:val=""/>
+      <w:lvlJc w:val="left"/>
+      <w:pPr>
+        <w:tabs>
+          <w:tab w:val="num" w:pos="3240"/>
+        </w:tabs>
+        <w:ind w:left="3240" w:hanging="360"/>
+      </w:pPr>
+      <w:rPr>
+        <w:rFonts w:ascii="Symbol" w:hAnsi="Symbol" w:cs="Symbol" w:hint="default"/>
+      </w:rPr>
+    </w:lvl>
+    <w:lvl w:ilvl="8">
+      <w:start w:val="1"/>
+      <w:numFmt w:val="bullet"/>
+      <w:lvlText w:val=""/>
+      <w:lvlJc w:val="left"/>
+      <w:pPr>
+        <w:tabs>
+          <w:tab w:val="num" w:pos="3600"/>
+        </w:tabs>
+        <w:ind w:left="3600" w:hanging="360"/>
+      </w:pPr>
+      <w:rPr>
+        <w:rFonts w:ascii="Symbol" w:hAnsi="Symbol" w:cs="Symbol" w:hint="default"/>
+      </w:rPr>
+    </w:lvl>
+  </w:abstractNum>
+  <w:abstractNum w:abstractNumId="9">
+    <w:lvl w:ilvl="0">
+      <w:start w:val="1"/>
+      <w:numFmt w:val="none"/>
+      <w:suff w:val="nothing"/>
+      <w:lvlText w:val=""/>
+      <w:lvlJc w:val="left"/>
+      <w:pPr>
+        <w:tabs>
+          <w:tab w:val="num" w:pos="0"/>
+        </w:tabs>
+        <w:ind w:left="0" w:hanging="0"/>
+      </w:pPr>
+    </w:lvl>
+    <w:lvl w:ilvl="1">
+      <w:start w:val="1"/>
+      <w:numFmt w:val="none"/>
+      <w:suff w:val="nothing"/>
+      <w:lvlText w:val=""/>
+      <w:lvlJc w:val="left"/>
+      <w:pPr>
+        <w:tabs>
+          <w:tab w:val="num" w:pos="0"/>
+        </w:tabs>
+        <w:ind w:left="0" w:hanging="0"/>
+      </w:pPr>
+    </w:lvl>
+    <w:lvl w:ilvl="2">
+      <w:start w:val="1"/>
+      <w:numFmt w:val="none"/>
+      <w:suff w:val="nothing"/>
+      <w:lvlText w:val=""/>
+      <w:lvlJc w:val="left"/>
+      <w:pPr>
+        <w:tabs>
+          <w:tab w:val="num" w:pos="0"/>
+        </w:tabs>
+        <w:ind w:left="0" w:hanging="0"/>
+      </w:pPr>
+    </w:lvl>
+    <w:lvl w:ilvl="3">
+      <w:start w:val="1"/>
+      <w:numFmt w:val="none"/>
+      <w:suff w:val="nothing"/>
+      <w:lvlText w:val=""/>
+      <w:lvlJc w:val="left"/>
+      <w:pPr>
+        <w:tabs>
+          <w:tab w:val="num" w:pos="0"/>
+        </w:tabs>
+        <w:ind w:left="0" w:hanging="0"/>
+      </w:pPr>
+    </w:lvl>
+    <w:lvl w:ilvl="4">
+      <w:start w:val="1"/>
+      <w:numFmt w:val="none"/>
+      <w:suff w:val="nothing"/>
+      <w:lvlText w:val=""/>
+      <w:lvlJc w:val="left"/>
+      <w:pPr>
+        <w:tabs>
+          <w:tab w:val="num" w:pos="0"/>
+        </w:tabs>
+        <w:ind w:left="0" w:hanging="0"/>
+      </w:pPr>
+    </w:lvl>
+    <w:lvl w:ilvl="5">
+      <w:start w:val="1"/>
+      <w:numFmt w:val="none"/>
+      <w:suff w:val="nothing"/>
+      <w:lvlText w:val=""/>
+      <w:lvlJc w:val="left"/>
+      <w:pPr>
+        <w:tabs>
+          <w:tab w:val="num" w:pos="0"/>
+        </w:tabs>
+        <w:ind w:left="0" w:hanging="0"/>
+      </w:pPr>
+    </w:lvl>
+    <w:lvl w:ilvl="6">
+      <w:start w:val="1"/>
+      <w:numFmt w:val="none"/>
+      <w:suff w:val="nothing"/>
+      <w:lvlText w:val=""/>
+      <w:lvlJc w:val="left"/>
+      <w:pPr>
+        <w:tabs>
+          <w:tab w:val="num" w:pos="0"/>
+        </w:tabs>
+        <w:ind w:left="0" w:hanging="0"/>
+      </w:pPr>
+    </w:lvl>
+    <w:lvl w:ilvl="7">
+      <w:start w:val="1"/>
+      <w:numFmt w:val="none"/>
+      <w:suff w:val="nothing"/>
+      <w:lvlText w:val=""/>
+      <w:lvlJc w:val="left"/>
+      <w:pPr>
+        <w:tabs>
+          <w:tab w:val="num" w:pos="0"/>
+        </w:tabs>
+        <w:ind w:left="0" w:hanging="0"/>
+      </w:pPr>
+    </w:lvl>
+    <w:lvl w:ilvl="8">
+      <w:start w:val="1"/>
+      <w:numFmt w:val="none"/>
+      <w:suff w:val="nothing"/>
+      <w:lvlText w:val=""/>
+      <w:lvlJc w:val="left"/>
+      <w:pPr>
+        <w:tabs>
+          <w:tab w:val="num" w:pos="0"/>
+        </w:tabs>
+        <w:ind w:left="0" w:hanging="0"/>
+      </w:pPr>
     </w:lvl>
   </w:abstractNum>
   <w:num w:numId="1">
@@ -8764,22 +9375,28 @@
     <w:abstractNumId w:val="8"/>
   </w:num>
   <w:num w:numId="9">
-    <w:abstractNumId w:val="6"/>
+    <w:abstractNumId w:val="9"/>
+  </w:num>
+  <w:num w:numId="10">
+    <w:abstractNumId w:val="5"/>
     <w:lvlOverride w:ilvl="0">
       <w:startOverride w:val="1"/>
     </w:lvlOverride>
   </w:num>
-  <w:num w:numId="10">
-    <w:abstractNumId w:val="7"/>
+  <w:num w:numId="11">
+    <w:abstractNumId w:val="6"/>
     <w:lvlOverride w:ilvl="0">
       <w:startOverride w:val="2"/>
     </w:lvlOverride>
   </w:num>
-  <w:num w:numId="11">
-    <w:abstractNumId w:val="8"/>
+  <w:num w:numId="12">
+    <w:abstractNumId w:val="7"/>
     <w:lvlOverride w:ilvl="0">
       <w:startOverride w:val="3"/>
     </w:lvlOverride>
+  </w:num>
+  <w:num w:numId="13">
+    <w:abstractNumId w:val="7"/>
   </w:num>
 </w:numbering>
 </file>
@@ -8808,9 +9425,7 @@
     <w:pPr>
       <w:widowControl/>
       <w:suppressAutoHyphens w:val="true"/>
-      <w:kinsoku w:val="true"/>
-      <w:overflowPunct w:val="false"/>
-      <w:autoSpaceDE w:val="true"/>
+      <w:overflowPunct w:val="true"/>
       <w:bidi w:val="0"/>
       <w:spacing w:lineRule="auto" w:line="240" w:before="0" w:after="120"/>
       <w:ind w:firstLine="567"/>
@@ -9251,6 +9866,13 @@
       <w:bCs/>
     </w:rPr>
   </w:style>
+  <w:style w:type="character" w:styleId="Bullets">
+    <w:name w:val="Bullets"/>
+    <w:qFormat/>
+    <w:rPr>
+      <w:rFonts w:ascii="OpenSymbol" w:hAnsi="OpenSymbol" w:eastAsia="OpenSymbol" w:cs="OpenSymbol"/>
+    </w:rPr>
+  </w:style>
   <w:style w:type="paragraph" w:styleId="Heading">
     <w:name w:val="Heading"/>
     <w:basedOn w:val="Normal"/>
@@ -9463,6 +10085,28 @@
     <w:pPr/>
     <w:rPr/>
   </w:style>
+  <w:style w:type="paragraph" w:styleId="HeaderandFooter">
+    <w:name w:val="Header and Footer"/>
+    <w:basedOn w:val="Normal"/>
+    <w:qFormat/>
+    <w:pPr>
+      <w:suppressLineNumbers/>
+      <w:tabs>
+        <w:tab w:val="clear" w:pos="720"/>
+        <w:tab w:val="center" w:pos="4677" w:leader="none"/>
+        <w:tab w:val="right" w:pos="9354" w:leader="none"/>
+      </w:tabs>
+    </w:pPr>
+    <w:rPr/>
+  </w:style>
+  <w:style w:type="paragraph" w:styleId="Footer">
+    <w:name w:val="footer"/>
+    <w:basedOn w:val="HeaderandFooter"/>
+    <w:pPr>
+      <w:suppressLineNumbers/>
+    </w:pPr>
+    <w:rPr/>
+  </w:style>
   <w:style w:type="numbering" w:styleId="NoList">
     <w:name w:val="No List"/>
     <w:qFormat/>
@@ -9478,37 +10122,37 @@
         <a:srgbClr val="000000"/>
       </a:dk1>
       <a:lt1>
-        <a:srgbClr val="FFFFFF"/>
+        <a:srgbClr val="ffffff"/>
       </a:lt1>
       <a:dk2>
-        <a:srgbClr val="0E2841"/>
+        <a:srgbClr val="0e2841"/>
       </a:dk2>
       <a:lt2>
-        <a:srgbClr val="E8E8E8"/>
+        <a:srgbClr val="e8e8e8"/>
       </a:lt2>
       <a:accent1>
         <a:srgbClr val="156082"/>
       </a:accent1>
       <a:accent2>
-        <a:srgbClr val="E97132"/>
+        <a:srgbClr val="e97132"/>
       </a:accent2>
       <a:accent3>
-        <a:srgbClr val="196B24"/>
+        <a:srgbClr val="196b24"/>
       </a:accent3>
       <a:accent4>
-        <a:srgbClr val="0F9ED5"/>
+        <a:srgbClr val="0f9ed5"/>
       </a:accent4>
       <a:accent5>
-        <a:srgbClr val="A02B93"/>
+        <a:srgbClr val="a02b93"/>
       </a:accent5>
       <a:accent6>
-        <a:srgbClr val="4EA72E"/>
+        <a:srgbClr val="4ea72e"/>
       </a:accent6>
       <a:hlink>
         <a:srgbClr val="467886"/>
       </a:hlink>
       <a:folHlink>
-        <a:srgbClr val="96607D"/>
+        <a:srgbClr val="96607d"/>
       </a:folHlink>
     </a:clrScheme>
     <a:fontScheme name="Office">

</xml_diff>